<commit_message>
Sửa lại sơ đồ UC và liệt kê lại bảng UC
</commit_message>
<xml_diff>
--- a/DOC/N15_3_ApplicationDevelopment_SRS.docx
+++ b/DOC/N15_3_ApplicationDevelopment_SRS.docx
@@ -268,7 +268,7 @@
                   <w:sz w:val="72"/>
                   <w:szCs w:val="72"/>
                 </w:rPr>
-                <w:t>Tên đồ án</w:t>
+                <w:t>Hệ thống quản lý của hàng thú cưng</w:t>
               </w:r>
               <w:r>
                 <w:rPr>
@@ -279,7 +279,40 @@
                   <w:sz w:val="72"/>
                   <w:szCs w:val="72"/>
                 </w:rPr>
-                <w:t xml:space="preserve"> - nhómXX</w:t>
+                <w:t xml:space="preserve"> </w:t>
+              </w:r>
+              <w:r>
+                <w:rPr>
+                  <w:rFonts w:ascii="Times New Roman" w:eastAsiaTheme="majorEastAsia" w:hAnsi="Times New Roman" w:cs="Times New Roman"/>
+                  <w:b/>
+                  <w:caps/>
+                  <w:color w:val="000000" w:themeColor="text1"/>
+                  <w:sz w:val="72"/>
+                  <w:szCs w:val="72"/>
+                </w:rPr>
+                <w:t>–</w:t>
+              </w:r>
+              <w:r>
+                <w:rPr>
+                  <w:rFonts w:ascii="Times New Roman" w:eastAsiaTheme="majorEastAsia" w:hAnsi="Times New Roman" w:cs="Times New Roman"/>
+                  <w:b/>
+                  <w:caps/>
+                  <w:color w:val="000000" w:themeColor="text1"/>
+                  <w:sz w:val="72"/>
+                  <w:szCs w:val="72"/>
+                </w:rPr>
+                <w:t xml:space="preserve"> nhóm</w:t>
+              </w:r>
+              <w:r>
+                <w:rPr>
+                  <w:rFonts w:ascii="Times New Roman" w:eastAsiaTheme="majorEastAsia" w:hAnsi="Times New Roman" w:cs="Times New Roman"/>
+                  <w:b/>
+                  <w:caps/>
+                  <w:color w:val="000000" w:themeColor="text1"/>
+                  <w:sz w:val="72"/>
+                  <w:szCs w:val="72"/>
+                </w:rPr>
+                <w:t>15</w:t>
               </w:r>
             </w:p>
           </w:sdtContent>
@@ -578,7 +611,7 @@
                           <w:sdtContent>
                             <w:p>
                               <w:pPr>
-                                <w:pStyle w:val="KhngDncch"/>
+                                <w:pStyle w:val="NoSpacing"/>
                                 <w:spacing w:after="40"/>
                                 <w:jc w:val="center"/>
                                 <w:rPr>
@@ -614,7 +647,7 @@
                         </w:sdt>
                         <w:p>
                           <w:pPr>
-                            <w:pStyle w:val="KhngDncch"/>
+                            <w:pStyle w:val="NoSpacing"/>
                             <w:jc w:val="center"/>
                             <w:rPr>
                               <w:rFonts w:ascii="Times New Roman" w:hAnsi="Times New Roman" w:cs="Times New Roman"/>
@@ -651,7 +684,7 @@
                         </w:p>
                         <w:p>
                           <w:pPr>
-                            <w:pStyle w:val="KhngDncch"/>
+                            <w:pStyle w:val="NoSpacing"/>
                             <w:jc w:val="center"/>
                             <w:rPr>
                               <w:rFonts w:ascii="Times New Roman" w:hAnsi="Times New Roman" w:cs="Times New Roman"/>
@@ -4489,27 +4522,57 @@
       </w:pPr>
       <w:r>
         <w:rPr>
-          <w:rFonts w:ascii="Times New Roman" w:hAnsi="Times New Roman" w:cs="Times New Roman"/>
-          <w:i/>
-          <w:color w:val="0000FF"/>
-          <w:sz w:val="26"/>
-          <w:szCs w:val="26"/>
-        </w:rPr>
-        <w:t>&lt;Mô hình Use case ở mức tổng quát&gt;.</w:t>
+          <w:noProof/>
+        </w:rPr>
+        <w:drawing>
+          <wp:inline distT="0" distB="0" distL="0" distR="0" wp14:anchorId="2983A1B9" wp14:editId="4D3354D1">
+            <wp:extent cx="6511925" cy="4776470"/>
+            <wp:effectExtent l="0" t="0" r="3175" b="5080"/>
+            <wp:docPr id="1507883606" name="Picture 7"/>
+            <wp:cNvGraphicFramePr>
+              <a:graphicFrameLocks xmlns:a="http://schemas.openxmlformats.org/drawingml/2006/main" noChangeAspect="1"/>
+            </wp:cNvGraphicFramePr>
+            <a:graphic xmlns:a="http://schemas.openxmlformats.org/drawingml/2006/main">
+              <a:graphicData uri="http://schemas.openxmlformats.org/drawingml/2006/picture">
+                <pic:pic xmlns:pic="http://schemas.openxmlformats.org/drawingml/2006/picture">
+                  <pic:nvPicPr>
+                    <pic:cNvPr id="0" name="Picture 1"/>
+                    <pic:cNvPicPr>
+                      <a:picLocks noChangeAspect="1" noChangeArrowheads="1"/>
+                    </pic:cNvPicPr>
+                  </pic:nvPicPr>
+                  <pic:blipFill>
+                    <a:blip r:embed="rId10">
+                      <a:extLst>
+                        <a:ext uri="{28A0092B-C50C-407E-A947-70E740481C1C}">
+                          <a14:useLocalDpi xmlns:a14="http://schemas.microsoft.com/office/drawing/2010/main" val="0"/>
+                        </a:ext>
+                      </a:extLst>
+                    </a:blip>
+                    <a:srcRect/>
+                    <a:stretch>
+                      <a:fillRect/>
+                    </a:stretch>
+                  </pic:blipFill>
+                  <pic:spPr bwMode="auto">
+                    <a:xfrm>
+                      <a:off x="0" y="0"/>
+                      <a:ext cx="6511925" cy="4776470"/>
+                    </a:xfrm>
+                    <a:prstGeom prst="rect">
+                      <a:avLst/>
+                    </a:prstGeom>
+                    <a:noFill/>
+                    <a:ln>
+                      <a:noFill/>
+                    </a:ln>
+                  </pic:spPr>
+                </pic:pic>
+              </a:graphicData>
+            </a:graphic>
+          </wp:inline>
+        </w:drawing>
       </w:r>
-    </w:p>
-    <w:p>
-      <w:pPr>
-        <w:spacing w:after="120" w:line="240" w:lineRule="auto"/>
-        <w:ind w:left="600"/>
-        <w:rPr>
-          <w:rFonts w:ascii="Times New Roman" w:hAnsi="Times New Roman" w:cs="Times New Roman"/>
-          <w:i/>
-          <w:color w:val="0000FF"/>
-          <w:sz w:val="26"/>
-          <w:szCs w:val="26"/>
-        </w:rPr>
-      </w:pPr>
     </w:p>
     <w:p>
       <w:pPr>
@@ -4664,6 +4727,14 @@
                 <w:szCs w:val="26"/>
               </w:rPr>
             </w:pPr>
+            <w:r>
+              <w:rPr>
+                <w:rFonts w:ascii="Times New Roman" w:hAnsi="Times New Roman" w:cs="Times New Roman"/>
+                <w:sz w:val="26"/>
+                <w:szCs w:val="26"/>
+              </w:rPr>
+              <w:t>Nhân viên quản lý</w:t>
+            </w:r>
           </w:p>
         </w:tc>
         <w:tc>
@@ -4679,6 +4750,14 @@
                 <w:szCs w:val="26"/>
               </w:rPr>
             </w:pPr>
+            <w:r>
+              <w:rPr>
+                <w:rFonts w:ascii="Times New Roman" w:hAnsi="Times New Roman" w:cs="Times New Roman"/>
+                <w:sz w:val="26"/>
+                <w:szCs w:val="26"/>
+              </w:rPr>
+              <w:t>Là bộ phận có chức vụ cao nhất, chịu trách nhiệm quản lý tổng thể cửa hàng, quản lý nhân viên, phân ca, phân quyền và theo dõi các báo cáo thống kê doanh thu, hiệu suất.</w:t>
+            </w:r>
           </w:p>
         </w:tc>
         <w:tc>
@@ -4694,6 +4773,14 @@
                 <w:szCs w:val="26"/>
               </w:rPr>
             </w:pPr>
+            <w:r>
+              <w:rPr>
+                <w:rFonts w:ascii="Times New Roman" w:hAnsi="Times New Roman" w:cs="Times New Roman"/>
+                <w:sz w:val="26"/>
+                <w:szCs w:val="26"/>
+              </w:rPr>
+              <w:t>Có quyền hạn cao nhất trong hệ thống và được kế thừa toàn bộ quyền hạn của Thu ngân, Thợ Spa và Nhân viên kho.</w:t>
+            </w:r>
           </w:p>
         </w:tc>
       </w:tr>
@@ -4714,6 +4801,14 @@
                 <w:szCs w:val="26"/>
               </w:rPr>
             </w:pPr>
+            <w:r>
+              <w:rPr>
+                <w:rFonts w:ascii="Times New Roman" w:hAnsi="Times New Roman" w:cs="Times New Roman"/>
+                <w:sz w:val="26"/>
+                <w:szCs w:val="26"/>
+              </w:rPr>
+              <w:t>Nhân viên thu ngân</w:t>
+            </w:r>
           </w:p>
         </w:tc>
         <w:tc>
@@ -4729,6 +4824,22 @@
                 <w:szCs w:val="26"/>
               </w:rPr>
             </w:pPr>
+            <w:r>
+              <w:rPr>
+                <w:rFonts w:ascii="Times New Roman" w:hAnsi="Times New Roman" w:cs="Times New Roman"/>
+                <w:sz w:val="26"/>
+                <w:szCs w:val="26"/>
+              </w:rPr>
+              <w:t>Phụ trách tiếp đón khách hàng, tư vấn dịch vụ, tạo lịch hẹn Spa, lập hóa đơn</w:t>
+            </w:r>
+            <w:r>
+              <w:rPr>
+                <w:rFonts w:ascii="Times New Roman" w:hAnsi="Times New Roman" w:cs="Times New Roman"/>
+                <w:sz w:val="26"/>
+                <w:szCs w:val="26"/>
+              </w:rPr>
+              <w:t>.</w:t>
+            </w:r>
           </w:p>
         </w:tc>
         <w:tc>
@@ -4744,6 +4855,22 @@
                 <w:szCs w:val="26"/>
               </w:rPr>
             </w:pPr>
+            <w:r>
+              <w:rPr>
+                <w:rFonts w:ascii="Times New Roman" w:hAnsi="Times New Roman" w:cs="Times New Roman"/>
+                <w:sz w:val="26"/>
+                <w:szCs w:val="26"/>
+              </w:rPr>
+              <w:t>Tương tác trực tiếp với khách hàng, quản lý phát hành thẻ VIP và tích điểm CRM</w:t>
+            </w:r>
+            <w:r>
+              <w:rPr>
+                <w:rFonts w:ascii="Times New Roman" w:hAnsi="Times New Roman" w:cs="Times New Roman"/>
+                <w:sz w:val="26"/>
+                <w:szCs w:val="26"/>
+              </w:rPr>
+              <w:t>.</w:t>
+            </w:r>
           </w:p>
         </w:tc>
       </w:tr>
@@ -4764,6 +4891,14 @@
                 <w:szCs w:val="26"/>
               </w:rPr>
             </w:pPr>
+            <w:r>
+              <w:rPr>
+                <w:rFonts w:ascii="Times New Roman" w:hAnsi="Times New Roman" w:cs="Times New Roman"/>
+                <w:sz w:val="26"/>
+                <w:szCs w:val="26"/>
+              </w:rPr>
+              <w:t>Thợ Spa</w:t>
+            </w:r>
           </w:p>
         </w:tc>
         <w:tc>
@@ -4779,6 +4914,23 @@
                 <w:szCs w:val="26"/>
               </w:rPr>
             </w:pPr>
+            <w:r>
+              <w:rPr>
+                <w:rFonts w:ascii="Times New Roman" w:hAnsi="Times New Roman" w:cs="Times New Roman"/>
+                <w:sz w:val="26"/>
+                <w:szCs w:val="26"/>
+              </w:rPr>
+              <w:t xml:space="preserve">Người trực tiếp thực hiện các dịch vụ chăm sóc thú cưng (tắm, sấy, cắt tỉa, vệ sinh). Có trách </w:t>
+            </w:r>
+            <w:r>
+              <w:rPr>
+                <w:rFonts w:ascii="Times New Roman" w:hAnsi="Times New Roman" w:cs="Times New Roman"/>
+                <w:sz w:val="26"/>
+                <w:szCs w:val="26"/>
+              </w:rPr>
+              <w:lastRenderedPageBreak/>
+              <w:t>nhiệm xem hồ sơ thú cưng trước khi làm dịch vụ và cập nhật trạng thái các phiếu dịch vụ.</w:t>
+            </w:r>
           </w:p>
         </w:tc>
         <w:tc>
@@ -4794,6 +4946,114 @@
                 <w:szCs w:val="26"/>
               </w:rPr>
             </w:pPr>
+            <w:r>
+              <w:rPr>
+                <w:rFonts w:ascii="Times New Roman" w:hAnsi="Times New Roman" w:cs="Times New Roman"/>
+                <w:sz w:val="26"/>
+                <w:szCs w:val="26"/>
+              </w:rPr>
+              <w:lastRenderedPageBreak/>
+              <w:t xml:space="preserve">Cần đặc biệt chú ý đến phần ghi chú cảnh báo an toàn (tính dữ/hiền, </w:t>
+            </w:r>
+            <w:r>
+              <w:rPr>
+                <w:rFonts w:ascii="Times New Roman" w:hAnsi="Times New Roman" w:cs="Times New Roman"/>
+                <w:sz w:val="26"/>
+                <w:szCs w:val="26"/>
+              </w:rPr>
+              <w:lastRenderedPageBreak/>
+              <w:t>tiền sử dị ứng) của thú cưng.</w:t>
+            </w:r>
+          </w:p>
+        </w:tc>
+      </w:tr>
+      <w:tr>
+        <w:trPr>
+          <w:jc w:val="center"/>
+        </w:trPr>
+        <w:tc>
+          <w:tcPr>
+            <w:tcW w:w="1050" w:type="pct"/>
+          </w:tcPr>
+          <w:p>
+            <w:pPr>
+              <w:spacing w:after="120"/>
+              <w:rPr>
+                <w:rFonts w:ascii="Times New Roman" w:hAnsi="Times New Roman" w:cs="Times New Roman"/>
+                <w:sz w:val="26"/>
+                <w:szCs w:val="26"/>
+              </w:rPr>
+            </w:pPr>
+            <w:r>
+              <w:rPr>
+                <w:rFonts w:ascii="Times New Roman" w:hAnsi="Times New Roman" w:cs="Times New Roman"/>
+                <w:sz w:val="26"/>
+                <w:szCs w:val="26"/>
+              </w:rPr>
+              <w:t>Nhân viên kho</w:t>
+            </w:r>
+          </w:p>
+        </w:tc>
+        <w:tc>
+          <w:tcPr>
+            <w:tcW w:w="2554" w:type="pct"/>
+          </w:tcPr>
+          <w:p>
+            <w:pPr>
+              <w:spacing w:after="120"/>
+              <w:rPr>
+                <w:rFonts w:ascii="Times New Roman" w:hAnsi="Times New Roman" w:cs="Times New Roman"/>
+                <w:sz w:val="26"/>
+                <w:szCs w:val="26"/>
+              </w:rPr>
+            </w:pPr>
+            <w:r>
+              <w:rPr>
+                <w:rFonts w:ascii="Times New Roman" w:hAnsi="Times New Roman" w:cs="Times New Roman"/>
+                <w:sz w:val="26"/>
+                <w:szCs w:val="26"/>
+              </w:rPr>
+              <w:t>Chịu trách nhiệm quản lý hàng hóa, lập phiếu nhập kho, kiểm kê định kỳ và theo dõi hạn sử dụng của</w:t>
+            </w:r>
+            <w:r>
+              <w:rPr>
+                <w:rFonts w:ascii="Times New Roman" w:hAnsi="Times New Roman" w:cs="Times New Roman"/>
+                <w:sz w:val="26"/>
+                <w:szCs w:val="26"/>
+              </w:rPr>
+              <w:t xml:space="preserve"> các</w:t>
+            </w:r>
+            <w:r>
+              <w:rPr>
+                <w:rFonts w:ascii="Times New Roman" w:hAnsi="Times New Roman" w:cs="Times New Roman"/>
+                <w:sz w:val="26"/>
+                <w:szCs w:val="26"/>
+              </w:rPr>
+              <w:t xml:space="preserve"> nhóm danh mục sản phẩm.</w:t>
+            </w:r>
+          </w:p>
+        </w:tc>
+        <w:tc>
+          <w:tcPr>
+            <w:tcW w:w="1396" w:type="pct"/>
+          </w:tcPr>
+          <w:p>
+            <w:pPr>
+              <w:spacing w:after="120"/>
+              <w:rPr>
+                <w:rFonts w:ascii="Times New Roman" w:hAnsi="Times New Roman" w:cs="Times New Roman"/>
+                <w:sz w:val="26"/>
+                <w:szCs w:val="26"/>
+              </w:rPr>
+            </w:pPr>
+            <w:r>
+              <w:rPr>
+                <w:rFonts w:ascii="Times New Roman" w:hAnsi="Times New Roman" w:cs="Times New Roman"/>
+                <w:sz w:val="26"/>
+                <w:szCs w:val="26"/>
+              </w:rPr>
+              <w:t>Phải xử lý kịp thời các cảnh báo tồn kho dưới mức tối thiểu hoặc sản phẩm cận hạn/hết hạn sử dụng</w:t>
+            </w:r>
           </w:p>
         </w:tc>
       </w:tr>
@@ -5091,7 +5351,7 @@
                 <w:sz w:val="26"/>
                 <w:szCs w:val="26"/>
               </w:rPr>
-              <w:t>Người dùng (nhân viên/quản lý) sử dụng tài khoản nội bộ và mật khẩu để truy cập vào hệ thống.</w:t>
+              <w:t>Người dùng đăng nhập bằng tài khoản nội bộ được cấp để vào hệ thống</w:t>
             </w:r>
           </w:p>
         </w:tc>
@@ -5118,7 +5378,7 @@
                 <w:sz w:val="26"/>
                 <w:szCs w:val="26"/>
               </w:rPr>
-              <w:t>1.0 Quản lý Hệ thống &amp; Phân quyền</w:t>
+              <w:t>1.1 Đăng nhập hệ thống</w:t>
             </w:r>
           </w:p>
         </w:tc>
@@ -5165,7 +5425,17 @@
                 <w:sz w:val="26"/>
                 <w:szCs w:val="26"/>
               </w:rPr>
-              <w:t>UC002</w:t>
+              <w:t>UC00</w:t>
+            </w:r>
+            <w:r>
+              <w:rPr>
+                <w:rFonts w:ascii="Times New Roman" w:hAnsi="Times New Roman" w:cs="Times New Roman"/>
+                <w:i/>
+                <w:color w:val="0000FF"/>
+                <w:sz w:val="26"/>
+                <w:szCs w:val="26"/>
+              </w:rPr>
+              <w:t>2</w:t>
             </w:r>
           </w:p>
         </w:tc>
@@ -5224,7 +5494,7 @@
                 <w:sz w:val="26"/>
                 <w:szCs w:val="26"/>
               </w:rPr>
-              <w:t>Quản lý (Chủ cửa hàng) thực hiện thêm mới, cập nhật thông tin, khóa/mở khóa tài khoản nhân viên và phân ca làm việc.</w:t>
+              <w:t>Thêm mới, cập nhật thông tin, khóa hoặc mở khóa tài khoản nhân viên.</w:t>
             </w:r>
           </w:p>
         </w:tc>
@@ -5251,7 +5521,7 @@
                 <w:sz w:val="26"/>
                 <w:szCs w:val="26"/>
               </w:rPr>
-              <w:t>1.0 Quản lý Hệ thống &amp; Phân quyền</w:t>
+              <w:t>1.2 Quản lý tài khoản nội bộ</w:t>
             </w:r>
           </w:p>
         </w:tc>
@@ -5298,7 +5568,17 @@
                 <w:sz w:val="26"/>
                 <w:szCs w:val="26"/>
               </w:rPr>
-              <w:t>UC003</w:t>
+              <w:t>UC00</w:t>
+            </w:r>
+            <w:r>
+              <w:rPr>
+                <w:rFonts w:ascii="Times New Roman" w:hAnsi="Times New Roman" w:cs="Times New Roman"/>
+                <w:i/>
+                <w:color w:val="0000FF"/>
+                <w:sz w:val="26"/>
+                <w:szCs w:val="26"/>
+              </w:rPr>
+              <w:t>3</w:t>
             </w:r>
           </w:p>
         </w:tc>
@@ -5325,7 +5605,17 @@
                 <w:sz w:val="26"/>
                 <w:szCs w:val="26"/>
               </w:rPr>
-              <w:t>Phân quyền hệ thống</w:t>
+              <w:t>Quản lý p</w:t>
+            </w:r>
+            <w:r>
+              <w:rPr>
+                <w:rFonts w:ascii="Times New Roman" w:hAnsi="Times New Roman" w:cs="Times New Roman"/>
+                <w:i/>
+                <w:color w:val="0000FF"/>
+                <w:sz w:val="26"/>
+                <w:szCs w:val="26"/>
+              </w:rPr>
+              <w:t>hân ca</w:t>
             </w:r>
           </w:p>
         </w:tc>
@@ -5357,7 +5647,19 @@
                 <w:sz w:val="26"/>
                 <w:szCs w:val="26"/>
               </w:rPr>
-              <w:t>Cấu hình giới hạn quyền truy cập theo từng nhóm vai trò (Chủ cửa hàng, Quản lý, Thu ngân, Thợ Spa).</w:t>
+              <w:t>Thiết lập ca làm việc</w:t>
+            </w:r>
+            <w:r>
+              <w:rPr>
+                <w:rFonts w:ascii="Times New Roman" w:hAnsi="Times New Roman"/>
+                <w:b w:val="0"/>
+                <w:bCs w:val="0"/>
+                <w:i/>
+                <w:color w:val="0000FF"/>
+                <w:sz w:val="26"/>
+                <w:szCs w:val="26"/>
+              </w:rPr>
+              <w:t>,chỉnh xửa thời gian ca và xoá cả làm việc của nhân viên</w:t>
             </w:r>
           </w:p>
         </w:tc>
@@ -5384,7 +5686,7 @@
                 <w:sz w:val="26"/>
                 <w:szCs w:val="26"/>
               </w:rPr>
-              <w:t>1.0 Quản lý Hệ thống &amp; Phân quyền</w:t>
+              <w:t>1.2.4 Phân ca làm việc và chấm công</w:t>
             </w:r>
           </w:p>
         </w:tc>
@@ -5401,14 +5703,6 @@
                 <w:szCs w:val="26"/>
               </w:rPr>
             </w:pPr>
-            <w:r>
-              <w:rPr>
-                <w:rFonts w:ascii="Times New Roman" w:hAnsi="Times New Roman" w:cs="Times New Roman"/>
-                <w:sz w:val="26"/>
-                <w:szCs w:val="26"/>
-              </w:rPr>
-              <w:t>Nhân viên thường không được xem báo cáo tài chính</w:t>
-            </w:r>
           </w:p>
         </w:tc>
       </w:tr>
@@ -5439,7 +5733,17 @@
                 <w:sz w:val="26"/>
                 <w:szCs w:val="26"/>
               </w:rPr>
-              <w:t>UC004</w:t>
+              <w:t>UC00</w:t>
+            </w:r>
+            <w:r>
+              <w:rPr>
+                <w:rFonts w:ascii="Times New Roman" w:hAnsi="Times New Roman" w:cs="Times New Roman"/>
+                <w:i/>
+                <w:color w:val="0000FF"/>
+                <w:sz w:val="26"/>
+                <w:szCs w:val="26"/>
+              </w:rPr>
+              <w:t>4</w:t>
             </w:r>
           </w:p>
         </w:tc>
@@ -5466,7 +5770,7 @@
                 <w:sz w:val="26"/>
                 <w:szCs w:val="26"/>
               </w:rPr>
-              <w:t>Quản lý danh mục &amp; sản phẩm</w:t>
+              <w:t>Phân quyền hệ thống</w:t>
             </w:r>
           </w:p>
         </w:tc>
@@ -5498,7 +5802,7 @@
                 <w:sz w:val="26"/>
                 <w:szCs w:val="26"/>
               </w:rPr>
-              <w:t>Thêm, sửa, xóa thông tin sản phẩm, phân loại theo 5 nhóm danh mục chuyên biệt và tạo/in mã vạch (Barcode/QR Code).</w:t>
+              <w:t>Cấu hình quyền truy cập theo vai trò (Quản lý, Thu ngân, Thợ Spa, NV Kho).</w:t>
             </w:r>
           </w:p>
         </w:tc>
@@ -5525,7 +5829,7 @@
                 <w:sz w:val="26"/>
                 <w:szCs w:val="26"/>
               </w:rPr>
-              <w:t>2.0 Quản lý Kho &amp; Hàng hóa</w:t>
+              <w:t>1.3 Phân quyền hệ thống</w:t>
             </w:r>
           </w:p>
         </w:tc>
@@ -5572,7 +5876,17 @@
                 <w:sz w:val="26"/>
                 <w:szCs w:val="26"/>
               </w:rPr>
-              <w:t>UC005</w:t>
+              <w:t>UC00</w:t>
+            </w:r>
+            <w:r>
+              <w:rPr>
+                <w:rFonts w:ascii="Times New Roman" w:hAnsi="Times New Roman" w:cs="Times New Roman"/>
+                <w:i/>
+                <w:color w:val="0000FF"/>
+                <w:sz w:val="26"/>
+                <w:szCs w:val="26"/>
+              </w:rPr>
+              <w:t>5</w:t>
             </w:r>
           </w:p>
         </w:tc>
@@ -5599,7 +5913,7 @@
                 <w:sz w:val="26"/>
                 <w:szCs w:val="26"/>
               </w:rPr>
-              <w:t>Quản lý nhập kho &amp; nhà cung cấp</w:t>
+              <w:t>Quản lý danh mục &amp; sản phẩm</w:t>
             </w:r>
           </w:p>
         </w:tc>
@@ -5631,7 +5945,7 @@
                 <w:sz w:val="26"/>
                 <w:szCs w:val="26"/>
               </w:rPr>
-              <w:t>Tạo phiếu nhập kho, ghi nhận số lượng, giá nhập, lưu nhà cung cấp, bắt buộc nhập hạn sử dụng (HSD) và tải lên chứng từ.</w:t>
+              <w:t>Thêm, sửa, xóa thông tin sản phẩm theo 5 nhóm danh mục (Thức ăn, Phụ kiện,...)</w:t>
             </w:r>
           </w:p>
         </w:tc>
@@ -5658,7 +5972,7 @@
                 <w:sz w:val="26"/>
                 <w:szCs w:val="26"/>
               </w:rPr>
-              <w:t>2.0 Quản lý Kho &amp; Hàng hóa</w:t>
+              <w:t>2.1 Quản lý danh mục &amp; Mã hàng hóa</w:t>
             </w:r>
           </w:p>
         </w:tc>
@@ -5705,8 +6019,17 @@
                 <w:sz w:val="26"/>
                 <w:szCs w:val="26"/>
               </w:rPr>
-              <w:lastRenderedPageBreak/>
-              <w:t>UC006</w:t>
+              <w:t>UC00</w:t>
+            </w:r>
+            <w:r>
+              <w:rPr>
+                <w:rFonts w:ascii="Times New Roman" w:hAnsi="Times New Roman" w:cs="Times New Roman"/>
+                <w:i/>
+                <w:color w:val="0000FF"/>
+                <w:sz w:val="26"/>
+                <w:szCs w:val="26"/>
+              </w:rPr>
+              <w:t>6</w:t>
             </w:r>
           </w:p>
         </w:tc>
@@ -5733,7 +6056,7 @@
                 <w:sz w:val="26"/>
                 <w:szCs w:val="26"/>
               </w:rPr>
-              <w:t>Quản lý cảnh báo kho</w:t>
+              <w:t>Lập phiếu nhập kho</w:t>
             </w:r>
           </w:p>
         </w:tc>
@@ -5765,7 +6088,7 @@
                 <w:sz w:val="26"/>
                 <w:szCs w:val="26"/>
               </w:rPr>
-              <w:t>Hệ thống tự động phát cảnh báo khi số lượng hàng hóa tồn kho giảm xuống dưới mức tối thiểu (&lt; 5 sản phẩm) hoặc cận/hết hạn sử dụng.</w:t>
+              <w:t>Ghi nhận số lượng, giá nhập, chứng từ, mã lô và Hạn sử dụng (HSD)</w:t>
             </w:r>
           </w:p>
         </w:tc>
@@ -5792,7 +6115,7 @@
                 <w:sz w:val="26"/>
                 <w:szCs w:val="26"/>
               </w:rPr>
-              <w:t>2.0 Quản lý Kho &amp; Hàng hóa</w:t>
+              <w:t>2.2 Quản lý nhập kho</w:t>
             </w:r>
           </w:p>
         </w:tc>
@@ -5839,7 +6162,17 @@
                 <w:sz w:val="26"/>
                 <w:szCs w:val="26"/>
               </w:rPr>
-              <w:t>UC007</w:t>
+              <w:t>UC00</w:t>
+            </w:r>
+            <w:r>
+              <w:rPr>
+                <w:rFonts w:ascii="Times New Roman" w:hAnsi="Times New Roman" w:cs="Times New Roman"/>
+                <w:i/>
+                <w:color w:val="0000FF"/>
+                <w:sz w:val="26"/>
+                <w:szCs w:val="26"/>
+              </w:rPr>
+              <w:t>7</w:t>
             </w:r>
           </w:p>
         </w:tc>
@@ -5866,7 +6199,7 @@
                 <w:sz w:val="26"/>
                 <w:szCs w:val="26"/>
               </w:rPr>
-              <w:t>Quản lý hồ sơ thú cưng</w:t>
+              <w:t>Kiểm kê tồn kho định kỳ</w:t>
             </w:r>
           </w:p>
         </w:tc>
@@ -5898,7 +6231,7 @@
                 <w:sz w:val="26"/>
                 <w:szCs w:val="26"/>
               </w:rPr>
-              <w:t>Lưu trữ thông tin thú cưng (giống, cân nặng), bắt buộc ghi chú đặc điểm an toàn (dị ứng, tính hiền/dữ) và lưu lịch sử dịch vụ.</w:t>
+              <w:t>Đối soát số lượng thực tế tại cửa hàng với dữ liệu trên phần mềm</w:t>
             </w:r>
           </w:p>
         </w:tc>
@@ -5925,27 +6258,7 @@
                 <w:sz w:val="26"/>
                 <w:szCs w:val="26"/>
               </w:rPr>
-              <w:t>3.0 Quản lý</w:t>
-            </w:r>
-            <w:r>
-              <w:rPr>
-                <w:rFonts w:ascii="Times New Roman" w:hAnsi="Times New Roman" w:cs="Times New Roman"/>
-                <w:i/>
-                <w:color w:val="0000FF"/>
-                <w:sz w:val="26"/>
-                <w:szCs w:val="26"/>
-              </w:rPr>
-              <w:t xml:space="preserve"> </w:t>
-            </w:r>
-            <w:r>
-              <w:rPr>
-                <w:rFonts w:ascii="Times New Roman" w:hAnsi="Times New Roman" w:cs="Times New Roman"/>
-                <w:i/>
-                <w:color w:val="0000FF"/>
-                <w:sz w:val="26"/>
-                <w:szCs w:val="26"/>
-              </w:rPr>
-              <w:t>Dịch vụ Spa &amp; Đặt lịch hẹn</w:t>
+              <w:t>2.3.3 Kiểm kê định kỳ</w:t>
             </w:r>
           </w:p>
         </w:tc>
@@ -5962,14 +6275,6 @@
                 <w:szCs w:val="26"/>
               </w:rPr>
             </w:pPr>
-            <w:r>
-              <w:rPr>
-                <w:rFonts w:ascii="Times New Roman" w:hAnsi="Times New Roman" w:cs="Times New Roman"/>
-                <w:sz w:val="26"/>
-                <w:szCs w:val="26"/>
-              </w:rPr>
-              <w:t>Nhằm cảnh báo an toàn cho thợ cắt tỉa/spa trước khi thực hiện.</w:t>
-            </w:r>
           </w:p>
         </w:tc>
       </w:tr>
@@ -6000,7 +6305,17 @@
                 <w:sz w:val="26"/>
                 <w:szCs w:val="26"/>
               </w:rPr>
-              <w:t>UC008</w:t>
+              <w:t>UC00</w:t>
+            </w:r>
+            <w:r>
+              <w:rPr>
+                <w:rFonts w:ascii="Times New Roman" w:hAnsi="Times New Roman" w:cs="Times New Roman"/>
+                <w:i/>
+                <w:color w:val="0000FF"/>
+                <w:sz w:val="26"/>
+                <w:szCs w:val="26"/>
+              </w:rPr>
+              <w:t>8</w:t>
             </w:r>
           </w:p>
         </w:tc>
@@ -6027,7 +6342,7 @@
                 <w:sz w:val="26"/>
                 <w:szCs w:val="26"/>
               </w:rPr>
-              <w:t>Quản lý đặt lịch hẹn Spa</w:t>
+              <w:t>Xem cảnh báo kho</w:t>
             </w:r>
           </w:p>
         </w:tc>
@@ -6059,7 +6374,7 @@
                 <w:sz w:val="26"/>
                 <w:szCs w:val="26"/>
               </w:rPr>
-              <w:t>Tiếp nhận lịch hẹn, chọn thợ phụ trách, kiểm tra lịch trống tự động và xử lý việc hủy/thay đổi lịch hẹn.</w:t>
+              <w:t>Hiển thị cảnh báo khi tồn kho dưới mức tối thiểu (&lt;5) hoặc cận/hết HSD.</w:t>
             </w:r>
           </w:p>
         </w:tc>
@@ -6086,7 +6401,7 @@
                 <w:sz w:val="26"/>
                 <w:szCs w:val="26"/>
               </w:rPr>
-              <w:t>3.0 Quản lý Dịch vụ Spa &amp; Đặt lịch hẹn</w:t>
+              <w:t>2.4 Quản lý cảnh báo kho</w:t>
             </w:r>
           </w:p>
         </w:tc>
@@ -6103,14 +6418,6 @@
                 <w:szCs w:val="26"/>
               </w:rPr>
             </w:pPr>
-            <w:r>
-              <w:rPr>
-                <w:rFonts w:ascii="Times New Roman" w:hAnsi="Times New Roman" w:cs="Times New Roman"/>
-                <w:sz w:val="26"/>
-                <w:szCs w:val="26"/>
-              </w:rPr>
-              <w:t>Khung giờ 06:00 - 22:00, không cho phép xếp trùng 1 nhân viên làm 2 dịch vụ cùng lúc</w:t>
-            </w:r>
           </w:p>
         </w:tc>
       </w:tr>
@@ -6141,7 +6448,18 @@
                 <w:sz w:val="26"/>
                 <w:szCs w:val="26"/>
               </w:rPr>
-              <w:t>UC009</w:t>
+              <w:lastRenderedPageBreak/>
+              <w:t>UC00</w:t>
+            </w:r>
+            <w:r>
+              <w:rPr>
+                <w:rFonts w:ascii="Times New Roman" w:hAnsi="Times New Roman" w:cs="Times New Roman"/>
+                <w:i/>
+                <w:color w:val="0000FF"/>
+                <w:sz w:val="26"/>
+                <w:szCs w:val="26"/>
+              </w:rPr>
+              <w:t>9</w:t>
             </w:r>
           </w:p>
         </w:tc>
@@ -6168,7 +6486,7 @@
                 <w:sz w:val="26"/>
                 <w:szCs w:val="26"/>
               </w:rPr>
-              <w:t>Cập nhật trạng thái dịch vụ</w:t>
+              <w:t>Quản lý hồ sơ thú cưng</w:t>
             </w:r>
           </w:p>
         </w:tc>
@@ -6200,7 +6518,7 @@
                 <w:sz w:val="26"/>
                 <w:szCs w:val="26"/>
               </w:rPr>
-              <w:t>Ghi nhận và chuyển đổi trạng thái dịch vụ (Chờ tiếp nhận -&gt; Đang thực hiện -&gt; Hoàn thành) và ghi chú sau dịch vụ</w:t>
+              <w:t>Lưu trữ tên, giống, tuổi, cân nặng, đặc điểm</w:t>
             </w:r>
           </w:p>
         </w:tc>
@@ -6227,7 +6545,7 @@
                 <w:sz w:val="26"/>
                 <w:szCs w:val="26"/>
               </w:rPr>
-              <w:t>3.0 Quản lý Dịch vụ Spa &amp; Đặt lịch hẹn</w:t>
+              <w:t>3.1 Quản lý hồ sơ thú cưng &amp; Khách hàng</w:t>
             </w:r>
           </w:p>
         </w:tc>
@@ -6244,14 +6562,6 @@
                 <w:szCs w:val="26"/>
               </w:rPr>
             </w:pPr>
-            <w:r>
-              <w:rPr>
-                <w:rFonts w:ascii="Times New Roman" w:hAnsi="Times New Roman" w:cs="Times New Roman"/>
-                <w:sz w:val="26"/>
-                <w:szCs w:val="26"/>
-              </w:rPr>
-              <w:t>Kèm theo ghi nhận lượng mỹ phẩm/sữa tắm đã tiêu hao để trừ kho nội bộ.</w:t>
-            </w:r>
           </w:p>
         </w:tc>
       </w:tr>
@@ -6282,7 +6592,17 @@
                 <w:sz w:val="26"/>
                 <w:szCs w:val="26"/>
               </w:rPr>
-              <w:t>UC010</w:t>
+              <w:t>UC0</w:t>
+            </w:r>
+            <w:r>
+              <w:rPr>
+                <w:rFonts w:ascii="Times New Roman" w:hAnsi="Times New Roman" w:cs="Times New Roman"/>
+                <w:i/>
+                <w:color w:val="0000FF"/>
+                <w:sz w:val="26"/>
+                <w:szCs w:val="26"/>
+              </w:rPr>
+              <w:t>10</w:t>
             </w:r>
           </w:p>
         </w:tc>
@@ -6309,7 +6629,7 @@
                 <w:sz w:val="26"/>
                 <w:szCs w:val="26"/>
               </w:rPr>
-              <w:t>Lập hóa đơn tại quầy (POS)</w:t>
+              <w:t>Đặt lịch hẹn Spa</w:t>
             </w:r>
           </w:p>
         </w:tc>
@@ -6341,7 +6661,7 @@
                 <w:sz w:val="26"/>
                 <w:szCs w:val="26"/>
               </w:rPr>
-              <w:t>Thu ngân quét mã vạch sản phẩm/chọn dịch vụ, áp dụng mã giảm giá, tính chiết khấu VIP và hoàn tất thanh toán.</w:t>
+              <w:t>Ghi nhận lịch hẹn, chọn dịch vụ và chỉ định thợ Spa phụ trách.</w:t>
             </w:r>
           </w:p>
         </w:tc>
@@ -6368,7 +6688,7 @@
                 <w:sz w:val="26"/>
                 <w:szCs w:val="26"/>
               </w:rPr>
-              <w:t>4.0 Quản lý Bán hàng &amp; Đơn hàng</w:t>
+              <w:t>3.2.1, 3.2.2 Đặt lịch hẹn mới</w:t>
             </w:r>
           </w:p>
         </w:tc>
@@ -6385,14 +6705,6 @@
                 <w:szCs w:val="26"/>
               </w:rPr>
             </w:pPr>
-            <w:r>
-              <w:rPr>
-                <w:rFonts w:ascii="Times New Roman" w:hAnsi="Times New Roman" w:cs="Times New Roman"/>
-                <w:sz w:val="26"/>
-                <w:szCs w:val="26"/>
-              </w:rPr>
-              <w:t>Hệ thống tự kiểm tra tính hợp lệ và HSD của mã giảm giá</w:t>
-            </w:r>
           </w:p>
         </w:tc>
       </w:tr>
@@ -6423,7 +6735,17 @@
                 <w:sz w:val="26"/>
                 <w:szCs w:val="26"/>
               </w:rPr>
-              <w:t>UC011</w:t>
+              <w:t>UC0</w:t>
+            </w:r>
+            <w:r>
+              <w:rPr>
+                <w:rFonts w:ascii="Times New Roman" w:hAnsi="Times New Roman" w:cs="Times New Roman"/>
+                <w:i/>
+                <w:color w:val="0000FF"/>
+                <w:sz w:val="26"/>
+                <w:szCs w:val="26"/>
+              </w:rPr>
+              <w:t>11</w:t>
             </w:r>
           </w:p>
         </w:tc>
@@ -6450,7 +6772,7 @@
                 <w:sz w:val="26"/>
                 <w:szCs w:val="26"/>
               </w:rPr>
-              <w:t>Quản lý đơn hàng đa kênh</w:t>
+              <w:t>Hủy / Thay đổi lịch hẹn</w:t>
             </w:r>
           </w:p>
         </w:tc>
@@ -6482,7 +6804,7 @@
                 <w:sz w:val="26"/>
                 <w:szCs w:val="26"/>
               </w:rPr>
-              <w:t>Bắt buộc chọn nguồn đơn hàng (Tại quầy, Facebook, Zalo, Shopee, TikTok) và cập nhật trạng thái đóng gói, giao hàng.</w:t>
+              <w:t>Đổi giờ hoặc hủy lịch hẹn, hệ thống tự động giải phóng khung giờ đó.</w:t>
             </w:r>
           </w:p>
         </w:tc>
@@ -6509,7 +6831,7 @@
                 <w:sz w:val="26"/>
                 <w:szCs w:val="26"/>
               </w:rPr>
-              <w:t>4.0 Quản lý Bán hàng &amp; Đơn hàng</w:t>
+              <w:t>3.2.4 Hủy / Thay đổi lịch hẹn</w:t>
             </w:r>
           </w:p>
         </w:tc>
@@ -6526,14 +6848,6 @@
                 <w:szCs w:val="26"/>
               </w:rPr>
             </w:pPr>
-            <w:r>
-              <w:rPr>
-                <w:rFonts w:ascii="Times New Roman" w:hAnsi="Times New Roman" w:cs="Times New Roman"/>
-                <w:sz w:val="26"/>
-                <w:szCs w:val="26"/>
-              </w:rPr>
-              <w:t>Tích hợp quản lý trạng thái: Đã xác nhận -&gt; Đang đóng gói -&gt; Đang giao -&gt; Hoàn tất.</w:t>
-            </w:r>
           </w:p>
         </w:tc>
       </w:tr>
@@ -6564,7 +6878,27 @@
                 <w:sz w:val="26"/>
                 <w:szCs w:val="26"/>
               </w:rPr>
-              <w:t>UC012</w:t>
+              <w:t>UC0</w:t>
+            </w:r>
+            <w:r>
+              <w:rPr>
+                <w:rFonts w:ascii="Times New Roman" w:hAnsi="Times New Roman" w:cs="Times New Roman"/>
+                <w:i/>
+                <w:color w:val="0000FF"/>
+                <w:sz w:val="26"/>
+                <w:szCs w:val="26"/>
+              </w:rPr>
+              <w:t>1</w:t>
+            </w:r>
+            <w:r>
+              <w:rPr>
+                <w:rFonts w:ascii="Times New Roman" w:hAnsi="Times New Roman" w:cs="Times New Roman"/>
+                <w:i/>
+                <w:color w:val="0000FF"/>
+                <w:sz w:val="26"/>
+                <w:szCs w:val="26"/>
+              </w:rPr>
+              <w:t>2</w:t>
             </w:r>
           </w:p>
         </w:tc>
@@ -6591,7 +6925,7 @@
                 <w:sz w:val="26"/>
                 <w:szCs w:val="26"/>
               </w:rPr>
-              <w:t>Chăm sóc khách hàng (CRM)</w:t>
+              <w:t>Quản lý phiếu dịch vụ Spa</w:t>
             </w:r>
           </w:p>
         </w:tc>
@@ -6623,7 +6957,7 @@
                 <w:sz w:val="26"/>
                 <w:szCs w:val="26"/>
               </w:rPr>
-              <w:t>Tạo thẻ thành viên mới, tự động tích điểm sau giao dịch, nâng hạng thẻ (Bạc, Vàng, Kim Cương) và gửi SMS/Zalo hậu mãi, nhắc lịch.</w:t>
+              <w:t>quản lý các phiếu dịch vụ đang được thực hiện.</w:t>
             </w:r>
           </w:p>
         </w:tc>
@@ -6650,7 +6984,7 @@
                 <w:sz w:val="26"/>
                 <w:szCs w:val="26"/>
               </w:rPr>
-              <w:t>4.0 Quản lý Bán hàng &amp; Đơn hàng</w:t>
+              <w:t>3.3 Theo dõi &amp; Bàn giao dịch vụ</w:t>
             </w:r>
           </w:p>
         </w:tc>
@@ -6667,6 +7001,14 @@
                 <w:szCs w:val="26"/>
               </w:rPr>
             </w:pPr>
+            <w:r>
+              <w:rPr>
+                <w:rFonts w:ascii="Times New Roman" w:hAnsi="Times New Roman" w:cs="Times New Roman"/>
+                <w:sz w:val="26"/>
+                <w:szCs w:val="26"/>
+              </w:rPr>
+              <w:t>Bao gồm các thao tác Thêm, Sửa, Xóa.</w:t>
+            </w:r>
           </w:p>
         </w:tc>
       </w:tr>
@@ -6697,8 +7039,27 @@
                 <w:sz w:val="26"/>
                 <w:szCs w:val="26"/>
               </w:rPr>
-              <w:lastRenderedPageBreak/>
-              <w:t>UC013</w:t>
+              <w:t>UC0</w:t>
+            </w:r>
+            <w:r>
+              <w:rPr>
+                <w:rFonts w:ascii="Times New Roman" w:hAnsi="Times New Roman" w:cs="Times New Roman"/>
+                <w:i/>
+                <w:color w:val="0000FF"/>
+                <w:sz w:val="26"/>
+                <w:szCs w:val="26"/>
+              </w:rPr>
+              <w:t>1</w:t>
+            </w:r>
+            <w:r>
+              <w:rPr>
+                <w:rFonts w:ascii="Times New Roman" w:hAnsi="Times New Roman" w:cs="Times New Roman"/>
+                <w:i/>
+                <w:color w:val="0000FF"/>
+                <w:sz w:val="26"/>
+                <w:szCs w:val="26"/>
+              </w:rPr>
+              <w:t>3</w:t>
             </w:r>
           </w:p>
         </w:tc>
@@ -6725,7 +7086,7 @@
                 <w:sz w:val="26"/>
                 <w:szCs w:val="26"/>
               </w:rPr>
-              <w:t>Xem báo cáo và thống kê</w:t>
+              <w:t>Lập hóa đơn</w:t>
             </w:r>
           </w:p>
         </w:tc>
@@ -6757,7 +7118,7 @@
                 <w:sz w:val="26"/>
                 <w:szCs w:val="26"/>
               </w:rPr>
-              <w:t>Tổng hợp báo cáo doanh thu theo ngày/tháng, theo kênh bán, lợi nhuận, top sản phẩm và hiệu suất từng thợ cắt tỉa.</w:t>
+              <w:t>Quét mã vạch sản phẩm hoặc chọn dịch vụ đã hoàn thành, tính tiền, in hóa đơn.</w:t>
             </w:r>
           </w:p>
         </w:tc>
@@ -6784,7 +7145,7 @@
                 <w:sz w:val="26"/>
                 <w:szCs w:val="26"/>
               </w:rPr>
-              <w:t>5.0 Báo cáo &amp; Thống kê Quản trị</w:t>
+              <w:t>4.1 Xử lý bán hàng tại quầy (POS)</w:t>
             </w:r>
           </w:p>
         </w:tc>
@@ -6801,14 +7162,6 @@
                 <w:szCs w:val="26"/>
               </w:rPr>
             </w:pPr>
-            <w:r>
-              <w:rPr>
-                <w:rFonts w:ascii="Times New Roman" w:hAnsi="Times New Roman" w:cs="Times New Roman"/>
-                <w:sz w:val="26"/>
-                <w:szCs w:val="26"/>
-              </w:rPr>
-              <w:t>Có khả năng xuất dữ liệu báo cáo ra file Excel/PDF.</w:t>
-            </w:r>
           </w:p>
         </w:tc>
       </w:tr>
@@ -6839,7 +7192,27 @@
                 <w:sz w:val="26"/>
                 <w:szCs w:val="26"/>
               </w:rPr>
-              <w:t>UC014</w:t>
+              <w:t>UC0</w:t>
+            </w:r>
+            <w:r>
+              <w:rPr>
+                <w:rFonts w:ascii="Times New Roman" w:hAnsi="Times New Roman" w:cs="Times New Roman"/>
+                <w:i/>
+                <w:color w:val="0000FF"/>
+                <w:sz w:val="26"/>
+                <w:szCs w:val="26"/>
+              </w:rPr>
+              <w:t>1</w:t>
+            </w:r>
+            <w:r>
+              <w:rPr>
+                <w:rFonts w:ascii="Times New Roman" w:hAnsi="Times New Roman" w:cs="Times New Roman"/>
+                <w:i/>
+                <w:color w:val="0000FF"/>
+                <w:sz w:val="26"/>
+                <w:szCs w:val="26"/>
+              </w:rPr>
+              <w:t>4</w:t>
             </w:r>
           </w:p>
         </w:tc>
@@ -6866,7 +7239,17 @@
                 <w:sz w:val="26"/>
                 <w:szCs w:val="26"/>
               </w:rPr>
-              <w:t>Quản lý chương trình khuyến mãi</w:t>
+              <w:t>Áp dụng</w:t>
+            </w:r>
+            <w:r>
+              <w:rPr>
+                <w:rFonts w:ascii="Times New Roman" w:hAnsi="Times New Roman" w:cs="Times New Roman"/>
+                <w:i/>
+                <w:color w:val="0000FF"/>
+                <w:sz w:val="26"/>
+                <w:szCs w:val="26"/>
+              </w:rPr>
+              <w:t xml:space="preserve"> khuyến mãi</w:t>
             </w:r>
           </w:p>
         </w:tc>
@@ -6898,7 +7281,7 @@
                 <w:sz w:val="26"/>
                 <w:szCs w:val="26"/>
               </w:rPr>
-              <w:t>Tạo mới, chỉnh sửa, theo dõi các chương trình khuyến mãi và phát hành mã giảm giá (voucher) cho khách hàng.</w:t>
+              <w:t>Nhập mã giảm giá hoặc tự động áp dụng chiết khấu theo hạng thẻ VIP.</w:t>
             </w:r>
           </w:p>
         </w:tc>
@@ -6925,7 +7308,7 @@
                 <w:sz w:val="26"/>
                 <w:szCs w:val="26"/>
               </w:rPr>
-              <w:t>4.0 Quản lý Bán hàng &amp; Đơn hàng</w:t>
+              <w:t>4.1.3 Áp dụng mã giảm giá / Voucher</w:t>
             </w:r>
           </w:p>
         </w:tc>
@@ -6942,14 +7325,6 @@
                 <w:szCs w:val="26"/>
               </w:rPr>
             </w:pPr>
-            <w:r>
-              <w:rPr>
-                <w:rFonts w:ascii="Times New Roman" w:hAnsi="Times New Roman" w:cs="Times New Roman"/>
-                <w:sz w:val="26"/>
-                <w:szCs w:val="26"/>
-              </w:rPr>
-              <w:t>Hệ thống tự động kiểm tra tính hợp lệ và hạn sử dụng của mã giảm giá trước khi áp dụng trừ tiền vào hóa đơn.</w:t>
-            </w:r>
           </w:p>
         </w:tc>
       </w:tr>
@@ -6980,7 +7355,27 @@
                 <w:sz w:val="26"/>
                 <w:szCs w:val="26"/>
               </w:rPr>
-              <w:t>UC015</w:t>
+              <w:t>UC0</w:t>
+            </w:r>
+            <w:r>
+              <w:rPr>
+                <w:rFonts w:ascii="Times New Roman" w:hAnsi="Times New Roman" w:cs="Times New Roman"/>
+                <w:i/>
+                <w:color w:val="0000FF"/>
+                <w:sz w:val="26"/>
+                <w:szCs w:val="26"/>
+              </w:rPr>
+              <w:t>1</w:t>
+            </w:r>
+            <w:r>
+              <w:rPr>
+                <w:rFonts w:ascii="Times New Roman" w:hAnsi="Times New Roman" w:cs="Times New Roman"/>
+                <w:i/>
+                <w:color w:val="0000FF"/>
+                <w:sz w:val="26"/>
+                <w:szCs w:val="26"/>
+              </w:rPr>
+              <w:t>5</w:t>
             </w:r>
           </w:p>
         </w:tc>
@@ -7007,7 +7402,27 @@
                 <w:sz w:val="26"/>
                 <w:szCs w:val="26"/>
               </w:rPr>
-              <w:t>Quản lý đổi trả hàng</w:t>
+              <w:t>Quản lý</w:t>
+            </w:r>
+            <w:r>
+              <w:rPr>
+                <w:rFonts w:ascii="Times New Roman" w:hAnsi="Times New Roman" w:cs="Times New Roman"/>
+                <w:i/>
+                <w:color w:val="0000FF"/>
+                <w:sz w:val="26"/>
+                <w:szCs w:val="26"/>
+              </w:rPr>
+              <w:t xml:space="preserve"> t</w:t>
+            </w:r>
+            <w:r>
+              <w:rPr>
+                <w:rFonts w:ascii="Times New Roman" w:hAnsi="Times New Roman" w:cs="Times New Roman"/>
+                <w:i/>
+                <w:color w:val="0000FF"/>
+                <w:sz w:val="26"/>
+                <w:szCs w:val="26"/>
+              </w:rPr>
+              <w:t>hẻ thành viên</w:t>
             </w:r>
           </w:p>
         </w:tc>
@@ -7039,7 +7454,7 @@
                 <w:sz w:val="26"/>
                 <w:szCs w:val="26"/>
               </w:rPr>
-              <w:t>Tiếp nhận, kiểm tra hóa đơn cũ và xử lý các yêu cầu đổi trả hàng hóa cho khách hàng sau bán hàng.</w:t>
+              <w:t>Thêm,xoá và chỉnh sửa thông tin trên thẻ thành viên và thứ hạng của thẻ</w:t>
             </w:r>
           </w:p>
         </w:tc>
@@ -7066,7 +7481,7 @@
                 <w:sz w:val="26"/>
                 <w:szCs w:val="26"/>
               </w:rPr>
-              <w:t>4.0 Quản lý Bán hàng &amp; Đơn hàng (Mục 4.3.3)</w:t>
+              <w:t>4.3 Quản lý chăm sóc khách hàng</w:t>
             </w:r>
           </w:p>
         </w:tc>
@@ -7083,14 +7498,322 @@
                 <w:szCs w:val="26"/>
               </w:rPr>
             </w:pPr>
-            <w:r>
-              <w:rPr>
-                <w:rFonts w:ascii="Times New Roman" w:hAnsi="Times New Roman" w:cs="Times New Roman"/>
-                <w:sz w:val="26"/>
-                <w:szCs w:val="26"/>
-              </w:rPr>
-              <w:t>Sau khi hoàn tất đổi trả, hệ thống cần đồng bộ lại chính xác số lượng tồn kho của sản phẩm bị hoàn về.</w:t>
-            </w:r>
+          </w:p>
+        </w:tc>
+      </w:tr>
+      <w:tr>
+        <w:trPr>
+          <w:jc w:val="center"/>
+        </w:trPr>
+        <w:tc>
+          <w:tcPr>
+            <w:tcW w:w="537" w:type="pct"/>
+          </w:tcPr>
+          <w:p>
+            <w:pPr>
+              <w:spacing w:after="120"/>
+              <w:rPr>
+                <w:rFonts w:ascii="Times New Roman" w:hAnsi="Times New Roman" w:cs="Times New Roman"/>
+                <w:i/>
+                <w:color w:val="0000FF"/>
+                <w:sz w:val="26"/>
+                <w:szCs w:val="26"/>
+              </w:rPr>
+            </w:pPr>
+            <w:r>
+              <w:rPr>
+                <w:rFonts w:ascii="Times New Roman" w:hAnsi="Times New Roman" w:cs="Times New Roman"/>
+                <w:i/>
+                <w:color w:val="0000FF"/>
+                <w:sz w:val="26"/>
+                <w:szCs w:val="26"/>
+              </w:rPr>
+              <w:t>UC0</w:t>
+            </w:r>
+            <w:r>
+              <w:rPr>
+                <w:rFonts w:ascii="Times New Roman" w:hAnsi="Times New Roman" w:cs="Times New Roman"/>
+                <w:i/>
+                <w:color w:val="0000FF"/>
+                <w:sz w:val="26"/>
+                <w:szCs w:val="26"/>
+              </w:rPr>
+              <w:t>1</w:t>
+            </w:r>
+            <w:r>
+              <w:rPr>
+                <w:rFonts w:ascii="Times New Roman" w:hAnsi="Times New Roman" w:cs="Times New Roman"/>
+                <w:i/>
+                <w:color w:val="0000FF"/>
+                <w:sz w:val="26"/>
+                <w:szCs w:val="26"/>
+              </w:rPr>
+              <w:t>6</w:t>
+            </w:r>
+          </w:p>
+        </w:tc>
+        <w:tc>
+          <w:tcPr>
+            <w:tcW w:w="942" w:type="pct"/>
+          </w:tcPr>
+          <w:p>
+            <w:pPr>
+              <w:spacing w:after="120"/>
+              <w:rPr>
+                <w:rFonts w:ascii="Times New Roman" w:hAnsi="Times New Roman" w:cs="Times New Roman"/>
+                <w:i/>
+                <w:color w:val="0000FF"/>
+                <w:sz w:val="26"/>
+                <w:szCs w:val="26"/>
+              </w:rPr>
+            </w:pPr>
+            <w:r>
+              <w:rPr>
+                <w:rFonts w:ascii="Times New Roman" w:hAnsi="Times New Roman" w:cs="Times New Roman"/>
+                <w:i/>
+                <w:color w:val="0000FF"/>
+                <w:sz w:val="26"/>
+                <w:szCs w:val="26"/>
+              </w:rPr>
+              <w:t>Xem Báo cáo &amp; Thống kê</w:t>
+            </w:r>
+          </w:p>
+        </w:tc>
+        <w:tc>
+          <w:tcPr>
+            <w:tcW w:w="1742" w:type="pct"/>
+          </w:tcPr>
+          <w:p>
+            <w:pPr>
+              <w:pStyle w:val="StyleTabletextBoldCentered"/>
+              <w:spacing w:before="0" w:line="240" w:lineRule="auto"/>
+              <w:rPr>
+                <w:rFonts w:ascii="Times New Roman" w:hAnsi="Times New Roman"/>
+                <w:b w:val="0"/>
+                <w:bCs w:val="0"/>
+                <w:i/>
+                <w:color w:val="0000FF"/>
+                <w:sz w:val="26"/>
+                <w:szCs w:val="26"/>
+              </w:rPr>
+            </w:pPr>
+            <w:r>
+              <w:rPr>
+                <w:rFonts w:ascii="Times New Roman" w:hAnsi="Times New Roman"/>
+                <w:b w:val="0"/>
+                <w:bCs w:val="0"/>
+                <w:i/>
+                <w:color w:val="0000FF"/>
+                <w:sz w:val="26"/>
+                <w:szCs w:val="26"/>
+              </w:rPr>
+              <w:t>Thống kê doanh thu, lợi nhuận, hiệu suất thợ Spa và top sản phẩm bán chạy.</w:t>
+            </w:r>
+          </w:p>
+        </w:tc>
+        <w:tc>
+          <w:tcPr>
+            <w:tcW w:w="978" w:type="pct"/>
+          </w:tcPr>
+          <w:p>
+            <w:pPr>
+              <w:spacing w:after="120"/>
+              <w:rPr>
+                <w:rFonts w:ascii="Times New Roman" w:hAnsi="Times New Roman" w:cs="Times New Roman"/>
+                <w:i/>
+                <w:color w:val="0000FF"/>
+                <w:sz w:val="26"/>
+                <w:szCs w:val="26"/>
+              </w:rPr>
+            </w:pPr>
+            <w:r>
+              <w:rPr>
+                <w:rFonts w:ascii="Times New Roman" w:hAnsi="Times New Roman" w:cs="Times New Roman"/>
+                <w:i/>
+                <w:color w:val="0000FF"/>
+                <w:sz w:val="26"/>
+                <w:szCs w:val="26"/>
+              </w:rPr>
+              <w:t>5.1, 5.2, 5.3 Báo cáo và Thống kê</w:t>
+            </w:r>
+          </w:p>
+        </w:tc>
+        <w:tc>
+          <w:tcPr>
+            <w:tcW w:w="801" w:type="pct"/>
+          </w:tcPr>
+          <w:p>
+            <w:pPr>
+              <w:spacing w:after="120"/>
+              <w:rPr>
+                <w:rFonts w:ascii="Times New Roman" w:hAnsi="Times New Roman" w:cs="Times New Roman"/>
+                <w:sz w:val="26"/>
+                <w:szCs w:val="26"/>
+              </w:rPr>
+            </w:pPr>
+          </w:p>
+        </w:tc>
+      </w:tr>
+      <w:tr>
+        <w:trPr>
+          <w:jc w:val="center"/>
+        </w:trPr>
+        <w:tc>
+          <w:tcPr>
+            <w:tcW w:w="537" w:type="pct"/>
+          </w:tcPr>
+          <w:p>
+            <w:pPr>
+              <w:spacing w:after="120"/>
+              <w:rPr>
+                <w:rFonts w:ascii="Times New Roman" w:hAnsi="Times New Roman" w:cs="Times New Roman"/>
+                <w:i/>
+                <w:color w:val="0000FF"/>
+                <w:sz w:val="26"/>
+                <w:szCs w:val="26"/>
+              </w:rPr>
+            </w:pPr>
+            <w:r>
+              <w:rPr>
+                <w:rFonts w:ascii="Times New Roman" w:hAnsi="Times New Roman" w:cs="Times New Roman"/>
+                <w:i/>
+                <w:color w:val="0000FF"/>
+                <w:sz w:val="26"/>
+                <w:szCs w:val="26"/>
+              </w:rPr>
+              <w:t>UC0</w:t>
+            </w:r>
+            <w:r>
+              <w:rPr>
+                <w:rFonts w:ascii="Times New Roman" w:hAnsi="Times New Roman" w:cs="Times New Roman"/>
+                <w:i/>
+                <w:color w:val="0000FF"/>
+                <w:sz w:val="26"/>
+                <w:szCs w:val="26"/>
+              </w:rPr>
+              <w:t>1</w:t>
+            </w:r>
+            <w:r>
+              <w:rPr>
+                <w:rFonts w:ascii="Times New Roman" w:hAnsi="Times New Roman" w:cs="Times New Roman"/>
+                <w:i/>
+                <w:color w:val="0000FF"/>
+                <w:sz w:val="26"/>
+                <w:szCs w:val="26"/>
+              </w:rPr>
+              <w:t>7</w:t>
+            </w:r>
+          </w:p>
+        </w:tc>
+        <w:tc>
+          <w:tcPr>
+            <w:tcW w:w="942" w:type="pct"/>
+          </w:tcPr>
+          <w:p>
+            <w:pPr>
+              <w:spacing w:after="120"/>
+              <w:rPr>
+                <w:rFonts w:ascii="Times New Roman" w:hAnsi="Times New Roman" w:cs="Times New Roman"/>
+                <w:i/>
+                <w:color w:val="0000FF"/>
+                <w:sz w:val="26"/>
+                <w:szCs w:val="26"/>
+              </w:rPr>
+            </w:pPr>
+            <w:r>
+              <w:rPr>
+                <w:rFonts w:ascii="Times New Roman" w:hAnsi="Times New Roman" w:cs="Times New Roman"/>
+                <w:i/>
+                <w:color w:val="0000FF"/>
+                <w:sz w:val="26"/>
+                <w:szCs w:val="26"/>
+              </w:rPr>
+              <w:t>In</w:t>
+            </w:r>
+            <w:r>
+              <w:rPr>
+                <w:rFonts w:ascii="Times New Roman" w:hAnsi="Times New Roman" w:cs="Times New Roman"/>
+                <w:i/>
+                <w:color w:val="0000FF"/>
+                <w:sz w:val="26"/>
+                <w:szCs w:val="26"/>
+              </w:rPr>
+              <w:t xml:space="preserve"> báo cáo</w:t>
+            </w:r>
+          </w:p>
+        </w:tc>
+        <w:tc>
+          <w:tcPr>
+            <w:tcW w:w="1742" w:type="pct"/>
+          </w:tcPr>
+          <w:p>
+            <w:pPr>
+              <w:pStyle w:val="StyleTabletextBoldCentered"/>
+              <w:spacing w:before="0" w:line="240" w:lineRule="auto"/>
+              <w:rPr>
+                <w:rFonts w:ascii="Times New Roman" w:hAnsi="Times New Roman"/>
+                <w:b w:val="0"/>
+                <w:bCs w:val="0"/>
+                <w:i/>
+                <w:color w:val="0000FF"/>
+                <w:sz w:val="26"/>
+                <w:szCs w:val="26"/>
+              </w:rPr>
+            </w:pPr>
+            <w:r>
+              <w:rPr>
+                <w:rFonts w:ascii="Times New Roman" w:hAnsi="Times New Roman"/>
+                <w:b w:val="0"/>
+                <w:bCs w:val="0"/>
+                <w:i/>
+                <w:color w:val="0000FF"/>
+                <w:sz w:val="26"/>
+                <w:szCs w:val="26"/>
+              </w:rPr>
+              <w:t>Trích xuất các báo cáo thống kê ra định dạng file Excel hoặc PDF.</w:t>
+            </w:r>
+          </w:p>
+        </w:tc>
+        <w:tc>
+          <w:tcPr>
+            <w:tcW w:w="978" w:type="pct"/>
+          </w:tcPr>
+          <w:p>
+            <w:pPr>
+              <w:spacing w:after="120"/>
+              <w:rPr>
+                <w:rFonts w:ascii="Times New Roman" w:hAnsi="Times New Roman" w:cs="Times New Roman"/>
+                <w:i/>
+                <w:color w:val="0000FF"/>
+                <w:sz w:val="26"/>
+                <w:szCs w:val="26"/>
+              </w:rPr>
+            </w:pPr>
+            <w:r>
+              <w:rPr>
+                <w:rFonts w:ascii="Times New Roman" w:hAnsi="Times New Roman" w:cs="Times New Roman"/>
+                <w:i/>
+                <w:color w:val="0000FF"/>
+                <w:sz w:val="26"/>
+                <w:szCs w:val="26"/>
+              </w:rPr>
+              <w:t>5.3.2 Xuất báo cáo ra file</w:t>
+            </w:r>
+          </w:p>
+        </w:tc>
+        <w:tc>
+          <w:tcPr>
+            <w:tcW w:w="801" w:type="pct"/>
+          </w:tcPr>
+          <w:p>
+            <w:pPr>
+              <w:spacing w:after="120"/>
+              <w:rPr>
+                <w:rFonts w:ascii="Times New Roman" w:hAnsi="Times New Roman" w:cs="Times New Roman"/>
+                <w:sz w:val="26"/>
+                <w:szCs w:val="26"/>
+              </w:rPr>
+            </w:pPr>
           </w:p>
         </w:tc>
       </w:tr>
@@ -9193,7 +9916,7 @@
       </w:pPr>
     </w:p>
     <w:sectPr>
-      <w:footerReference w:type="default" r:id="rId10"/>
+      <w:footerReference w:type="default" r:id="rId11"/>
       <w:pgSz w:w="12240" w:h="15840" w:code="1"/>
       <w:pgMar w:top="851" w:right="851" w:bottom="851" w:left="1134" w:header="567" w:footer="567" w:gutter="0"/>
       <w:pgNumType w:start="0"/>
@@ -11212,21 +11935,19 @@
     <w:rsid w:val="00220CD5"/>
     <w:rsid w:val="002551A2"/>
     <w:rsid w:val="002A48CE"/>
-    <w:rsid w:val="002E60E4"/>
     <w:rsid w:val="00314A2A"/>
     <w:rsid w:val="00416DE4"/>
     <w:rsid w:val="00513297"/>
+    <w:rsid w:val="005F04E9"/>
     <w:rsid w:val="007D4F22"/>
     <w:rsid w:val="008179DC"/>
     <w:rsid w:val="00994E73"/>
-    <w:rsid w:val="00A91BFA"/>
     <w:rsid w:val="00AD256A"/>
     <w:rsid w:val="00B448D8"/>
     <w:rsid w:val="00B73467"/>
     <w:rsid w:val="00BE4664"/>
-    <w:rsid w:val="00CC4851"/>
-    <w:rsid w:val="00D855B1"/>
     <w:rsid w:val="00DD5612"/>
+    <w:rsid w:val="00EA5BB7"/>
     <w:rsid w:val="00F06863"/>
     <w:rsid w:val="00F152FF"/>
   </w:rsids>

</xml_diff>

<commit_message>
Sửa lại bảng UC và chốt lại sơ đồ
</commit_message>
<xml_diff>
--- a/DOC/N15_3_ApplicationDevelopment_SRS.docx
+++ b/DOC/N15_3_ApplicationDevelopment_SRS.docx
@@ -4525,10 +4525,10 @@
           <w:noProof/>
         </w:rPr>
         <w:drawing>
-          <wp:inline distT="0" distB="0" distL="0" distR="0" wp14:anchorId="2983A1B9" wp14:editId="4D3354D1">
-            <wp:extent cx="6511925" cy="4776470"/>
-            <wp:effectExtent l="0" t="0" r="3175" b="5080"/>
-            <wp:docPr id="1507883606" name="Picture 7"/>
+          <wp:inline distT="0" distB="0" distL="0" distR="0" wp14:anchorId="290BFDA2" wp14:editId="5C213653">
+            <wp:extent cx="6507480" cy="5067300"/>
+            <wp:effectExtent l="0" t="0" r="7620" b="0"/>
+            <wp:docPr id="1968780964" name="Picture 8"/>
             <wp:cNvGraphicFramePr>
               <a:graphicFrameLocks xmlns:a="http://schemas.openxmlformats.org/drawingml/2006/main" noChangeAspect="1"/>
             </wp:cNvGraphicFramePr>
@@ -4536,7 +4536,7 @@
               <a:graphicData uri="http://schemas.openxmlformats.org/drawingml/2006/picture">
                 <pic:pic xmlns:pic="http://schemas.openxmlformats.org/drawingml/2006/picture">
                   <pic:nvPicPr>
-                    <pic:cNvPr id="0" name="Picture 1"/>
+                    <pic:cNvPr id="0" name="Picture 2"/>
                     <pic:cNvPicPr>
                       <a:picLocks noChangeAspect="1" noChangeArrowheads="1"/>
                     </pic:cNvPicPr>
@@ -4557,7 +4557,7 @@
                   <pic:spPr bwMode="auto">
                     <a:xfrm>
                       <a:off x="0" y="0"/>
-                      <a:ext cx="6511925" cy="4776470"/>
+                      <a:ext cx="6507480" cy="5067300"/>
                     </a:xfrm>
                     <a:prstGeom prst="rect">
                       <a:avLst/>
@@ -4953,7 +4953,7 @@
                 <w:szCs w:val="26"/>
               </w:rPr>
               <w:lastRenderedPageBreak/>
-              <w:t xml:space="preserve">Cần đặc biệt chú ý đến phần ghi chú cảnh báo an toàn (tính dữ/hiền, </w:t>
+              <w:t xml:space="preserve">Cần đặc biệt chú ý đến phần ghi chú cảnh báo </w:t>
             </w:r>
             <w:r>
               <w:rPr>
@@ -4962,7 +4962,7 @@
                 <w:szCs w:val="26"/>
               </w:rPr>
               <w:lastRenderedPageBreak/>
-              <w:t>tiền sử dị ứng) của thú cưng.</w:t>
+              <w:t>an toàn (tính dữ/hiền, tiền sử dị ứng) của thú cưng.</w:t>
             </w:r>
           </w:p>
         </w:tc>
@@ -4990,6 +4990,7 @@
                 <w:sz w:val="26"/>
                 <w:szCs w:val="26"/>
               </w:rPr>
+              <w:lastRenderedPageBreak/>
               <w:t>Nhân viên kho</w:t>
             </w:r>
           </w:p>
@@ -5659,7 +5660,31 @@
                 <w:sz w:val="26"/>
                 <w:szCs w:val="26"/>
               </w:rPr>
-              <w:t>,chỉnh xửa thời gian ca và xoá cả làm việc của nhân viên</w:t>
+              <w:t>,chỉnh xửa thời gian ca và xoá c</w:t>
+            </w:r>
+            <w:r>
+              <w:rPr>
+                <w:rFonts w:ascii="Times New Roman" w:hAnsi="Times New Roman"/>
+                <w:b w:val="0"/>
+                <w:bCs w:val="0"/>
+                <w:i/>
+                <w:color w:val="0000FF"/>
+                <w:sz w:val="26"/>
+                <w:szCs w:val="26"/>
+              </w:rPr>
+              <w:t>a</w:t>
+            </w:r>
+            <w:r>
+              <w:rPr>
+                <w:rFonts w:ascii="Times New Roman" w:hAnsi="Times New Roman"/>
+                <w:b w:val="0"/>
+                <w:bCs w:val="0"/>
+                <w:i/>
+                <w:color w:val="0000FF"/>
+                <w:sz w:val="26"/>
+                <w:szCs w:val="26"/>
+              </w:rPr>
+              <w:t xml:space="preserve"> làm việc của nhân viên</w:t>
             </w:r>
           </w:p>
         </w:tc>
@@ -5913,7 +5938,7 @@
                 <w:sz w:val="26"/>
                 <w:szCs w:val="26"/>
               </w:rPr>
-              <w:t>Quản lý danh mục &amp; sản phẩm</w:t>
+              <w:t>Quản lý danh mục</w:t>
             </w:r>
           </w:p>
         </w:tc>
@@ -5945,7 +5970,31 @@
                 <w:sz w:val="26"/>
                 <w:szCs w:val="26"/>
               </w:rPr>
-              <w:t>Thêm, sửa, xóa thông tin sản phẩm theo 5 nhóm danh mục (Thức ăn, Phụ kiện,...)</w:t>
+              <w:t xml:space="preserve">Thêm, sửa, xóa </w:t>
+            </w:r>
+            <w:r>
+              <w:rPr>
+                <w:rFonts w:ascii="Times New Roman" w:hAnsi="Times New Roman"/>
+                <w:b w:val="0"/>
+                <w:bCs w:val="0"/>
+                <w:i/>
+                <w:color w:val="0000FF"/>
+                <w:sz w:val="26"/>
+                <w:szCs w:val="26"/>
+              </w:rPr>
+              <w:t>các</w:t>
+            </w:r>
+            <w:r>
+              <w:rPr>
+                <w:rFonts w:ascii="Times New Roman" w:hAnsi="Times New Roman"/>
+                <w:b w:val="0"/>
+                <w:bCs w:val="0"/>
+                <w:i/>
+                <w:color w:val="0000FF"/>
+                <w:sz w:val="26"/>
+                <w:szCs w:val="26"/>
+              </w:rPr>
+              <w:t xml:space="preserve"> nhóm danh mục (Thức ăn, Phụ kiện,...)</w:t>
             </w:r>
           </w:p>
         </w:tc>
@@ -6019,17 +6068,7 @@
                 <w:sz w:val="26"/>
                 <w:szCs w:val="26"/>
               </w:rPr>
-              <w:t>UC00</w:t>
-            </w:r>
-            <w:r>
-              <w:rPr>
-                <w:rFonts w:ascii="Times New Roman" w:hAnsi="Times New Roman" w:cs="Times New Roman"/>
-                <w:i/>
-                <w:color w:val="0000FF"/>
-                <w:sz w:val="26"/>
-                <w:szCs w:val="26"/>
-              </w:rPr>
-              <w:t>6</w:t>
+              <w:t>UC006</w:t>
             </w:r>
           </w:p>
         </w:tc>
@@ -6056,7 +6095,7 @@
                 <w:sz w:val="26"/>
                 <w:szCs w:val="26"/>
               </w:rPr>
-              <w:t>Lập phiếu nhập kho</w:t>
+              <w:t>Quản lý sản phẩm</w:t>
             </w:r>
           </w:p>
         </w:tc>
@@ -6088,7 +6127,19 @@
                 <w:sz w:val="26"/>
                 <w:szCs w:val="26"/>
               </w:rPr>
-              <w:t>Ghi nhận số lượng, giá nhập, chứng từ, mã lô và Hạn sử dụng (HSD)</w:t>
+              <w:t>Thêm, sửa, xóa thông tin sản phẩm</w:t>
+            </w:r>
+            <w:r>
+              <w:rPr>
+                <w:rFonts w:ascii="Times New Roman" w:hAnsi="Times New Roman"/>
+                <w:b w:val="0"/>
+                <w:bCs w:val="0"/>
+                <w:i/>
+                <w:color w:val="0000FF"/>
+                <w:sz w:val="26"/>
+                <w:szCs w:val="26"/>
+              </w:rPr>
+              <w:t>(Tên sản phẩm,HSD,Ngày nhập kho,…)</w:t>
             </w:r>
           </w:p>
         </w:tc>
@@ -6107,16 +6158,6 @@
                 <w:szCs w:val="26"/>
               </w:rPr>
             </w:pPr>
-            <w:r>
-              <w:rPr>
-                <w:rFonts w:ascii="Times New Roman" w:hAnsi="Times New Roman" w:cs="Times New Roman"/>
-                <w:i/>
-                <w:color w:val="0000FF"/>
-                <w:sz w:val="26"/>
-                <w:szCs w:val="26"/>
-              </w:rPr>
-              <w:t>2.2 Quản lý nhập kho</w:t>
-            </w:r>
           </w:p>
         </w:tc>
         <w:tc>
@@ -6199,7 +6240,7 @@
                 <w:sz w:val="26"/>
                 <w:szCs w:val="26"/>
               </w:rPr>
-              <w:t>Kiểm kê tồn kho định kỳ</w:t>
+              <w:t>Lập phiếu nhập kho</w:t>
             </w:r>
           </w:p>
         </w:tc>
@@ -6231,7 +6272,7 @@
                 <w:sz w:val="26"/>
                 <w:szCs w:val="26"/>
               </w:rPr>
-              <w:t>Đối soát số lượng thực tế tại cửa hàng với dữ liệu trên phần mềm</w:t>
+              <w:t>Ghi nhận số lượng, giá nhập, chứng từ, mã lô và Hạn sử dụng (HSD)</w:t>
             </w:r>
           </w:p>
         </w:tc>
@@ -6258,7 +6299,7 @@
                 <w:sz w:val="26"/>
                 <w:szCs w:val="26"/>
               </w:rPr>
-              <w:t>2.3.3 Kiểm kê định kỳ</w:t>
+              <w:t>2.2 Quản lý nhập kho</w:t>
             </w:r>
           </w:p>
         </w:tc>
@@ -6342,7 +6383,7 @@
                 <w:sz w:val="26"/>
                 <w:szCs w:val="26"/>
               </w:rPr>
-              <w:t>Xem cảnh báo kho</w:t>
+              <w:t>Kiểm kê tồn kho định kỳ</w:t>
             </w:r>
           </w:p>
         </w:tc>
@@ -6374,7 +6415,7 @@
                 <w:sz w:val="26"/>
                 <w:szCs w:val="26"/>
               </w:rPr>
-              <w:t>Hiển thị cảnh báo khi tồn kho dưới mức tối thiểu (&lt;5) hoặc cận/hết HSD.</w:t>
+              <w:t>Đối soát số lượng thực tế tại cửa hàng với dữ liệu trên phần mềm</w:t>
             </w:r>
           </w:p>
         </w:tc>
@@ -6401,7 +6442,7 @@
                 <w:sz w:val="26"/>
                 <w:szCs w:val="26"/>
               </w:rPr>
-              <w:t>2.4 Quản lý cảnh báo kho</w:t>
+              <w:t>2.3.3 Kiểm kê định kỳ</w:t>
             </w:r>
           </w:p>
         </w:tc>
@@ -6486,7 +6527,7 @@
                 <w:sz w:val="26"/>
                 <w:szCs w:val="26"/>
               </w:rPr>
-              <w:t>Quản lý hồ sơ thú cưng</w:t>
+              <w:t>Xem cảnh báo kho</w:t>
             </w:r>
           </w:p>
         </w:tc>
@@ -6518,7 +6559,7 @@
                 <w:sz w:val="26"/>
                 <w:szCs w:val="26"/>
               </w:rPr>
-              <w:t>Lưu trữ tên, giống, tuổi, cân nặng, đặc điểm</w:t>
+              <w:t>Hiển thị cảnh báo khi tồn kho dưới mức tối thiểu (&lt;5) hoặc cận/hết HSD.</w:t>
             </w:r>
           </w:p>
         </w:tc>
@@ -6545,7 +6586,7 @@
                 <w:sz w:val="26"/>
                 <w:szCs w:val="26"/>
               </w:rPr>
-              <w:t>3.1 Quản lý hồ sơ thú cưng &amp; Khách hàng</w:t>
+              <w:t>2.4 Quản lý cảnh báo kho</w:t>
             </w:r>
           </w:p>
         </w:tc>
@@ -6629,7 +6670,7 @@
                 <w:sz w:val="26"/>
                 <w:szCs w:val="26"/>
               </w:rPr>
-              <w:t>Đặt lịch hẹn Spa</w:t>
+              <w:t>Thêm hồ sơ thú cưng</w:t>
             </w:r>
           </w:p>
         </w:tc>
@@ -6661,7 +6702,7 @@
                 <w:sz w:val="26"/>
                 <w:szCs w:val="26"/>
               </w:rPr>
-              <w:t>Ghi nhận lịch hẹn, chọn dịch vụ và chỉ định thợ Spa phụ trách.</w:t>
+              <w:t>Lưu trữ tên, giống, tuổi, cân nặng, đặc điểm</w:t>
             </w:r>
           </w:p>
         </w:tc>
@@ -6688,7 +6729,7 @@
                 <w:sz w:val="26"/>
                 <w:szCs w:val="26"/>
               </w:rPr>
-              <w:t>3.2.1, 3.2.2 Đặt lịch hẹn mới</w:t>
+              <w:t>3.1 Quản lý hồ sơ thú cưng &amp; Khách hàng</w:t>
             </w:r>
           </w:p>
         </w:tc>
@@ -6745,7 +6786,17 @@
                 <w:sz w:val="26"/>
                 <w:szCs w:val="26"/>
               </w:rPr>
-              <w:t>11</w:t>
+              <w:t>1</w:t>
+            </w:r>
+            <w:r>
+              <w:rPr>
+                <w:rFonts w:ascii="Times New Roman" w:hAnsi="Times New Roman" w:cs="Times New Roman"/>
+                <w:i/>
+                <w:color w:val="0000FF"/>
+                <w:sz w:val="26"/>
+                <w:szCs w:val="26"/>
+              </w:rPr>
+              <w:t>1</w:t>
             </w:r>
           </w:p>
         </w:tc>
@@ -6772,7 +6823,17 @@
                 <w:sz w:val="26"/>
                 <w:szCs w:val="26"/>
               </w:rPr>
-              <w:t>Hủy / Thay đổi lịch hẹn</w:t>
+              <w:t>Tạo</w:t>
+            </w:r>
+            <w:r>
+              <w:rPr>
+                <w:rFonts w:ascii="Times New Roman" w:hAnsi="Times New Roman" w:cs="Times New Roman"/>
+                <w:i/>
+                <w:color w:val="0000FF"/>
+                <w:sz w:val="26"/>
+                <w:szCs w:val="26"/>
+              </w:rPr>
+              <w:t xml:space="preserve"> lịch hẹn Spa</w:t>
             </w:r>
           </w:p>
         </w:tc>
@@ -6804,7 +6865,31 @@
                 <w:sz w:val="26"/>
                 <w:szCs w:val="26"/>
               </w:rPr>
-              <w:t>Đổi giờ hoặc hủy lịch hẹn, hệ thống tự động giải phóng khung giờ đó.</w:t>
+              <w:t>Ghi nhận lịch hẹn, chọn dịch vụ và chỉ định thợ Spa phụ trách</w:t>
+            </w:r>
+            <w:r>
+              <w:rPr>
+                <w:rFonts w:ascii="Times New Roman" w:hAnsi="Times New Roman"/>
+                <w:b w:val="0"/>
+                <w:bCs w:val="0"/>
+                <w:i/>
+                <w:color w:val="0000FF"/>
+                <w:sz w:val="26"/>
+                <w:szCs w:val="26"/>
+              </w:rPr>
+              <w:t>,có thể đ</w:t>
+            </w:r>
+            <w:r>
+              <w:rPr>
+                <w:rFonts w:ascii="Times New Roman" w:hAnsi="Times New Roman"/>
+                <w:b w:val="0"/>
+                <w:bCs w:val="0"/>
+                <w:i/>
+                <w:color w:val="0000FF"/>
+                <w:sz w:val="26"/>
+                <w:szCs w:val="26"/>
+              </w:rPr>
+              <w:t>ổi giờ hoặc hủy lịch hẹn, hệ thống tự động giải phóng khung giờ đó.</w:t>
             </w:r>
           </w:p>
         </w:tc>
@@ -6831,7 +6916,7 @@
                 <w:sz w:val="26"/>
                 <w:szCs w:val="26"/>
               </w:rPr>
-              <w:t>3.2.4 Hủy / Thay đổi lịch hẹn</w:t>
+              <w:t>3.2.1, 3.2.2 Đặt lịch hẹn mới</w:t>
             </w:r>
           </w:p>
         </w:tc>
@@ -6925,7 +7010,17 @@
                 <w:sz w:val="26"/>
                 <w:szCs w:val="26"/>
               </w:rPr>
-              <w:t>Quản lý phiếu dịch vụ Spa</w:t>
+              <w:t>Quản lý phiếu dịch vụ</w:t>
+            </w:r>
+            <w:r>
+              <w:rPr>
+                <w:rFonts w:ascii="Times New Roman" w:hAnsi="Times New Roman" w:cs="Times New Roman"/>
+                <w:i/>
+                <w:color w:val="0000FF"/>
+                <w:sz w:val="26"/>
+                <w:szCs w:val="26"/>
+              </w:rPr>
+              <w:t>.</w:t>
             </w:r>
           </w:p>
         </w:tc>
@@ -7202,17 +7297,7 @@
                 <w:sz w:val="26"/>
                 <w:szCs w:val="26"/>
               </w:rPr>
-              <w:t>1</w:t>
-            </w:r>
-            <w:r>
-              <w:rPr>
-                <w:rFonts w:ascii="Times New Roman" w:hAnsi="Times New Roman" w:cs="Times New Roman"/>
-                <w:i/>
-                <w:color w:val="0000FF"/>
-                <w:sz w:val="26"/>
-                <w:szCs w:val="26"/>
-              </w:rPr>
-              <w:t>4</w:t>
+              <w:t>14</w:t>
             </w:r>
           </w:p>
         </w:tc>
@@ -7365,17 +7450,7 @@
                 <w:sz w:val="26"/>
                 <w:szCs w:val="26"/>
               </w:rPr>
-              <w:t>1</w:t>
-            </w:r>
-            <w:r>
-              <w:rPr>
-                <w:rFonts w:ascii="Times New Roman" w:hAnsi="Times New Roman" w:cs="Times New Roman"/>
-                <w:i/>
-                <w:color w:val="0000FF"/>
-                <w:sz w:val="26"/>
-                <w:szCs w:val="26"/>
-              </w:rPr>
-              <w:t>5</w:t>
+              <w:t>15</w:t>
             </w:r>
           </w:p>
         </w:tc>
@@ -7538,17 +7613,7 @@
                 <w:sz w:val="26"/>
                 <w:szCs w:val="26"/>
               </w:rPr>
-              <w:t>1</w:t>
-            </w:r>
-            <w:r>
-              <w:rPr>
-                <w:rFonts w:ascii="Times New Roman" w:hAnsi="Times New Roman" w:cs="Times New Roman"/>
-                <w:i/>
-                <w:color w:val="0000FF"/>
-                <w:sz w:val="26"/>
-                <w:szCs w:val="26"/>
-              </w:rPr>
-              <w:t>6</w:t>
+              <w:t>16</w:t>
             </w:r>
           </w:p>
         </w:tc>
@@ -7575,7 +7640,17 @@
                 <w:sz w:val="26"/>
                 <w:szCs w:val="26"/>
               </w:rPr>
-              <w:t>Xem Báo cáo &amp; Thống kê</w:t>
+              <w:t xml:space="preserve">Xem </w:t>
+            </w:r>
+            <w:r>
+              <w:rPr>
+                <w:rFonts w:ascii="Times New Roman" w:hAnsi="Times New Roman" w:cs="Times New Roman"/>
+                <w:i/>
+                <w:color w:val="0000FF"/>
+                <w:sz w:val="26"/>
+                <w:szCs w:val="26"/>
+              </w:rPr>
+              <w:t>Báo cáo</w:t>
             </w:r>
           </w:p>
         </w:tc>
@@ -7691,17 +7766,7 @@
                 <w:sz w:val="26"/>
                 <w:szCs w:val="26"/>
               </w:rPr>
-              <w:t>1</w:t>
-            </w:r>
-            <w:r>
-              <w:rPr>
-                <w:rFonts w:ascii="Times New Roman" w:hAnsi="Times New Roman" w:cs="Times New Roman"/>
-                <w:i/>
-                <w:color w:val="0000FF"/>
-                <w:sz w:val="26"/>
-                <w:szCs w:val="26"/>
-              </w:rPr>
-              <w:t>7</w:t>
+              <w:t>17</w:t>
             </w:r>
           </w:p>
         </w:tc>
@@ -7728,7 +7793,7 @@
                 <w:sz w:val="26"/>
                 <w:szCs w:val="26"/>
               </w:rPr>
-              <w:t>In</w:t>
+              <w:t>Lập</w:t>
             </w:r>
             <w:r>
               <w:rPr>
@@ -11388,6 +11453,7 @@
   <w:style w:type="character" w:default="1" w:styleId="DefaultParagraphFont">
     <w:name w:val="Default Paragraph Font"/>
     <w:uiPriority w:val="1"/>
+    <w:semiHidden/>
     <w:unhideWhenUsed/>
   </w:style>
   <w:style w:type="table" w:default="1" w:styleId="TableNormal">
@@ -11942,6 +12008,7 @@
     <w:rsid w:val="007D4F22"/>
     <w:rsid w:val="008179DC"/>
     <w:rsid w:val="00994E73"/>
+    <w:rsid w:val="009F6473"/>
     <w:rsid w:val="00AD256A"/>
     <w:rsid w:val="00B448D8"/>
     <w:rsid w:val="00B73467"/>
@@ -11950,6 +12017,7 @@
     <w:rsid w:val="00EA5BB7"/>
     <w:rsid w:val="00F06863"/>
     <w:rsid w:val="00F152FF"/>
+    <w:rsid w:val="00FE499A"/>
   </w:rsids>
   <m:mathPr>
     <m:mathFont m:val="Cambria Math"/>

</xml_diff>

<commit_message>
cap nhat domain uc016
</commit_message>
<xml_diff>
--- a/DOC/N15_3_ApplicationDevelopment_SRS.docx
+++ b/DOC/N15_3_ApplicationDevelopment_SRS.docx
@@ -22,7 +22,7 @@
       <w:sdtContent>
         <w:p>
           <w:pPr>
-            <w:pStyle w:val="NoSpacing"/>
+            <w:pStyle w:val="KhngDncch"/>
             <w:spacing w:after="120"/>
             <w:jc w:val="center"/>
             <w:rPr>
@@ -33,7 +33,7 @@
         </w:p>
         <w:p>
           <w:pPr>
-            <w:pStyle w:val="NoSpacing"/>
+            <w:pStyle w:val="KhngDncch"/>
             <w:spacing w:after="120"/>
             <w:jc w:val="center"/>
             <w:rPr>
@@ -43,7 +43,7 @@
         </w:p>
         <w:p>
           <w:pPr>
-            <w:pStyle w:val="NoSpacing"/>
+            <w:pStyle w:val="KhngDncch"/>
             <w:spacing w:after="120"/>
             <w:jc w:val="center"/>
             <w:rPr>
@@ -54,7 +54,7 @@
         </w:p>
         <w:p>
           <w:pPr>
-            <w:pStyle w:val="NoSpacing"/>
+            <w:pStyle w:val="KhngDncch"/>
             <w:spacing w:after="120"/>
             <w:jc w:val="center"/>
             <w:rPr>
@@ -65,7 +65,7 @@
         </w:p>
         <w:p>
           <w:pPr>
-            <w:pStyle w:val="NoSpacing"/>
+            <w:pStyle w:val="KhngDncch"/>
             <w:spacing w:after="120"/>
             <w:jc w:val="center"/>
             <w:rPr>
@@ -76,7 +76,7 @@
         </w:p>
         <w:p>
           <w:pPr>
-            <w:pStyle w:val="NoSpacing"/>
+            <w:pStyle w:val="KhngDncch"/>
             <w:spacing w:after="120"/>
             <w:jc w:val="center"/>
             <w:rPr>
@@ -87,7 +87,7 @@
         </w:p>
         <w:p>
           <w:pPr>
-            <w:pStyle w:val="NoSpacing"/>
+            <w:pStyle w:val="KhngDncch"/>
             <w:spacing w:after="120"/>
             <w:jc w:val="center"/>
             <w:rPr>
@@ -98,7 +98,7 @@
         </w:p>
         <w:p>
           <w:pPr>
-            <w:pStyle w:val="NoSpacing"/>
+            <w:pStyle w:val="KhngDncch"/>
             <w:spacing w:after="120"/>
             <w:jc w:val="center"/>
             <w:rPr>
@@ -179,7 +179,7 @@
         </w:p>
         <w:p>
           <w:pPr>
-            <w:pStyle w:val="NoSpacing"/>
+            <w:pStyle w:val="KhngDncch"/>
             <w:spacing w:after="120"/>
             <w:jc w:val="center"/>
             <w:rPr>
@@ -190,7 +190,7 @@
         </w:p>
         <w:p>
           <w:pPr>
-            <w:pStyle w:val="NoSpacing"/>
+            <w:pStyle w:val="KhngDncch"/>
             <w:spacing w:after="120"/>
             <w:jc w:val="center"/>
             <w:rPr>
@@ -201,7 +201,7 @@
         </w:p>
         <w:p>
           <w:pPr>
-            <w:pStyle w:val="NoSpacing"/>
+            <w:pStyle w:val="KhngDncch"/>
             <w:spacing w:after="120"/>
             <w:jc w:val="center"/>
             <w:rPr>
@@ -212,7 +212,7 @@
         </w:p>
         <w:p>
           <w:pPr>
-            <w:pStyle w:val="NoSpacing"/>
+            <w:pStyle w:val="KhngDncch"/>
             <w:spacing w:after="120"/>
             <w:jc w:val="center"/>
             <w:rPr>
@@ -243,7 +243,7 @@
           <w:sdtContent>
             <w:p>
               <w:pPr>
-                <w:pStyle w:val="NoSpacing"/>
+                <w:pStyle w:val="KhngDncch"/>
                 <w:pBdr>
                   <w:top w:val="single" w:sz="6" w:space="6" w:color="5B9BD5" w:themeColor="accent1"/>
                   <w:bottom w:val="single" w:sz="6" w:space="6" w:color="5B9BD5" w:themeColor="accent1"/>
@@ -337,7 +337,7 @@
           <w:sdtContent>
             <w:p>
               <w:pPr>
-                <w:pStyle w:val="NoSpacing"/>
+                <w:pStyle w:val="KhngDncch"/>
                 <w:spacing w:after="120"/>
                 <w:jc w:val="center"/>
                 <w:rPr>
@@ -360,7 +360,7 @@
         </w:sdt>
         <w:p>
           <w:pPr>
-            <w:pStyle w:val="NoSpacing"/>
+            <w:pStyle w:val="KhngDncch"/>
             <w:spacing w:after="120"/>
             <w:jc w:val="center"/>
             <w:rPr>
@@ -454,7 +454,7 @@
                                 <w:sdtContent>
                                   <w:p>
                                     <w:pPr>
-                                      <w:pStyle w:val="NoSpacing"/>
+                                      <w:pStyle w:val="KhngDncch"/>
                                       <w:spacing w:after="40"/>
                                       <w:jc w:val="center"/>
                                       <w:rPr>
@@ -490,7 +490,7 @@
                               </w:sdt>
                               <w:p>
                                 <w:pPr>
-                                  <w:pStyle w:val="NoSpacing"/>
+                                  <w:pStyle w:val="KhngDncch"/>
                                   <w:jc w:val="center"/>
                                   <w:rPr>
                                     <w:rFonts w:ascii="Times New Roman" w:hAnsi="Times New Roman" w:cs="Times New Roman"/>
@@ -527,7 +527,7 @@
                               </w:p>
                               <w:p>
                                 <w:pPr>
-                                  <w:pStyle w:val="NoSpacing"/>
+                                  <w:pStyle w:val="KhngDncch"/>
                                   <w:jc w:val="center"/>
                                   <w:rPr>
                                     <w:rFonts w:ascii="Times New Roman" w:hAnsi="Times New Roman" w:cs="Times New Roman"/>
@@ -611,7 +611,7 @@
                           <w:sdtContent>
                             <w:p>
                               <w:pPr>
-                                <w:pStyle w:val="NoSpacing"/>
+                                <w:pStyle w:val="KhngDncch"/>
                                 <w:spacing w:after="40"/>
                                 <w:jc w:val="center"/>
                                 <w:rPr>
@@ -647,7 +647,7 @@
                         </w:sdt>
                         <w:p>
                           <w:pPr>
-                            <w:pStyle w:val="NoSpacing"/>
+                            <w:pStyle w:val="KhngDncch"/>
                             <w:jc w:val="center"/>
                             <w:rPr>
                               <w:rFonts w:ascii="Times New Roman" w:hAnsi="Times New Roman" w:cs="Times New Roman"/>
@@ -684,7 +684,7 @@
                         </w:p>
                         <w:p>
                           <w:pPr>
-                            <w:pStyle w:val="NoSpacing"/>
+                            <w:pStyle w:val="KhngDncch"/>
                             <w:jc w:val="center"/>
                             <w:rPr>
                               <w:rFonts w:ascii="Times New Roman" w:hAnsi="Times New Roman" w:cs="Times New Roman"/>
@@ -760,7 +760,7 @@
       <w:sdtContent>
         <w:p>
           <w:pPr>
-            <w:pStyle w:val="TOCHeading"/>
+            <w:pStyle w:val="uMucluc"/>
             <w:spacing w:before="0" w:after="120" w:line="240" w:lineRule="auto"/>
             <w:jc w:val="center"/>
             <w:rPr>
@@ -789,7 +789,7 @@
         </w:p>
         <w:p>
           <w:pPr>
-            <w:pStyle w:val="TOC1"/>
+            <w:pStyle w:val="Mucluc1"/>
             <w:tabs>
               <w:tab w:val="left" w:pos="440"/>
               <w:tab w:val="right" w:leader="dot" w:pos="10245"/>
@@ -828,7 +828,7 @@
           <w:hyperlink w:anchor="_Toc83627354" w:history="1">
             <w:r>
               <w:rPr>
-                <w:rStyle w:val="Hyperlink"/>
+                <w:rStyle w:val="Siuktni"/>
                 <w:rFonts w:ascii="Times New Roman" w:hAnsi="Times New Roman"/>
                 <w:b/>
                 <w:noProof/>
@@ -846,7 +846,7 @@
             </w:r>
             <w:r>
               <w:rPr>
-                <w:rStyle w:val="Hyperlink"/>
+                <w:rStyle w:val="Siuktni"/>
                 <w:rFonts w:ascii="Times New Roman" w:hAnsi="Times New Roman"/>
                 <w:b/>
                 <w:noProof/>
@@ -905,7 +905,7 @@
         </w:p>
         <w:p>
           <w:pPr>
-            <w:pStyle w:val="TOC2"/>
+            <w:pStyle w:val="Mucluc2"/>
             <w:tabs>
               <w:tab w:val="left" w:pos="960"/>
               <w:tab w:val="right" w:leader="dot" w:pos="10245"/>
@@ -920,7 +920,7 @@
           <w:hyperlink w:anchor="_Toc83627355" w:history="1">
             <w:r>
               <w:rPr>
-                <w:rStyle w:val="Hyperlink"/>
+                <w:rStyle w:val="Siuktni"/>
                 <w:rFonts w:ascii="Times New Roman" w:hAnsi="Times New Roman"/>
                 <w:noProof/>
               </w:rPr>
@@ -937,7 +937,7 @@
             </w:r>
             <w:r>
               <w:rPr>
-                <w:rStyle w:val="Hyperlink"/>
+                <w:rStyle w:val="Siuktni"/>
                 <w:rFonts w:ascii="Times New Roman" w:hAnsi="Times New Roman"/>
                 <w:noProof/>
               </w:rPr>
@@ -995,7 +995,7 @@
         </w:p>
         <w:p>
           <w:pPr>
-            <w:pStyle w:val="TOC2"/>
+            <w:pStyle w:val="Mucluc2"/>
             <w:tabs>
               <w:tab w:val="left" w:pos="960"/>
               <w:tab w:val="right" w:leader="dot" w:pos="10245"/>
@@ -1010,7 +1010,7 @@
           <w:hyperlink w:anchor="_Toc83627356" w:history="1">
             <w:r>
               <w:rPr>
-                <w:rStyle w:val="Hyperlink"/>
+                <w:rStyle w:val="Siuktni"/>
                 <w:rFonts w:ascii="Times New Roman" w:hAnsi="Times New Roman"/>
                 <w:noProof/>
               </w:rPr>
@@ -1027,7 +1027,7 @@
             </w:r>
             <w:r>
               <w:rPr>
-                <w:rStyle w:val="Hyperlink"/>
+                <w:rStyle w:val="Siuktni"/>
                 <w:rFonts w:ascii="Times New Roman" w:hAnsi="Times New Roman"/>
                 <w:noProof/>
               </w:rPr>
@@ -1085,7 +1085,7 @@
         </w:p>
         <w:p>
           <w:pPr>
-            <w:pStyle w:val="TOC2"/>
+            <w:pStyle w:val="Mucluc2"/>
             <w:tabs>
               <w:tab w:val="left" w:pos="960"/>
               <w:tab w:val="right" w:leader="dot" w:pos="10245"/>
@@ -1100,7 +1100,7 @@
           <w:hyperlink w:anchor="_Toc83627357" w:history="1">
             <w:r>
               <w:rPr>
-                <w:rStyle w:val="Hyperlink"/>
+                <w:rStyle w:val="Siuktni"/>
                 <w:rFonts w:ascii="Times New Roman" w:hAnsi="Times New Roman"/>
                 <w:noProof/>
               </w:rPr>
@@ -1117,7 +1117,7 @@
             </w:r>
             <w:r>
               <w:rPr>
-                <w:rStyle w:val="Hyperlink"/>
+                <w:rStyle w:val="Siuktni"/>
                 <w:rFonts w:ascii="Times New Roman" w:hAnsi="Times New Roman"/>
                 <w:noProof/>
               </w:rPr>
@@ -1175,7 +1175,7 @@
         </w:p>
         <w:p>
           <w:pPr>
-            <w:pStyle w:val="TOC2"/>
+            <w:pStyle w:val="Mucluc2"/>
             <w:tabs>
               <w:tab w:val="left" w:pos="960"/>
               <w:tab w:val="right" w:leader="dot" w:pos="10245"/>
@@ -1190,7 +1190,7 @@
           <w:hyperlink w:anchor="_Toc83627358" w:history="1">
             <w:r>
               <w:rPr>
-                <w:rStyle w:val="Hyperlink"/>
+                <w:rStyle w:val="Siuktni"/>
                 <w:rFonts w:ascii="Times New Roman" w:hAnsi="Times New Roman"/>
                 <w:noProof/>
               </w:rPr>
@@ -1207,7 +1207,7 @@
             </w:r>
             <w:r>
               <w:rPr>
-                <w:rStyle w:val="Hyperlink"/>
+                <w:rStyle w:val="Siuktni"/>
                 <w:rFonts w:ascii="Times New Roman" w:hAnsi="Times New Roman"/>
                 <w:noProof/>
               </w:rPr>
@@ -1265,7 +1265,7 @@
         </w:p>
         <w:p>
           <w:pPr>
-            <w:pStyle w:val="TOC1"/>
+            <w:pStyle w:val="Mucluc1"/>
             <w:tabs>
               <w:tab w:val="left" w:pos="440"/>
               <w:tab w:val="right" w:leader="dot" w:pos="10245"/>
@@ -1280,7 +1280,7 @@
           <w:hyperlink w:anchor="_Toc83627359" w:history="1">
             <w:r>
               <w:rPr>
-                <w:rStyle w:val="Hyperlink"/>
+                <w:rStyle w:val="Siuktni"/>
                 <w:rFonts w:ascii="Times New Roman" w:hAnsi="Times New Roman"/>
                 <w:b/>
                 <w:noProof/>
@@ -1298,7 +1298,7 @@
             </w:r>
             <w:r>
               <w:rPr>
-                <w:rStyle w:val="Hyperlink"/>
+                <w:rStyle w:val="Siuktni"/>
                 <w:rFonts w:ascii="Times New Roman" w:hAnsi="Times New Roman"/>
                 <w:b/>
                 <w:noProof/>
@@ -1357,7 +1357,7 @@
         </w:p>
         <w:p>
           <w:pPr>
-            <w:pStyle w:val="TOC2"/>
+            <w:pStyle w:val="Mucluc2"/>
             <w:tabs>
               <w:tab w:val="left" w:pos="960"/>
               <w:tab w:val="right" w:leader="dot" w:pos="10245"/>
@@ -1372,7 +1372,7 @@
           <w:hyperlink w:anchor="_Toc83627360" w:history="1">
             <w:r>
               <w:rPr>
-                <w:rStyle w:val="Hyperlink"/>
+                <w:rStyle w:val="Siuktni"/>
                 <w:rFonts w:ascii="Times New Roman" w:hAnsi="Times New Roman"/>
                 <w:noProof/>
               </w:rPr>
@@ -1389,7 +1389,7 @@
             </w:r>
             <w:r>
               <w:rPr>
-                <w:rStyle w:val="Hyperlink"/>
+                <w:rStyle w:val="Siuktni"/>
                 <w:rFonts w:ascii="Times New Roman" w:hAnsi="Times New Roman"/>
                 <w:noProof/>
               </w:rPr>
@@ -1447,7 +1447,7 @@
         </w:p>
         <w:p>
           <w:pPr>
-            <w:pStyle w:val="TOC2"/>
+            <w:pStyle w:val="Mucluc2"/>
             <w:tabs>
               <w:tab w:val="left" w:pos="960"/>
               <w:tab w:val="right" w:leader="dot" w:pos="10245"/>
@@ -1462,7 +1462,7 @@
           <w:hyperlink w:anchor="_Toc83627361" w:history="1">
             <w:r>
               <w:rPr>
-                <w:rStyle w:val="Hyperlink"/>
+                <w:rStyle w:val="Siuktni"/>
                 <w:rFonts w:ascii="Times New Roman" w:hAnsi="Times New Roman"/>
                 <w:noProof/>
               </w:rPr>
@@ -1479,7 +1479,7 @@
             </w:r>
             <w:r>
               <w:rPr>
-                <w:rStyle w:val="Hyperlink"/>
+                <w:rStyle w:val="Siuktni"/>
                 <w:rFonts w:ascii="Times New Roman" w:hAnsi="Times New Roman"/>
                 <w:noProof/>
               </w:rPr>
@@ -1537,7 +1537,7 @@
         </w:p>
         <w:p>
           <w:pPr>
-            <w:pStyle w:val="TOC2"/>
+            <w:pStyle w:val="Mucluc2"/>
             <w:tabs>
               <w:tab w:val="left" w:pos="960"/>
               <w:tab w:val="right" w:leader="dot" w:pos="10245"/>
@@ -1552,7 +1552,7 @@
           <w:hyperlink w:anchor="_Toc83627362" w:history="1">
             <w:r>
               <w:rPr>
-                <w:rStyle w:val="Hyperlink"/>
+                <w:rStyle w:val="Siuktni"/>
                 <w:rFonts w:ascii="Times New Roman" w:hAnsi="Times New Roman"/>
                 <w:noProof/>
               </w:rPr>
@@ -1569,7 +1569,7 @@
             </w:r>
             <w:r>
               <w:rPr>
-                <w:rStyle w:val="Hyperlink"/>
+                <w:rStyle w:val="Siuktni"/>
                 <w:rFonts w:ascii="Times New Roman" w:hAnsi="Times New Roman"/>
                 <w:noProof/>
               </w:rPr>
@@ -1627,7 +1627,7 @@
         </w:p>
         <w:p>
           <w:pPr>
-            <w:pStyle w:val="TOC2"/>
+            <w:pStyle w:val="Mucluc2"/>
             <w:tabs>
               <w:tab w:val="left" w:pos="960"/>
               <w:tab w:val="right" w:leader="dot" w:pos="10245"/>
@@ -1642,7 +1642,7 @@
           <w:hyperlink w:anchor="_Toc83627363" w:history="1">
             <w:r>
               <w:rPr>
-                <w:rStyle w:val="Hyperlink"/>
+                <w:rStyle w:val="Siuktni"/>
                 <w:rFonts w:ascii="Times New Roman" w:hAnsi="Times New Roman"/>
                 <w:noProof/>
               </w:rPr>
@@ -1659,7 +1659,7 @@
             </w:r>
             <w:r>
               <w:rPr>
-                <w:rStyle w:val="Hyperlink"/>
+                <w:rStyle w:val="Siuktni"/>
                 <w:rFonts w:ascii="Times New Roman" w:hAnsi="Times New Roman"/>
                 <w:noProof/>
               </w:rPr>
@@ -1717,7 +1717,7 @@
         </w:p>
         <w:p>
           <w:pPr>
-            <w:pStyle w:val="TOC1"/>
+            <w:pStyle w:val="Mucluc1"/>
             <w:tabs>
               <w:tab w:val="left" w:pos="440"/>
               <w:tab w:val="right" w:leader="dot" w:pos="10245"/>
@@ -1732,7 +1732,7 @@
           <w:hyperlink w:anchor="_Toc83627364" w:history="1">
             <w:r>
               <w:rPr>
-                <w:rStyle w:val="Hyperlink"/>
+                <w:rStyle w:val="Siuktni"/>
                 <w:rFonts w:ascii="Times New Roman" w:hAnsi="Times New Roman"/>
                 <w:b/>
                 <w:noProof/>
@@ -1750,7 +1750,7 @@
             </w:r>
             <w:r>
               <w:rPr>
-                <w:rStyle w:val="Hyperlink"/>
+                <w:rStyle w:val="Siuktni"/>
                 <w:rFonts w:ascii="Times New Roman" w:hAnsi="Times New Roman"/>
                 <w:b/>
                 <w:noProof/>
@@ -1809,7 +1809,7 @@
         </w:p>
         <w:p>
           <w:pPr>
-            <w:pStyle w:val="TOC2"/>
+            <w:pStyle w:val="Mucluc2"/>
             <w:tabs>
               <w:tab w:val="left" w:pos="960"/>
               <w:tab w:val="right" w:leader="dot" w:pos="10245"/>
@@ -1824,7 +1824,7 @@
           <w:hyperlink w:anchor="_Toc83627365" w:history="1">
             <w:r>
               <w:rPr>
-                <w:rStyle w:val="Hyperlink"/>
+                <w:rStyle w:val="Siuktni"/>
                 <w:rFonts w:ascii="Times New Roman" w:hAnsi="Times New Roman"/>
                 <w:noProof/>
               </w:rPr>
@@ -1841,7 +1841,7 @@
             </w:r>
             <w:r>
               <w:rPr>
-                <w:rStyle w:val="Hyperlink"/>
+                <w:rStyle w:val="Siuktni"/>
                 <w:rFonts w:ascii="Times New Roman" w:hAnsi="Times New Roman"/>
                 <w:noProof/>
               </w:rPr>
@@ -1899,7 +1899,7 @@
         </w:p>
         <w:p>
           <w:pPr>
-            <w:pStyle w:val="TOC3"/>
+            <w:pStyle w:val="Mucluc3"/>
             <w:tabs>
               <w:tab w:val="left" w:pos="1200"/>
               <w:tab w:val="right" w:leader="dot" w:pos="10245"/>
@@ -1914,7 +1914,7 @@
           <w:hyperlink w:anchor="_Toc83627366" w:history="1">
             <w:r>
               <w:rPr>
-                <w:rStyle w:val="Hyperlink"/>
+                <w:rStyle w:val="Siuktni"/>
                 <w:rFonts w:ascii="Times New Roman" w:hAnsi="Times New Roman"/>
                 <w:noProof/>
               </w:rPr>
@@ -1931,7 +1931,7 @@
             </w:r>
             <w:r>
               <w:rPr>
-                <w:rStyle w:val="Hyperlink"/>
+                <w:rStyle w:val="Siuktni"/>
                 <w:rFonts w:ascii="Times New Roman" w:hAnsi="Times New Roman"/>
                 <w:noProof/>
               </w:rPr>
@@ -1989,7 +1989,7 @@
         </w:p>
         <w:p>
           <w:pPr>
-            <w:pStyle w:val="TOC3"/>
+            <w:pStyle w:val="Mucluc3"/>
             <w:tabs>
               <w:tab w:val="left" w:pos="1200"/>
               <w:tab w:val="right" w:leader="dot" w:pos="10245"/>
@@ -2004,7 +2004,7 @@
           <w:hyperlink w:anchor="_Toc83627367" w:history="1">
             <w:r>
               <w:rPr>
-                <w:rStyle w:val="Hyperlink"/>
+                <w:rStyle w:val="Siuktni"/>
                 <w:rFonts w:ascii="Times New Roman" w:hAnsi="Times New Roman"/>
                 <w:noProof/>
               </w:rPr>
@@ -2021,7 +2021,7 @@
             </w:r>
             <w:r>
               <w:rPr>
-                <w:rStyle w:val="Hyperlink"/>
+                <w:rStyle w:val="Siuktni"/>
                 <w:rFonts w:ascii="Times New Roman" w:hAnsi="Times New Roman"/>
                 <w:noProof/>
               </w:rPr>
@@ -2079,7 +2079,7 @@
         </w:p>
         <w:p>
           <w:pPr>
-            <w:pStyle w:val="TOC2"/>
+            <w:pStyle w:val="Mucluc2"/>
             <w:tabs>
               <w:tab w:val="left" w:pos="960"/>
               <w:tab w:val="right" w:leader="dot" w:pos="10245"/>
@@ -2094,7 +2094,7 @@
           <w:hyperlink w:anchor="_Toc83627368" w:history="1">
             <w:r>
               <w:rPr>
-                <w:rStyle w:val="Hyperlink"/>
+                <w:rStyle w:val="Siuktni"/>
                 <w:rFonts w:ascii="Times New Roman" w:hAnsi="Times New Roman"/>
                 <w:noProof/>
               </w:rPr>
@@ -2111,7 +2111,7 @@
             </w:r>
             <w:r>
               <w:rPr>
-                <w:rStyle w:val="Hyperlink"/>
+                <w:rStyle w:val="Siuktni"/>
                 <w:rFonts w:ascii="Times New Roman" w:hAnsi="Times New Roman"/>
                 <w:noProof/>
               </w:rPr>
@@ -2169,7 +2169,7 @@
         </w:p>
         <w:p>
           <w:pPr>
-            <w:pStyle w:val="TOC3"/>
+            <w:pStyle w:val="Mucluc3"/>
             <w:tabs>
               <w:tab w:val="left" w:pos="1200"/>
               <w:tab w:val="right" w:leader="dot" w:pos="10245"/>
@@ -2184,7 +2184,7 @@
           <w:hyperlink w:anchor="_Toc83627369" w:history="1">
             <w:r>
               <w:rPr>
-                <w:rStyle w:val="Hyperlink"/>
+                <w:rStyle w:val="Siuktni"/>
                 <w:rFonts w:ascii="Times New Roman" w:hAnsi="Times New Roman"/>
                 <w:noProof/>
               </w:rPr>
@@ -2201,7 +2201,7 @@
             </w:r>
             <w:r>
               <w:rPr>
-                <w:rStyle w:val="Hyperlink"/>
+                <w:rStyle w:val="Siuktni"/>
                 <w:rFonts w:ascii="Times New Roman" w:hAnsi="Times New Roman"/>
                 <w:noProof/>
               </w:rPr>
@@ -2259,7 +2259,7 @@
         </w:p>
         <w:p>
           <w:pPr>
-            <w:pStyle w:val="TOC1"/>
+            <w:pStyle w:val="Mucluc1"/>
             <w:tabs>
               <w:tab w:val="left" w:pos="440"/>
               <w:tab w:val="right" w:leader="dot" w:pos="10245"/>
@@ -2274,7 +2274,7 @@
           <w:hyperlink w:anchor="_Toc83627370" w:history="1">
             <w:r>
               <w:rPr>
-                <w:rStyle w:val="Hyperlink"/>
+                <w:rStyle w:val="Siuktni"/>
                 <w:rFonts w:ascii="Times New Roman" w:hAnsi="Times New Roman"/>
                 <w:b/>
                 <w:noProof/>
@@ -2292,7 +2292,7 @@
             </w:r>
             <w:r>
               <w:rPr>
-                <w:rStyle w:val="Hyperlink"/>
+                <w:rStyle w:val="Siuktni"/>
                 <w:rFonts w:ascii="Times New Roman" w:hAnsi="Times New Roman"/>
                 <w:b/>
                 <w:noProof/>
@@ -2351,7 +2351,7 @@
         </w:p>
         <w:p>
           <w:pPr>
-            <w:pStyle w:val="TOC2"/>
+            <w:pStyle w:val="Mucluc2"/>
             <w:tabs>
               <w:tab w:val="left" w:pos="960"/>
               <w:tab w:val="right" w:leader="dot" w:pos="10245"/>
@@ -2366,7 +2366,7 @@
           <w:hyperlink w:anchor="_Toc83627371" w:history="1">
             <w:r>
               <w:rPr>
-                <w:rStyle w:val="Hyperlink"/>
+                <w:rStyle w:val="Siuktni"/>
                 <w:noProof/>
               </w:rPr>
               <w:t>4.1</w:t>
@@ -2382,7 +2382,7 @@
             </w:r>
             <w:r>
               <w:rPr>
-                <w:rStyle w:val="Hyperlink"/>
+                <w:rStyle w:val="Siuktni"/>
                 <w:noProof/>
               </w:rPr>
               <w:t>Biểu đồ lớp (Entity):</w:t>
@@ -2439,7 +2439,7 @@
         </w:p>
         <w:p>
           <w:pPr>
-            <w:pStyle w:val="TOC2"/>
+            <w:pStyle w:val="Mucluc2"/>
             <w:tabs>
               <w:tab w:val="left" w:pos="960"/>
               <w:tab w:val="right" w:leader="dot" w:pos="10245"/>
@@ -2454,7 +2454,7 @@
           <w:hyperlink w:anchor="_Toc83627372" w:history="1">
             <w:r>
               <w:rPr>
-                <w:rStyle w:val="Hyperlink"/>
+                <w:rStyle w:val="Siuktni"/>
                 <w:noProof/>
               </w:rPr>
               <w:t>4.2</w:t>
@@ -2470,7 +2470,7 @@
             </w:r>
             <w:r>
               <w:rPr>
-                <w:rStyle w:val="Hyperlink"/>
+                <w:rStyle w:val="Siuktni"/>
                 <w:noProof/>
               </w:rPr>
               <w:t>Biểu đồ lớp tổng quát:</w:t>
@@ -2570,7 +2570,7 @@
     </w:p>
     <w:p>
       <w:pPr>
-        <w:pStyle w:val="Heading1"/>
+        <w:pStyle w:val="u1"/>
         <w:spacing w:before="0" w:line="240" w:lineRule="auto"/>
         <w:ind w:left="480" w:hanging="480"/>
         <w:rPr>
@@ -2596,7 +2596,7 @@
     </w:p>
     <w:p>
       <w:pPr>
-        <w:pStyle w:val="Heading2"/>
+        <w:pStyle w:val="u2"/>
         <w:spacing w:before="0" w:line="240" w:lineRule="auto"/>
         <w:ind w:left="600" w:hanging="600"/>
         <w:rPr>
@@ -2780,7 +2780,7 @@
     </w:p>
     <w:p>
       <w:pPr>
-        <w:pStyle w:val="Heading2"/>
+        <w:pStyle w:val="u2"/>
         <w:spacing w:before="0" w:line="240" w:lineRule="auto"/>
         <w:ind w:left="600" w:hanging="600"/>
         <w:rPr>
@@ -3340,7 +3340,7 @@
     </w:p>
     <w:p>
       <w:pPr>
-        <w:pStyle w:val="Heading2"/>
+        <w:pStyle w:val="u2"/>
         <w:spacing w:before="0" w:line="240" w:lineRule="auto"/>
         <w:ind w:left="600" w:hanging="600"/>
         <w:rPr>
@@ -3375,7 +3375,7 @@
     </w:p>
     <w:tbl>
       <w:tblPr>
-        <w:tblStyle w:val="TableGrid"/>
+        <w:tblStyle w:val="LiBang"/>
         <w:tblW w:w="0" w:type="auto"/>
         <w:jc w:val="center"/>
         <w:tblLook w:val="01E0" w:firstRow="1" w:lastRow="1" w:firstColumn="1" w:lastColumn="1" w:noHBand="0" w:noVBand="0"/>
@@ -4072,7 +4072,7 @@
     </w:tbl>
     <w:p>
       <w:pPr>
-        <w:pStyle w:val="Heading2"/>
+        <w:pStyle w:val="u2"/>
         <w:numPr>
           <w:ilvl w:val="0"/>
           <w:numId w:val="0"/>
@@ -4089,7 +4089,7 @@
     </w:p>
     <w:p>
       <w:pPr>
-        <w:pStyle w:val="Heading2"/>
+        <w:pStyle w:val="u2"/>
         <w:spacing w:before="0" w:line="240" w:lineRule="auto"/>
         <w:ind w:left="600" w:hanging="600"/>
         <w:rPr>
@@ -4112,7 +4112,7 @@
     </w:p>
     <w:tbl>
       <w:tblPr>
-        <w:tblStyle w:val="TableGrid"/>
+        <w:tblStyle w:val="LiBang"/>
         <w:tblW w:w="0" w:type="auto"/>
         <w:jc w:val="center"/>
         <w:tblLook w:val="01E0" w:firstRow="1" w:lastRow="1" w:firstColumn="1" w:lastColumn="1" w:noHBand="0" w:noVBand="0"/>
@@ -4434,7 +4434,7 @@
     </w:p>
     <w:p>
       <w:pPr>
-        <w:pStyle w:val="Heading1"/>
+        <w:pStyle w:val="u1"/>
         <w:spacing w:before="0" w:line="240" w:lineRule="auto"/>
         <w:ind w:left="480" w:hanging="480"/>
         <w:rPr>
@@ -4478,7 +4478,7 @@
     </w:p>
     <w:p>
       <w:pPr>
-        <w:pStyle w:val="Heading2"/>
+        <w:pStyle w:val="u2"/>
         <w:spacing w:before="0" w:line="240" w:lineRule="auto"/>
         <w:ind w:left="600" w:hanging="600"/>
         <w:rPr>
@@ -4576,7 +4576,7 @@
     </w:p>
     <w:p>
       <w:pPr>
-        <w:pStyle w:val="Heading2"/>
+        <w:pStyle w:val="u2"/>
         <w:spacing w:before="0" w:line="240" w:lineRule="auto"/>
         <w:ind w:left="600" w:hanging="600"/>
         <w:rPr>
@@ -4623,7 +4623,7 @@
     </w:p>
     <w:tbl>
       <w:tblPr>
-        <w:tblStyle w:val="TableGrid"/>
+        <w:tblStyle w:val="LiBang"/>
         <w:tblW w:w="5000" w:type="pct"/>
         <w:jc w:val="center"/>
         <w:tblLook w:val="01E0" w:firstRow="1" w:lastRow="1" w:firstColumn="1" w:lastColumn="1" w:noHBand="0" w:noVBand="0"/>
@@ -5073,7 +5073,7 @@
     </w:p>
     <w:p>
       <w:pPr>
-        <w:pStyle w:val="Heading2"/>
+        <w:pStyle w:val="u2"/>
         <w:spacing w:before="0" w:line="240" w:lineRule="auto"/>
         <w:ind w:left="600" w:hanging="600"/>
         <w:rPr>
@@ -5130,7 +5130,7 @@
     </w:p>
     <w:tbl>
       <w:tblPr>
-        <w:tblStyle w:val="TableGrid"/>
+        <w:tblStyle w:val="LiBang"/>
         <w:tblW w:w="5000" w:type="pct"/>
         <w:jc w:val="center"/>
         <w:tblLook w:val="01E0" w:firstRow="1" w:lastRow="1" w:firstColumn="1" w:lastColumn="1" w:noHBand="0" w:noVBand="0"/>
@@ -7921,7 +7921,7 @@
     </w:p>
     <w:p>
       <w:pPr>
-        <w:pStyle w:val="Heading2"/>
+        <w:pStyle w:val="u2"/>
         <w:spacing w:before="0" w:line="240" w:lineRule="auto"/>
         <w:ind w:left="600" w:hanging="600"/>
         <w:rPr>
@@ -7983,7 +7983,7 @@
     </w:p>
     <w:p>
       <w:pPr>
-        <w:pStyle w:val="Heading1"/>
+        <w:pStyle w:val="u1"/>
         <w:spacing w:before="0" w:line="240" w:lineRule="auto"/>
         <w:ind w:left="480" w:hanging="480"/>
         <w:rPr>
@@ -8028,7 +8028,7 @@
     </w:p>
     <w:p>
       <w:pPr>
-        <w:pStyle w:val="Heading2"/>
+        <w:pStyle w:val="u2"/>
         <w:spacing w:before="0" w:line="240" w:lineRule="auto"/>
         <w:ind w:left="600" w:hanging="600"/>
         <w:rPr>
@@ -8060,7 +8060,7 @@
     </w:p>
     <w:p>
       <w:pPr>
-        <w:pStyle w:val="Heading3"/>
+        <w:pStyle w:val="u3"/>
         <w:spacing w:before="0" w:line="240" w:lineRule="auto"/>
         <w:rPr>
           <w:rFonts w:ascii="Times New Roman" w:hAnsi="Times New Roman"/>
@@ -8083,7 +8083,7 @@
     </w:p>
     <w:tbl>
       <w:tblPr>
-        <w:tblStyle w:val="TableGrid"/>
+        <w:tblStyle w:val="LiBang"/>
         <w:tblW w:w="5000" w:type="pct"/>
         <w:jc w:val="center"/>
         <w:tblLook w:val="01E0" w:firstRow="1" w:lastRow="1" w:firstColumn="1" w:lastColumn="1" w:noHBand="0" w:noVBand="0"/>
@@ -8568,7 +8568,7 @@
     </w:p>
     <w:p>
       <w:pPr>
-        <w:pStyle w:val="Heading3"/>
+        <w:pStyle w:val="u3"/>
         <w:spacing w:before="0" w:line="240" w:lineRule="auto"/>
         <w:rPr>
           <w:rFonts w:ascii="Times New Roman" w:hAnsi="Times New Roman"/>
@@ -8658,7 +8658,7 @@
     </w:p>
     <w:p>
       <w:pPr>
-        <w:pStyle w:val="Heading2"/>
+        <w:pStyle w:val="u2"/>
         <w:spacing w:before="0" w:line="240" w:lineRule="auto"/>
         <w:ind w:left="600" w:hanging="600"/>
         <w:rPr>
@@ -8690,7 +8690,7 @@
     </w:p>
     <w:p>
       <w:pPr>
-        <w:pStyle w:val="Heading3"/>
+        <w:pStyle w:val="u3"/>
         <w:spacing w:before="0" w:line="240" w:lineRule="auto"/>
         <w:rPr>
           <w:rFonts w:ascii="Times New Roman" w:hAnsi="Times New Roman"/>
@@ -8713,7 +8713,7 @@
     </w:p>
     <w:tbl>
       <w:tblPr>
-        <w:tblStyle w:val="TableGrid"/>
+        <w:tblStyle w:val="LiBang"/>
         <w:tblW w:w="5000" w:type="pct"/>
         <w:jc w:val="center"/>
         <w:tblLook w:val="01E0" w:firstRow="1" w:lastRow="1" w:firstColumn="1" w:lastColumn="1" w:noHBand="0" w:noVBand="0"/>
@@ -9199,13 +9199,1835 @@
     <w:p/>
     <w:p/>
     <w:p/>
+    <w:tbl>
+      <w:tblPr>
+        <w:tblStyle w:val="LiBang"/>
+        <w:tblW w:w="5000" w:type="pct"/>
+        <w:jc w:val="center"/>
+        <w:tblLook w:val="01E0" w:firstRow="1" w:lastRow="1" w:firstColumn="1" w:lastColumn="1" w:noHBand="0" w:noVBand="0"/>
+      </w:tblPr>
+      <w:tblGrid>
+        <w:gridCol w:w="2592"/>
+        <w:gridCol w:w="3825"/>
+        <w:gridCol w:w="3828"/>
+      </w:tblGrid>
+      <w:tr>
+        <w:trPr>
+          <w:jc w:val="center"/>
+        </w:trPr>
+        <w:tc>
+          <w:tcPr>
+            <w:tcW w:w="5000" w:type="pct"/>
+            <w:gridSpan w:val="3"/>
+          </w:tcPr>
+          <w:p>
+            <w:pPr>
+              <w:spacing w:after="120"/>
+              <w:rPr>
+                <w:rFonts w:ascii="Times New Roman" w:hAnsi="Times New Roman" w:cs="Times New Roman"/>
+                <w:b/>
+                <w:sz w:val="26"/>
+                <w:szCs w:val="26"/>
+              </w:rPr>
+            </w:pPr>
+            <w:bookmarkStart w:id="33" w:name="_Toc207611062"/>
+            <w:r>
+              <w:rPr>
+                <w:rFonts w:ascii="Times New Roman" w:hAnsi="Times New Roman" w:cs="Times New Roman"/>
+                <w:b/>
+                <w:sz w:val="26"/>
+                <w:szCs w:val="26"/>
+              </w:rPr>
+              <w:t xml:space="preserve">Use case: </w:t>
+            </w:r>
+            <w:r>
+              <w:rPr>
+                <w:rFonts w:ascii="Times New Roman" w:hAnsi="Times New Roman" w:cs="Times New Roman"/>
+                <w:i/>
+                <w:color w:val="0000FF"/>
+                <w:sz w:val="26"/>
+                <w:szCs w:val="26"/>
+              </w:rPr>
+              <w:t>UC016_xem báo cáo</w:t>
+            </w:r>
+          </w:p>
+        </w:tc>
+      </w:tr>
+      <w:tr>
+        <w:trPr>
+          <w:jc w:val="center"/>
+        </w:trPr>
+        <w:tc>
+          <w:tcPr>
+            <w:tcW w:w="1265" w:type="pct"/>
+          </w:tcPr>
+          <w:p>
+            <w:pPr>
+              <w:pStyle w:val="TableHeader"/>
+              <w:spacing w:before="0"/>
+              <w:rPr>
+                <w:rFonts w:ascii="Times New Roman" w:hAnsi="Times New Roman" w:cs="Times New Roman"/>
+                <w:b w:val="0"/>
+                <w:sz w:val="26"/>
+                <w:szCs w:val="26"/>
+              </w:rPr>
+            </w:pPr>
+            <w:r>
+              <w:rPr>
+                <w:rFonts w:ascii="Times New Roman" w:hAnsi="Times New Roman" w:cs="Times New Roman"/>
+                <w:b w:val="0"/>
+                <w:sz w:val="26"/>
+                <w:szCs w:val="26"/>
+              </w:rPr>
+              <w:t>Mục đích:</w:t>
+            </w:r>
+          </w:p>
+        </w:tc>
+        <w:tc>
+          <w:tcPr>
+            <w:tcW w:w="3735" w:type="pct"/>
+            <w:gridSpan w:val="2"/>
+          </w:tcPr>
+          <w:p>
+            <w:pPr>
+              <w:pStyle w:val="InfoBlue"/>
+              <w:spacing w:before="0" w:line="240" w:lineRule="auto"/>
+              <w:rPr>
+                <w:rFonts w:ascii="Times New Roman" w:hAnsi="Times New Roman"/>
+                <w:i w:val="0"/>
+                <w:iCs/>
+                <w:color w:val="auto"/>
+                <w:sz w:val="26"/>
+                <w:szCs w:val="26"/>
+              </w:rPr>
+            </w:pPr>
+            <w:r>
+              <w:rPr>
+                <w:rFonts w:ascii="Times New Roman" w:hAnsi="Times New Roman"/>
+                <w:i w:val="0"/>
+                <w:iCs/>
+                <w:color w:val="auto"/>
+                <w:sz w:val="26"/>
+                <w:szCs w:val="26"/>
+              </w:rPr>
+              <w:t>Cung cấp cho Nhân viên quản lý cái nhìn tổng quan và chi tiết về doanh thu, lợi nhuận tài chính, hiệu suất làm việc của đội ngũ thợ Spa, và bảng xếp hạng top sản phẩm bán chạy nhằm hỗ trợ việc ra quyết định kinh doanh và tối ưu vận hành cửa hàng.</w:t>
+            </w:r>
+          </w:p>
+        </w:tc>
+      </w:tr>
+      <w:tr>
+        <w:trPr>
+          <w:jc w:val="center"/>
+        </w:trPr>
+        <w:tc>
+          <w:tcPr>
+            <w:tcW w:w="1265" w:type="pct"/>
+          </w:tcPr>
+          <w:p>
+            <w:pPr>
+              <w:pStyle w:val="TableHeader"/>
+              <w:spacing w:before="0"/>
+              <w:rPr>
+                <w:rFonts w:ascii="Times New Roman" w:hAnsi="Times New Roman" w:cs="Times New Roman"/>
+                <w:b w:val="0"/>
+                <w:sz w:val="26"/>
+                <w:szCs w:val="26"/>
+              </w:rPr>
+            </w:pPr>
+            <w:r>
+              <w:rPr>
+                <w:rFonts w:ascii="Times New Roman" w:hAnsi="Times New Roman" w:cs="Times New Roman"/>
+                <w:b w:val="0"/>
+                <w:sz w:val="26"/>
+                <w:szCs w:val="26"/>
+              </w:rPr>
+              <w:t>Mô tả:</w:t>
+            </w:r>
+          </w:p>
+        </w:tc>
+        <w:tc>
+          <w:tcPr>
+            <w:tcW w:w="3735" w:type="pct"/>
+            <w:gridSpan w:val="2"/>
+          </w:tcPr>
+          <w:p>
+            <w:pPr>
+              <w:pStyle w:val="InfoBlue"/>
+              <w:spacing w:before="0" w:line="240" w:lineRule="auto"/>
+              <w:rPr>
+                <w:rFonts w:ascii="Times New Roman" w:hAnsi="Times New Roman"/>
+                <w:i w:val="0"/>
+                <w:iCs/>
+                <w:color w:val="auto"/>
+                <w:sz w:val="26"/>
+                <w:szCs w:val="26"/>
+              </w:rPr>
+            </w:pPr>
+            <w:r>
+              <w:rPr>
+                <w:rFonts w:ascii="Times New Roman" w:hAnsi="Times New Roman"/>
+                <w:i w:val="0"/>
+                <w:iCs/>
+                <w:color w:val="auto"/>
+                <w:sz w:val="26"/>
+                <w:szCs w:val="26"/>
+              </w:rPr>
+              <w:t>Chức năng cho phép Nhân viên quản lý xem các loại báo cáo thống kê theo các khoảng thời gian (ngày, tuần, tháng, năm hoặc tùy chọn), theo thợ Spa và theo nhóm danh mục sản phẩm/dịch vụ.</w:t>
+            </w:r>
+          </w:p>
+        </w:tc>
+      </w:tr>
+      <w:tr>
+        <w:trPr>
+          <w:jc w:val="center"/>
+        </w:trPr>
+        <w:tc>
+          <w:tcPr>
+            <w:tcW w:w="1265" w:type="pct"/>
+          </w:tcPr>
+          <w:p>
+            <w:pPr>
+              <w:pStyle w:val="TableHeader"/>
+              <w:spacing w:before="0"/>
+              <w:rPr>
+                <w:rFonts w:ascii="Times New Roman" w:hAnsi="Times New Roman" w:cs="Times New Roman"/>
+                <w:b w:val="0"/>
+                <w:sz w:val="26"/>
+                <w:szCs w:val="26"/>
+              </w:rPr>
+            </w:pPr>
+            <w:r>
+              <w:rPr>
+                <w:rFonts w:ascii="Times New Roman" w:hAnsi="Times New Roman" w:cs="Times New Roman"/>
+                <w:b w:val="0"/>
+                <w:sz w:val="26"/>
+                <w:szCs w:val="26"/>
+              </w:rPr>
+              <w:t>Tác nhân:</w:t>
+            </w:r>
+          </w:p>
+        </w:tc>
+        <w:tc>
+          <w:tcPr>
+            <w:tcW w:w="3735" w:type="pct"/>
+            <w:gridSpan w:val="2"/>
+          </w:tcPr>
+          <w:p>
+            <w:pPr>
+              <w:pStyle w:val="InfoBlue"/>
+              <w:spacing w:before="0" w:line="240" w:lineRule="auto"/>
+              <w:rPr>
+                <w:rFonts w:ascii="Times New Roman" w:hAnsi="Times New Roman"/>
+                <w:i w:val="0"/>
+                <w:iCs/>
+                <w:color w:val="auto"/>
+                <w:sz w:val="26"/>
+                <w:szCs w:val="26"/>
+              </w:rPr>
+            </w:pPr>
+            <w:r>
+              <w:rPr>
+                <w:rFonts w:ascii="Times New Roman" w:hAnsi="Times New Roman"/>
+                <w:i w:val="0"/>
+                <w:iCs/>
+                <w:color w:val="auto"/>
+                <w:sz w:val="26"/>
+                <w:szCs w:val="26"/>
+              </w:rPr>
+              <w:t>Nhân viên quản lý</w:t>
+            </w:r>
+          </w:p>
+        </w:tc>
+      </w:tr>
+      <w:tr>
+        <w:trPr>
+          <w:jc w:val="center"/>
+        </w:trPr>
+        <w:tc>
+          <w:tcPr>
+            <w:tcW w:w="1265" w:type="pct"/>
+          </w:tcPr>
+          <w:p>
+            <w:pPr>
+              <w:pStyle w:val="TableHeader"/>
+              <w:spacing w:before="0"/>
+              <w:rPr>
+                <w:rFonts w:ascii="Times New Roman" w:hAnsi="Times New Roman" w:cs="Times New Roman"/>
+                <w:b w:val="0"/>
+                <w:sz w:val="26"/>
+                <w:szCs w:val="26"/>
+              </w:rPr>
+            </w:pPr>
+            <w:r>
+              <w:rPr>
+                <w:rFonts w:ascii="Times New Roman" w:hAnsi="Times New Roman" w:cs="Times New Roman"/>
+                <w:b w:val="0"/>
+                <w:sz w:val="26"/>
+                <w:szCs w:val="26"/>
+              </w:rPr>
+              <w:t>Điều kiện trước:</w:t>
+            </w:r>
+          </w:p>
+        </w:tc>
+        <w:tc>
+          <w:tcPr>
+            <w:tcW w:w="3735" w:type="pct"/>
+            <w:gridSpan w:val="2"/>
+          </w:tcPr>
+          <w:p>
+            <w:pPr>
+              <w:pStyle w:val="InfoBlue"/>
+              <w:rPr>
+                <w:rFonts w:ascii="Times New Roman" w:hAnsi="Times New Roman"/>
+                <w:i w:val="0"/>
+                <w:iCs/>
+                <w:color w:val="auto"/>
+                <w:sz w:val="26"/>
+                <w:szCs w:val="26"/>
+              </w:rPr>
+            </w:pPr>
+            <w:r>
+              <w:rPr>
+                <w:rFonts w:ascii="Times New Roman" w:hAnsi="Times New Roman"/>
+                <w:i w:val="0"/>
+                <w:iCs/>
+                <w:color w:val="auto"/>
+                <w:sz w:val="26"/>
+                <w:szCs w:val="26"/>
+              </w:rPr>
+              <w:t xml:space="preserve">-Nhân viên quản lý đã đăng nhập thành công vào hệ thống bằng tài khoản được cấp quyền. </w:t>
+            </w:r>
+          </w:p>
+          <w:p>
+            <w:pPr>
+              <w:pStyle w:val="InfoBlue"/>
+              <w:rPr>
+                <w:rFonts w:ascii="Times New Roman" w:hAnsi="Times New Roman"/>
+                <w:i w:val="0"/>
+                <w:iCs/>
+                <w:color w:val="auto"/>
+                <w:sz w:val="26"/>
+                <w:szCs w:val="26"/>
+              </w:rPr>
+            </w:pPr>
+            <w:r>
+              <w:rPr>
+                <w:rFonts w:ascii="Times New Roman" w:hAnsi="Times New Roman"/>
+                <w:i w:val="0"/>
+                <w:iCs/>
+                <w:color w:val="auto"/>
+                <w:sz w:val="26"/>
+                <w:szCs w:val="26"/>
+              </w:rPr>
+              <w:t>-Nhân viên quản lý có vai trò và quyền hạn quản trị  để truy cập vào báo cáo và thống kê.</w:t>
+            </w:r>
+          </w:p>
+        </w:tc>
+      </w:tr>
+      <w:tr>
+        <w:trPr>
+          <w:jc w:val="center"/>
+        </w:trPr>
+        <w:tc>
+          <w:tcPr>
+            <w:tcW w:w="1265" w:type="pct"/>
+          </w:tcPr>
+          <w:p>
+            <w:pPr>
+              <w:pStyle w:val="TableHeader"/>
+              <w:spacing w:before="0"/>
+              <w:rPr>
+                <w:rFonts w:ascii="Times New Roman" w:hAnsi="Times New Roman" w:cs="Times New Roman"/>
+                <w:b w:val="0"/>
+                <w:sz w:val="26"/>
+                <w:szCs w:val="26"/>
+              </w:rPr>
+            </w:pPr>
+            <w:r>
+              <w:rPr>
+                <w:rFonts w:ascii="Times New Roman" w:hAnsi="Times New Roman" w:cs="Times New Roman"/>
+                <w:b w:val="0"/>
+                <w:sz w:val="26"/>
+                <w:szCs w:val="26"/>
+              </w:rPr>
+              <w:t>Điều kiện sau:</w:t>
+            </w:r>
+          </w:p>
+        </w:tc>
+        <w:tc>
+          <w:tcPr>
+            <w:tcW w:w="3735" w:type="pct"/>
+            <w:gridSpan w:val="2"/>
+          </w:tcPr>
+          <w:p>
+            <w:pPr>
+              <w:pStyle w:val="InfoBlue"/>
+              <w:spacing w:before="0" w:line="240" w:lineRule="auto"/>
+              <w:rPr>
+                <w:rFonts w:ascii="Times New Roman" w:hAnsi="Times New Roman"/>
+                <w:i w:val="0"/>
+                <w:iCs/>
+                <w:color w:val="auto"/>
+                <w:sz w:val="26"/>
+                <w:szCs w:val="26"/>
+              </w:rPr>
+            </w:pPr>
+            <w:r>
+              <w:rPr>
+                <w:rFonts w:ascii="Times New Roman" w:hAnsi="Times New Roman"/>
+                <w:i w:val="0"/>
+                <w:iCs/>
+                <w:color w:val="auto"/>
+                <w:sz w:val="26"/>
+                <w:szCs w:val="26"/>
+              </w:rPr>
+              <w:t>-Hệ thống truy xuất và hiển thị chính xác các biểu đồ trực quan, bảng số liệu thống kê chi tiết theo đúng các tiêu chí lọc do quản lý lựa chọn.</w:t>
+            </w:r>
+          </w:p>
+        </w:tc>
+      </w:tr>
+      <w:tr>
+        <w:trPr>
+          <w:jc w:val="center"/>
+        </w:trPr>
+        <w:tc>
+          <w:tcPr>
+            <w:tcW w:w="1265" w:type="pct"/>
+          </w:tcPr>
+          <w:p>
+            <w:pPr>
+              <w:pStyle w:val="TableHeader"/>
+              <w:spacing w:before="0"/>
+              <w:rPr>
+                <w:rFonts w:ascii="Times New Roman" w:hAnsi="Times New Roman" w:cs="Times New Roman"/>
+                <w:b w:val="0"/>
+                <w:sz w:val="26"/>
+                <w:szCs w:val="26"/>
+              </w:rPr>
+            </w:pPr>
+            <w:r>
+              <w:rPr>
+                <w:rFonts w:ascii="Times New Roman" w:hAnsi="Times New Roman" w:cs="Times New Roman"/>
+                <w:b w:val="0"/>
+                <w:sz w:val="26"/>
+                <w:szCs w:val="26"/>
+              </w:rPr>
+              <w:t>Luồng sự kiện chính (Basic flows)</w:t>
+            </w:r>
+          </w:p>
+        </w:tc>
+        <w:tc>
+          <w:tcPr>
+            <w:tcW w:w="1867" w:type="pct"/>
+          </w:tcPr>
+          <w:p>
+            <w:pPr>
+              <w:pStyle w:val="InfoBlue"/>
+              <w:spacing w:before="0" w:line="240" w:lineRule="auto"/>
+              <w:rPr>
+                <w:rFonts w:ascii="Times New Roman" w:hAnsi="Times New Roman"/>
+                <w:i w:val="0"/>
+                <w:iCs/>
+                <w:color w:val="auto"/>
+                <w:sz w:val="26"/>
+                <w:szCs w:val="26"/>
+              </w:rPr>
+            </w:pPr>
+            <w:r>
+              <w:rPr>
+                <w:rFonts w:ascii="Times New Roman" w:hAnsi="Times New Roman"/>
+                <w:i w:val="0"/>
+                <w:iCs/>
+                <w:color w:val="auto"/>
+                <w:sz w:val="26"/>
+                <w:szCs w:val="26"/>
+              </w:rPr>
+              <w:t>Nhân viên quản lý</w:t>
+            </w:r>
+          </w:p>
+          <w:p>
+            <w:pPr>
+              <w:pStyle w:val="InfoBlue"/>
+              <w:spacing w:before="0" w:line="240" w:lineRule="auto"/>
+              <w:rPr>
+                <w:rFonts w:ascii="Times New Roman" w:hAnsi="Times New Roman"/>
+                <w:i w:val="0"/>
+                <w:iCs/>
+                <w:color w:val="auto"/>
+                <w:sz w:val="26"/>
+                <w:szCs w:val="26"/>
+              </w:rPr>
+            </w:pPr>
+            <w:r>
+              <w:rPr>
+                <w:rFonts w:ascii="Times New Roman" w:hAnsi="Times New Roman"/>
+                <w:b/>
+                <w:bCs/>
+                <w:i w:val="0"/>
+                <w:iCs/>
+                <w:color w:val="auto"/>
+                <w:sz w:val="26"/>
+                <w:szCs w:val="26"/>
+              </w:rPr>
+              <w:t>1.</w:t>
+            </w:r>
+            <w:r>
+              <w:rPr>
+                <w:rFonts w:asciiTheme="minorHAnsi" w:eastAsiaTheme="minorHAnsi" w:hAnsiTheme="minorHAnsi" w:cstheme="minorBidi"/>
+                <w:i w:val="0"/>
+                <w:iCs/>
+                <w:color w:val="auto"/>
+                <w:sz w:val="22"/>
+                <w:szCs w:val="22"/>
+              </w:rPr>
+              <w:t xml:space="preserve"> </w:t>
+            </w:r>
+            <w:r>
+              <w:rPr>
+                <w:rFonts w:ascii="Times New Roman" w:hAnsi="Times New Roman"/>
+                <w:i w:val="0"/>
+                <w:iCs/>
+                <w:color w:val="auto"/>
+                <w:sz w:val="26"/>
+                <w:szCs w:val="26"/>
+              </w:rPr>
+              <w:t xml:space="preserve">Nhân viên quản lý chọn chức năng </w:t>
+            </w:r>
+            <w:r>
+              <w:rPr>
+                <w:rFonts w:ascii="Times New Roman" w:hAnsi="Times New Roman"/>
+                <w:b/>
+                <w:bCs/>
+                <w:i w:val="0"/>
+                <w:iCs/>
+                <w:color w:val="auto"/>
+                <w:sz w:val="26"/>
+                <w:szCs w:val="26"/>
+              </w:rPr>
+              <w:t>"báo cáo &amp; thống kê"</w:t>
+            </w:r>
+            <w:r>
+              <w:rPr>
+                <w:rFonts w:ascii="Times New Roman" w:hAnsi="Times New Roman"/>
+                <w:i w:val="0"/>
+                <w:iCs/>
+                <w:color w:val="auto"/>
+                <w:sz w:val="26"/>
+                <w:szCs w:val="26"/>
+              </w:rPr>
+              <w:t xml:space="preserve"> trên </w:t>
+            </w:r>
+            <w:r>
+              <w:rPr>
+                <w:rFonts w:ascii="Times New Roman" w:hAnsi="Times New Roman"/>
+                <w:i w:val="0"/>
+                <w:iCs/>
+                <w:color w:val="auto"/>
+                <w:sz w:val="26"/>
+                <w:szCs w:val="26"/>
+              </w:rPr>
+              <w:lastRenderedPageBreak/>
+              <w:t>thanh menu điều hướng chính của hệ thống.</w:t>
+            </w:r>
+          </w:p>
+          <w:p>
+            <w:pPr>
+              <w:pStyle w:val="InfoBlue"/>
+              <w:spacing w:before="0" w:line="240" w:lineRule="auto"/>
+              <w:rPr>
+                <w:rFonts w:ascii="Times New Roman" w:hAnsi="Times New Roman"/>
+                <w:i w:val="0"/>
+                <w:iCs/>
+                <w:color w:val="auto"/>
+                <w:sz w:val="26"/>
+                <w:szCs w:val="26"/>
+              </w:rPr>
+            </w:pPr>
+          </w:p>
+          <w:p>
+            <w:pPr>
+              <w:pStyle w:val="InfoBlue"/>
+              <w:spacing w:before="0" w:line="240" w:lineRule="auto"/>
+              <w:rPr>
+                <w:rFonts w:ascii="Times New Roman" w:hAnsi="Times New Roman"/>
+                <w:i w:val="0"/>
+                <w:iCs/>
+                <w:color w:val="auto"/>
+                <w:sz w:val="26"/>
+                <w:szCs w:val="26"/>
+              </w:rPr>
+            </w:pPr>
+          </w:p>
+          <w:p>
+            <w:pPr>
+              <w:pStyle w:val="InfoBlue"/>
+              <w:spacing w:before="0" w:line="240" w:lineRule="auto"/>
+              <w:rPr>
+                <w:rFonts w:ascii="Times New Roman" w:hAnsi="Times New Roman"/>
+                <w:i w:val="0"/>
+                <w:iCs/>
+                <w:color w:val="auto"/>
+                <w:sz w:val="26"/>
+                <w:szCs w:val="26"/>
+              </w:rPr>
+            </w:pPr>
+          </w:p>
+          <w:p>
+            <w:pPr>
+              <w:pStyle w:val="InfoBlue"/>
+              <w:spacing w:before="0" w:line="240" w:lineRule="auto"/>
+              <w:rPr>
+                <w:rFonts w:ascii="Times New Roman" w:hAnsi="Times New Roman"/>
+                <w:i w:val="0"/>
+                <w:iCs/>
+                <w:color w:val="auto"/>
+                <w:sz w:val="26"/>
+                <w:szCs w:val="26"/>
+              </w:rPr>
+            </w:pPr>
+          </w:p>
+          <w:p>
+            <w:pPr>
+              <w:pStyle w:val="InfoBlue"/>
+              <w:spacing w:before="0" w:line="240" w:lineRule="auto"/>
+              <w:rPr>
+                <w:rFonts w:ascii="Times New Roman" w:hAnsi="Times New Roman"/>
+                <w:i w:val="0"/>
+                <w:iCs/>
+                <w:color w:val="auto"/>
+                <w:sz w:val="26"/>
+                <w:szCs w:val="26"/>
+              </w:rPr>
+            </w:pPr>
+            <w:r>
+              <w:rPr>
+                <w:rFonts w:ascii="Times New Roman" w:hAnsi="Times New Roman"/>
+                <w:b/>
+                <w:bCs/>
+                <w:i w:val="0"/>
+                <w:iCs/>
+                <w:color w:val="auto"/>
+                <w:sz w:val="26"/>
+                <w:szCs w:val="26"/>
+              </w:rPr>
+              <w:t>3.</w:t>
+            </w:r>
+            <w:r>
+              <w:rPr>
+                <w:rFonts w:asciiTheme="minorHAnsi" w:eastAsiaTheme="minorHAnsi" w:hAnsiTheme="minorHAnsi" w:cstheme="minorBidi"/>
+                <w:i w:val="0"/>
+                <w:color w:val="auto"/>
+                <w:sz w:val="22"/>
+                <w:szCs w:val="22"/>
+              </w:rPr>
+              <w:t xml:space="preserve"> </w:t>
+            </w:r>
+            <w:r>
+              <w:rPr>
+                <w:rFonts w:ascii="Times New Roman" w:hAnsi="Times New Roman"/>
+                <w:i w:val="0"/>
+                <w:iCs/>
+                <w:color w:val="auto"/>
+                <w:sz w:val="26"/>
+                <w:szCs w:val="26"/>
+              </w:rPr>
+              <w:t>Nhân viên quản lý lựa chọn tab loại báo cáo cần xem</w:t>
+            </w:r>
+          </w:p>
+          <w:p>
+            <w:pPr>
+              <w:pStyle w:val="InfoBlue"/>
+              <w:spacing w:before="0" w:line="240" w:lineRule="auto"/>
+              <w:rPr>
+                <w:rFonts w:ascii="Times New Roman" w:hAnsi="Times New Roman"/>
+                <w:i w:val="0"/>
+                <w:iCs/>
+                <w:color w:val="auto"/>
+                <w:sz w:val="26"/>
+                <w:szCs w:val="26"/>
+              </w:rPr>
+            </w:pPr>
+            <w:r>
+              <w:rPr>
+                <w:rFonts w:ascii="Times New Roman" w:hAnsi="Times New Roman"/>
+                <w:b/>
+                <w:bCs/>
+                <w:i w:val="0"/>
+                <w:iCs/>
+                <w:color w:val="auto"/>
+                <w:sz w:val="26"/>
+                <w:szCs w:val="26"/>
+              </w:rPr>
+              <w:t>4.</w:t>
+            </w:r>
+            <w:r>
+              <w:rPr>
+                <w:rFonts w:asciiTheme="minorHAnsi" w:eastAsiaTheme="minorHAnsi" w:hAnsiTheme="minorHAnsi" w:cstheme="minorBidi"/>
+                <w:i w:val="0"/>
+                <w:color w:val="auto"/>
+                <w:sz w:val="22"/>
+                <w:szCs w:val="22"/>
+              </w:rPr>
+              <w:t xml:space="preserve"> </w:t>
+            </w:r>
+            <w:r>
+              <w:rPr>
+                <w:rFonts w:ascii="Times New Roman" w:hAnsi="Times New Roman"/>
+                <w:i w:val="0"/>
+                <w:iCs/>
+                <w:color w:val="auto"/>
+                <w:sz w:val="26"/>
+                <w:szCs w:val="26"/>
+              </w:rPr>
+              <w:t>Nhân viên quản lý thiết lập các tiêu chí lọc dữ liệu</w:t>
+            </w:r>
+            <w:r>
+              <w:rPr>
+                <w:rFonts w:ascii="Times New Roman" w:hAnsi="Times New Roman"/>
+                <w:i w:val="0"/>
+                <w:iCs/>
+                <w:color w:val="auto"/>
+                <w:sz w:val="26"/>
+                <w:szCs w:val="26"/>
+              </w:rPr>
+              <w:t>: khoảng thời gian, danh muc sản phẩm.</w:t>
+            </w:r>
+          </w:p>
+          <w:p>
+            <w:pPr>
+              <w:pStyle w:val="InfoBlue"/>
+              <w:spacing w:before="0" w:line="240" w:lineRule="auto"/>
+              <w:rPr>
+                <w:rFonts w:ascii="Times New Roman" w:hAnsi="Times New Roman"/>
+                <w:b/>
+                <w:bCs/>
+                <w:i w:val="0"/>
+                <w:iCs/>
+                <w:color w:val="auto"/>
+                <w:sz w:val="26"/>
+                <w:szCs w:val="26"/>
+              </w:rPr>
+            </w:pPr>
+            <w:r>
+              <w:rPr>
+                <w:rFonts w:ascii="Times New Roman" w:hAnsi="Times New Roman"/>
+                <w:b/>
+                <w:bCs/>
+                <w:i w:val="0"/>
+                <w:iCs/>
+                <w:color w:val="auto"/>
+                <w:sz w:val="26"/>
+                <w:szCs w:val="26"/>
+              </w:rPr>
+              <w:t>5.</w:t>
+            </w:r>
+            <w:r>
+              <w:rPr>
+                <w:rFonts w:asciiTheme="minorHAnsi" w:eastAsiaTheme="minorHAnsi" w:hAnsiTheme="minorHAnsi" w:cstheme="minorBidi"/>
+                <w:i w:val="0"/>
+                <w:color w:val="auto"/>
+                <w:sz w:val="22"/>
+                <w:szCs w:val="22"/>
+              </w:rPr>
+              <w:t xml:space="preserve"> </w:t>
+            </w:r>
+            <w:r>
+              <w:rPr>
+                <w:rFonts w:ascii="Times New Roman" w:hAnsi="Times New Roman"/>
+                <w:i w:val="0"/>
+                <w:iCs/>
+                <w:color w:val="auto"/>
+                <w:sz w:val="26"/>
+                <w:szCs w:val="26"/>
+              </w:rPr>
+              <w:t xml:space="preserve">Nhân viên quản lý nhấn nút </w:t>
+            </w:r>
+            <w:r>
+              <w:rPr>
+                <w:rFonts w:ascii="Times New Roman" w:hAnsi="Times New Roman"/>
+                <w:b/>
+                <w:bCs/>
+                <w:i w:val="0"/>
+                <w:iCs/>
+                <w:color w:val="auto"/>
+                <w:sz w:val="26"/>
+                <w:szCs w:val="26"/>
+              </w:rPr>
+              <w:t>"Xem báo cáo"</w:t>
+            </w:r>
+          </w:p>
+          <w:p>
+            <w:pPr>
+              <w:pStyle w:val="InfoBlue"/>
+              <w:spacing w:before="0" w:line="240" w:lineRule="auto"/>
+              <w:rPr>
+                <w:rFonts w:ascii="Times New Roman" w:hAnsi="Times New Roman"/>
+                <w:b/>
+                <w:bCs/>
+                <w:i w:val="0"/>
+                <w:iCs/>
+                <w:color w:val="auto"/>
+                <w:sz w:val="26"/>
+                <w:szCs w:val="26"/>
+              </w:rPr>
+            </w:pPr>
+          </w:p>
+          <w:p>
+            <w:pPr>
+              <w:pStyle w:val="InfoBlue"/>
+              <w:spacing w:before="0" w:line="240" w:lineRule="auto"/>
+              <w:rPr>
+                <w:rFonts w:ascii="Times New Roman" w:hAnsi="Times New Roman"/>
+                <w:b/>
+                <w:bCs/>
+                <w:i w:val="0"/>
+                <w:iCs/>
+                <w:color w:val="auto"/>
+                <w:sz w:val="26"/>
+                <w:szCs w:val="26"/>
+              </w:rPr>
+            </w:pPr>
+          </w:p>
+          <w:p>
+            <w:pPr>
+              <w:pStyle w:val="InfoBlue"/>
+              <w:spacing w:before="0" w:line="240" w:lineRule="auto"/>
+              <w:rPr>
+                <w:rFonts w:ascii="Times New Roman" w:hAnsi="Times New Roman"/>
+                <w:b/>
+                <w:bCs/>
+                <w:i w:val="0"/>
+                <w:iCs/>
+                <w:color w:val="auto"/>
+                <w:sz w:val="26"/>
+                <w:szCs w:val="26"/>
+              </w:rPr>
+            </w:pPr>
+          </w:p>
+          <w:p>
+            <w:pPr>
+              <w:pStyle w:val="InfoBlue"/>
+              <w:spacing w:before="0" w:line="240" w:lineRule="auto"/>
+              <w:rPr>
+                <w:rFonts w:ascii="Times New Roman" w:hAnsi="Times New Roman"/>
+                <w:b/>
+                <w:bCs/>
+                <w:i w:val="0"/>
+                <w:iCs/>
+                <w:color w:val="auto"/>
+                <w:sz w:val="26"/>
+                <w:szCs w:val="26"/>
+              </w:rPr>
+            </w:pPr>
+          </w:p>
+          <w:p>
+            <w:pPr>
+              <w:pStyle w:val="InfoBlue"/>
+              <w:spacing w:before="0" w:line="240" w:lineRule="auto"/>
+              <w:rPr>
+                <w:rFonts w:ascii="Times New Roman" w:hAnsi="Times New Roman"/>
+                <w:b/>
+                <w:bCs/>
+                <w:i w:val="0"/>
+                <w:iCs/>
+                <w:color w:val="auto"/>
+                <w:sz w:val="26"/>
+                <w:szCs w:val="26"/>
+              </w:rPr>
+            </w:pPr>
+          </w:p>
+          <w:p>
+            <w:pPr>
+              <w:pStyle w:val="InfoBlue"/>
+              <w:spacing w:before="0" w:line="240" w:lineRule="auto"/>
+              <w:rPr>
+                <w:rFonts w:ascii="Times New Roman" w:hAnsi="Times New Roman"/>
+                <w:b/>
+                <w:bCs/>
+                <w:i w:val="0"/>
+                <w:iCs/>
+                <w:color w:val="auto"/>
+                <w:sz w:val="26"/>
+                <w:szCs w:val="26"/>
+              </w:rPr>
+            </w:pPr>
+          </w:p>
+          <w:p>
+            <w:pPr>
+              <w:pStyle w:val="InfoBlue"/>
+              <w:spacing w:before="0" w:line="240" w:lineRule="auto"/>
+              <w:rPr>
+                <w:rFonts w:ascii="Times New Roman" w:hAnsi="Times New Roman"/>
+                <w:i w:val="0"/>
+                <w:iCs/>
+                <w:color w:val="auto"/>
+                <w:sz w:val="26"/>
+                <w:szCs w:val="26"/>
+              </w:rPr>
+            </w:pPr>
+            <w:r>
+              <w:rPr>
+                <w:rFonts w:ascii="Times New Roman" w:hAnsi="Times New Roman"/>
+                <w:b/>
+                <w:bCs/>
+                <w:i w:val="0"/>
+                <w:iCs/>
+                <w:color w:val="auto"/>
+                <w:sz w:val="26"/>
+                <w:szCs w:val="26"/>
+              </w:rPr>
+              <w:t>8.</w:t>
+            </w:r>
+            <w:r>
+              <w:rPr>
+                <w:rFonts w:asciiTheme="minorHAnsi" w:eastAsiaTheme="minorHAnsi" w:hAnsiTheme="minorHAnsi" w:cstheme="minorBidi"/>
+                <w:i w:val="0"/>
+                <w:color w:val="auto"/>
+                <w:sz w:val="22"/>
+                <w:szCs w:val="22"/>
+              </w:rPr>
+              <w:t xml:space="preserve"> </w:t>
+            </w:r>
+            <w:r>
+              <w:rPr>
+                <w:rFonts w:ascii="Times New Roman" w:hAnsi="Times New Roman"/>
+                <w:i w:val="0"/>
+                <w:iCs/>
+                <w:color w:val="auto"/>
+                <w:sz w:val="26"/>
+                <w:szCs w:val="26"/>
+              </w:rPr>
+              <w:t>Use case kết thúc thành công.</w:t>
+            </w:r>
+          </w:p>
+        </w:tc>
+        <w:tc>
+          <w:tcPr>
+            <w:tcW w:w="1868" w:type="pct"/>
+          </w:tcPr>
+          <w:p>
+            <w:pPr>
+              <w:pStyle w:val="InfoBlue"/>
+              <w:spacing w:before="0" w:line="240" w:lineRule="auto"/>
+              <w:rPr>
+                <w:rFonts w:ascii="Times New Roman" w:hAnsi="Times New Roman"/>
+                <w:i w:val="0"/>
+                <w:iCs/>
+                <w:color w:val="auto"/>
+                <w:sz w:val="26"/>
+                <w:szCs w:val="26"/>
+              </w:rPr>
+            </w:pPr>
+            <w:r>
+              <w:rPr>
+                <w:rFonts w:ascii="Times New Roman" w:hAnsi="Times New Roman"/>
+                <w:i w:val="0"/>
+                <w:iCs/>
+                <w:color w:val="auto"/>
+                <w:sz w:val="26"/>
+                <w:szCs w:val="26"/>
+              </w:rPr>
+              <w:lastRenderedPageBreak/>
+              <w:t>Hệ thống</w:t>
+            </w:r>
+          </w:p>
+          <w:p>
+            <w:pPr>
+              <w:pStyle w:val="InfoBlue"/>
+              <w:spacing w:before="0" w:line="240" w:lineRule="auto"/>
+              <w:rPr>
+                <w:rFonts w:ascii="Times New Roman" w:hAnsi="Times New Roman"/>
+                <w:i w:val="0"/>
+                <w:iCs/>
+                <w:color w:val="auto"/>
+                <w:sz w:val="26"/>
+                <w:szCs w:val="26"/>
+              </w:rPr>
+            </w:pPr>
+          </w:p>
+          <w:p>
+            <w:pPr>
+              <w:pStyle w:val="InfoBlue"/>
+              <w:spacing w:before="0" w:line="240" w:lineRule="auto"/>
+              <w:rPr>
+                <w:rFonts w:ascii="Times New Roman" w:hAnsi="Times New Roman"/>
+                <w:i w:val="0"/>
+                <w:iCs/>
+                <w:color w:val="auto"/>
+                <w:sz w:val="26"/>
+                <w:szCs w:val="26"/>
+              </w:rPr>
+            </w:pPr>
+          </w:p>
+          <w:p>
+            <w:pPr>
+              <w:pStyle w:val="InfoBlue"/>
+              <w:spacing w:before="0" w:line="240" w:lineRule="auto"/>
+              <w:rPr>
+                <w:rFonts w:ascii="Times New Roman" w:hAnsi="Times New Roman"/>
+                <w:i w:val="0"/>
+                <w:iCs/>
+                <w:color w:val="auto"/>
+                <w:sz w:val="26"/>
+                <w:szCs w:val="26"/>
+              </w:rPr>
+            </w:pPr>
+            <w:r>
+              <w:rPr>
+                <w:rFonts w:ascii="Times New Roman" w:hAnsi="Times New Roman"/>
+                <w:b/>
+                <w:bCs/>
+                <w:i w:val="0"/>
+                <w:iCs/>
+                <w:color w:val="auto"/>
+                <w:sz w:val="26"/>
+                <w:szCs w:val="26"/>
+              </w:rPr>
+              <w:lastRenderedPageBreak/>
+              <w:t>2.</w:t>
+            </w:r>
+            <w:r>
+              <w:rPr>
+                <w:rFonts w:ascii="Times New Roman" w:hAnsi="Times New Roman"/>
+                <w:i w:val="0"/>
+                <w:iCs/>
+                <w:color w:val="auto"/>
+                <w:sz w:val="24"/>
+              </w:rPr>
+              <w:t xml:space="preserve"> </w:t>
+            </w:r>
+            <w:r>
+              <w:rPr>
+                <w:rFonts w:ascii="Times New Roman" w:hAnsi="Times New Roman"/>
+                <w:i w:val="0"/>
+                <w:iCs/>
+                <w:color w:val="auto"/>
+                <w:sz w:val="26"/>
+                <w:szCs w:val="26"/>
+              </w:rPr>
+              <w:t xml:space="preserve">Hệ thống tải và hiển thị giao diện tổng quan phân hệ Báo cáo </w:t>
+            </w:r>
+            <w:r>
+              <w:rPr>
+                <w:rFonts w:ascii="Times New Roman" w:hAnsi="Times New Roman"/>
+                <w:i w:val="0"/>
+                <w:iCs/>
+                <w:color w:val="auto"/>
+                <w:sz w:val="26"/>
+                <w:szCs w:val="26"/>
+              </w:rPr>
+              <w:t>và</w:t>
+            </w:r>
+            <w:r>
+              <w:rPr>
+                <w:rFonts w:ascii="Times New Roman" w:hAnsi="Times New Roman"/>
+                <w:i w:val="0"/>
+                <w:iCs/>
+                <w:color w:val="auto"/>
+                <w:sz w:val="26"/>
+                <w:szCs w:val="26"/>
+              </w:rPr>
+              <w:t xml:space="preserve"> Thống kê bao gồm các tab chức năng chính:Báo cáo doanh thu và lợi nhuận, thống kê Doanh thu theo Kênh bán hàng, thống kê </w:t>
+            </w:r>
+            <w:r>
+              <w:rPr>
+                <w:rFonts w:ascii="Times New Roman" w:hAnsi="Times New Roman"/>
+                <w:i w:val="0"/>
+                <w:iCs/>
+                <w:color w:val="auto"/>
+                <w:sz w:val="26"/>
+                <w:szCs w:val="26"/>
+              </w:rPr>
+              <w:t>t</w:t>
+            </w:r>
+            <w:r>
+              <w:rPr>
+                <w:rFonts w:ascii="Times New Roman" w:hAnsi="Times New Roman"/>
+                <w:i w:val="0"/>
+                <w:iCs/>
+                <w:color w:val="auto"/>
+                <w:sz w:val="26"/>
+                <w:szCs w:val="26"/>
+              </w:rPr>
+              <w:t xml:space="preserve">op </w:t>
+            </w:r>
+            <w:r>
+              <w:rPr>
+                <w:rFonts w:ascii="Times New Roman" w:hAnsi="Times New Roman"/>
+                <w:i w:val="0"/>
+                <w:iCs/>
+                <w:color w:val="auto"/>
+                <w:sz w:val="26"/>
+                <w:szCs w:val="26"/>
+              </w:rPr>
+              <w:t>s</w:t>
+            </w:r>
+            <w:r>
+              <w:rPr>
+                <w:rFonts w:ascii="Times New Roman" w:hAnsi="Times New Roman"/>
+                <w:i w:val="0"/>
+                <w:iCs/>
+                <w:color w:val="auto"/>
+                <w:sz w:val="26"/>
+                <w:szCs w:val="26"/>
+              </w:rPr>
+              <w:t xml:space="preserve">ản phẩm </w:t>
+            </w:r>
+            <w:r>
+              <w:rPr>
+                <w:rFonts w:ascii="Times New Roman" w:hAnsi="Times New Roman"/>
+                <w:i w:val="0"/>
+                <w:iCs/>
+                <w:color w:val="auto"/>
+                <w:sz w:val="26"/>
+                <w:szCs w:val="26"/>
+              </w:rPr>
+              <w:t>b</w:t>
+            </w:r>
+            <w:r>
+              <w:rPr>
+                <w:rFonts w:ascii="Times New Roman" w:hAnsi="Times New Roman"/>
+                <w:i w:val="0"/>
+                <w:iCs/>
+                <w:color w:val="auto"/>
+                <w:sz w:val="26"/>
+                <w:szCs w:val="26"/>
+              </w:rPr>
+              <w:t xml:space="preserve">án chạy  </w:t>
+            </w:r>
+          </w:p>
+          <w:p>
+            <w:pPr>
+              <w:pStyle w:val="InfoBlue"/>
+              <w:spacing w:before="0" w:line="240" w:lineRule="auto"/>
+              <w:rPr>
+                <w:rFonts w:ascii="Times New Roman" w:hAnsi="Times New Roman"/>
+                <w:i w:val="0"/>
+                <w:iCs/>
+                <w:color w:val="auto"/>
+                <w:sz w:val="26"/>
+                <w:szCs w:val="26"/>
+              </w:rPr>
+            </w:pPr>
+          </w:p>
+          <w:p>
+            <w:pPr>
+              <w:pStyle w:val="InfoBlue"/>
+              <w:spacing w:before="0" w:line="240" w:lineRule="auto"/>
+              <w:rPr>
+                <w:rFonts w:ascii="Times New Roman" w:hAnsi="Times New Roman"/>
+                <w:i w:val="0"/>
+                <w:iCs/>
+                <w:color w:val="auto"/>
+                <w:sz w:val="26"/>
+                <w:szCs w:val="26"/>
+              </w:rPr>
+            </w:pPr>
+          </w:p>
+          <w:p>
+            <w:pPr>
+              <w:pStyle w:val="InfoBlue"/>
+              <w:spacing w:before="0" w:line="240" w:lineRule="auto"/>
+              <w:rPr>
+                <w:rFonts w:ascii="Times New Roman" w:hAnsi="Times New Roman"/>
+                <w:i w:val="0"/>
+                <w:iCs/>
+                <w:color w:val="auto"/>
+                <w:sz w:val="26"/>
+                <w:szCs w:val="26"/>
+              </w:rPr>
+            </w:pPr>
+          </w:p>
+          <w:p>
+            <w:pPr>
+              <w:pStyle w:val="InfoBlue"/>
+              <w:spacing w:before="0" w:line="240" w:lineRule="auto"/>
+              <w:rPr>
+                <w:rFonts w:ascii="Times New Roman" w:hAnsi="Times New Roman"/>
+                <w:i w:val="0"/>
+                <w:iCs/>
+                <w:color w:val="auto"/>
+                <w:sz w:val="26"/>
+                <w:szCs w:val="26"/>
+              </w:rPr>
+            </w:pPr>
+          </w:p>
+          <w:p>
+            <w:pPr>
+              <w:pStyle w:val="InfoBlue"/>
+              <w:spacing w:before="0" w:line="240" w:lineRule="auto"/>
+              <w:rPr>
+                <w:rFonts w:ascii="Times New Roman" w:hAnsi="Times New Roman"/>
+                <w:i w:val="0"/>
+                <w:iCs/>
+                <w:color w:val="auto"/>
+                <w:sz w:val="26"/>
+                <w:szCs w:val="26"/>
+              </w:rPr>
+            </w:pPr>
+          </w:p>
+          <w:p>
+            <w:pPr>
+              <w:pStyle w:val="InfoBlue"/>
+              <w:spacing w:before="0" w:line="240" w:lineRule="auto"/>
+              <w:rPr>
+                <w:rFonts w:ascii="Times New Roman" w:hAnsi="Times New Roman"/>
+                <w:i w:val="0"/>
+                <w:iCs/>
+                <w:color w:val="auto"/>
+                <w:sz w:val="26"/>
+                <w:szCs w:val="26"/>
+              </w:rPr>
+            </w:pPr>
+          </w:p>
+          <w:p>
+            <w:pPr>
+              <w:pStyle w:val="InfoBlue"/>
+              <w:spacing w:before="0" w:line="240" w:lineRule="auto"/>
+              <w:rPr>
+                <w:rFonts w:ascii="Times New Roman" w:hAnsi="Times New Roman"/>
+                <w:i w:val="0"/>
+                <w:iCs/>
+                <w:color w:val="auto"/>
+                <w:sz w:val="26"/>
+                <w:szCs w:val="26"/>
+              </w:rPr>
+            </w:pPr>
+            <w:r>
+              <w:rPr>
+                <w:rFonts w:ascii="Times New Roman" w:hAnsi="Times New Roman"/>
+                <w:b/>
+                <w:bCs/>
+                <w:i w:val="0"/>
+                <w:iCs/>
+                <w:color w:val="auto"/>
+                <w:sz w:val="26"/>
+                <w:szCs w:val="26"/>
+              </w:rPr>
+              <w:t>6.</w:t>
+            </w:r>
+            <w:r>
+              <w:rPr>
+                <w:rFonts w:asciiTheme="minorHAnsi" w:eastAsiaTheme="minorHAnsi" w:hAnsiTheme="minorHAnsi" w:cstheme="minorBidi"/>
+                <w:i w:val="0"/>
+                <w:color w:val="auto"/>
+                <w:sz w:val="22"/>
+                <w:szCs w:val="22"/>
+              </w:rPr>
+              <w:t xml:space="preserve"> </w:t>
+            </w:r>
+            <w:r>
+              <w:rPr>
+                <w:rFonts w:ascii="Times New Roman" w:hAnsi="Times New Roman"/>
+                <w:i w:val="0"/>
+                <w:iCs/>
+                <w:color w:val="auto"/>
+                <w:sz w:val="26"/>
+                <w:szCs w:val="26"/>
+              </w:rPr>
+              <w:t>Hệ thống kiểm tra tính hợp lệ của điều kiện lọc, thực hiện truy vấn cơ sở dữ liệu và tổng hợp các số liệu theo tiêu chí đã chọn</w:t>
+            </w:r>
+          </w:p>
+          <w:p>
+            <w:pPr>
+              <w:pStyle w:val="InfoBlue"/>
+              <w:spacing w:before="0" w:line="240" w:lineRule="auto"/>
+              <w:rPr>
+                <w:rFonts w:ascii="Times New Roman" w:hAnsi="Times New Roman"/>
+                <w:i w:val="0"/>
+                <w:iCs/>
+                <w:color w:val="auto"/>
+                <w:sz w:val="26"/>
+                <w:szCs w:val="26"/>
+              </w:rPr>
+            </w:pPr>
+            <w:r>
+              <w:rPr>
+                <w:rFonts w:ascii="Times New Roman" w:hAnsi="Times New Roman"/>
+                <w:b/>
+                <w:bCs/>
+                <w:i w:val="0"/>
+                <w:iCs/>
+                <w:color w:val="auto"/>
+                <w:sz w:val="26"/>
+                <w:szCs w:val="26"/>
+              </w:rPr>
+              <w:t>7.</w:t>
+            </w:r>
+            <w:r>
+              <w:rPr>
+                <w:rFonts w:asciiTheme="minorHAnsi" w:eastAsiaTheme="minorHAnsi" w:hAnsiTheme="minorHAnsi" w:cstheme="minorBidi"/>
+                <w:i w:val="0"/>
+                <w:color w:val="auto"/>
+                <w:sz w:val="22"/>
+                <w:szCs w:val="22"/>
+              </w:rPr>
+              <w:t xml:space="preserve"> </w:t>
+            </w:r>
+            <w:r>
+              <w:rPr>
+                <w:rFonts w:ascii="Times New Roman" w:hAnsi="Times New Roman"/>
+                <w:i w:val="0"/>
+                <w:iCs/>
+                <w:color w:val="auto"/>
+                <w:sz w:val="26"/>
+                <w:szCs w:val="26"/>
+              </w:rPr>
+              <w:t>Hệ thống hiển thị kết quả báo cáo trực quan dưới dạng biểu đồ kết hợp bảng dữ liệu chi tiết.</w:t>
+            </w:r>
+          </w:p>
+          <w:p>
+            <w:pPr>
+              <w:pStyle w:val="InfoBlue"/>
+              <w:spacing w:before="0" w:line="240" w:lineRule="auto"/>
+              <w:rPr>
+                <w:rFonts w:ascii="Times New Roman" w:hAnsi="Times New Roman"/>
+                <w:i w:val="0"/>
+                <w:iCs/>
+                <w:color w:val="auto"/>
+                <w:sz w:val="26"/>
+                <w:szCs w:val="26"/>
+              </w:rPr>
+            </w:pPr>
+          </w:p>
+        </w:tc>
+      </w:tr>
+      <w:tr>
+        <w:trPr>
+          <w:jc w:val="center"/>
+        </w:trPr>
+        <w:tc>
+          <w:tcPr>
+            <w:tcW w:w="1265" w:type="pct"/>
+          </w:tcPr>
+          <w:p>
+            <w:pPr>
+              <w:pStyle w:val="TableHeader"/>
+              <w:spacing w:before="0"/>
+              <w:rPr>
+                <w:rFonts w:ascii="Times New Roman" w:hAnsi="Times New Roman" w:cs="Times New Roman"/>
+                <w:b w:val="0"/>
+                <w:sz w:val="26"/>
+                <w:szCs w:val="26"/>
+              </w:rPr>
+            </w:pPr>
+            <w:r>
+              <w:rPr>
+                <w:rFonts w:ascii="Times New Roman" w:hAnsi="Times New Roman" w:cs="Times New Roman"/>
+                <w:b w:val="0"/>
+                <w:sz w:val="26"/>
+                <w:szCs w:val="26"/>
+              </w:rPr>
+              <w:lastRenderedPageBreak/>
+              <w:t>Luồng sự kiện phụ (Alternative Flows):</w:t>
+            </w:r>
+          </w:p>
+        </w:tc>
+        <w:tc>
+          <w:tcPr>
+            <w:tcW w:w="3735" w:type="pct"/>
+            <w:gridSpan w:val="2"/>
+          </w:tcPr>
+          <w:p>
+            <w:pPr>
+              <w:pStyle w:val="InfoBlue"/>
+              <w:rPr>
+                <w:rFonts w:ascii="Times New Roman" w:hAnsi="Times New Roman"/>
+                <w:b/>
+                <w:bCs/>
+                <w:i w:val="0"/>
+                <w:color w:val="auto"/>
+                <w:sz w:val="26"/>
+                <w:szCs w:val="26"/>
+              </w:rPr>
+            </w:pPr>
+            <w:r>
+              <w:rPr>
+                <w:rFonts w:ascii="Times New Roman" w:hAnsi="Times New Roman"/>
+                <w:b/>
+                <w:bCs/>
+                <w:i w:val="0"/>
+                <w:color w:val="auto"/>
+                <w:sz w:val="26"/>
+                <w:szCs w:val="26"/>
+              </w:rPr>
+              <w:t>A1: Chọn khoảng thời gian lọc không hợp lệ</w:t>
+            </w:r>
+          </w:p>
+          <w:p>
+            <w:pPr>
+              <w:pStyle w:val="InfoBlue"/>
+              <w:rPr>
+                <w:rFonts w:ascii="Times New Roman" w:hAnsi="Times New Roman"/>
+                <w:i w:val="0"/>
+                <w:color w:val="auto"/>
+                <w:sz w:val="26"/>
+                <w:szCs w:val="26"/>
+              </w:rPr>
+            </w:pPr>
+            <w:r>
+              <w:rPr>
+                <w:rFonts w:ascii="Times New Roman" w:hAnsi="Times New Roman"/>
+                <w:i w:val="0"/>
+                <w:color w:val="auto"/>
+                <w:sz w:val="26"/>
+                <w:szCs w:val="26"/>
+              </w:rPr>
+              <w:t xml:space="preserve">Điều kiện phát sinh: Tại bước 4, quản lý nhập/chọn ngày bắt đầu lớn hơn ngày kết thúc (ví dụ: Từ ngày 20/08/2026 đến ngày 10/08/2026). </w:t>
+            </w:r>
+          </w:p>
+          <w:p>
+            <w:pPr>
+              <w:pStyle w:val="InfoBlue"/>
+              <w:rPr>
+                <w:rFonts w:ascii="Times New Roman" w:hAnsi="Times New Roman"/>
+                <w:i w:val="0"/>
+                <w:color w:val="auto"/>
+                <w:sz w:val="26"/>
+                <w:szCs w:val="26"/>
+              </w:rPr>
+            </w:pPr>
+            <w:r>
+              <w:rPr>
+                <w:rFonts w:ascii="Times New Roman" w:hAnsi="Times New Roman"/>
+                <w:i w:val="0"/>
+                <w:color w:val="auto"/>
+                <w:sz w:val="26"/>
+                <w:szCs w:val="26"/>
+              </w:rPr>
+              <w:t>Xử lý:</w:t>
+            </w:r>
+          </w:p>
+          <w:p>
+            <w:pPr>
+              <w:pStyle w:val="InfoBlue"/>
+              <w:ind w:left="360"/>
+              <w:rPr>
+                <w:rFonts w:ascii="Times New Roman" w:hAnsi="Times New Roman"/>
+                <w:i w:val="0"/>
+                <w:color w:val="auto"/>
+                <w:sz w:val="26"/>
+                <w:szCs w:val="26"/>
+              </w:rPr>
+            </w:pPr>
+            <w:r>
+              <w:rPr>
+                <w:rFonts w:ascii="Times New Roman" w:hAnsi="Times New Roman"/>
+                <w:i w:val="0"/>
+                <w:color w:val="auto"/>
+                <w:sz w:val="26"/>
+                <w:szCs w:val="26"/>
+              </w:rPr>
+              <w:t>1.</w:t>
+            </w:r>
+            <w:r>
+              <w:rPr>
+                <w:rFonts w:ascii="Times New Roman" w:hAnsi="Times New Roman"/>
+                <w:i w:val="0"/>
+                <w:color w:val="auto"/>
+                <w:sz w:val="26"/>
+                <w:szCs w:val="26"/>
+              </w:rPr>
+              <w:t>Tại bước 6, hệ thống phát hiện khoảng thời gian không hợp lệ.</w:t>
+            </w:r>
+          </w:p>
+          <w:p>
+            <w:pPr>
+              <w:pStyle w:val="InfoBlue"/>
+              <w:ind w:left="360"/>
+              <w:rPr>
+                <w:rFonts w:ascii="Times New Roman" w:hAnsi="Times New Roman"/>
+                <w:i w:val="0"/>
+                <w:color w:val="auto"/>
+                <w:sz w:val="26"/>
+                <w:szCs w:val="26"/>
+              </w:rPr>
+            </w:pPr>
+            <w:r>
+              <w:rPr>
+                <w:rFonts w:ascii="Times New Roman" w:hAnsi="Times New Roman"/>
+                <w:i w:val="0"/>
+                <w:color w:val="auto"/>
+                <w:sz w:val="26"/>
+                <w:szCs w:val="26"/>
+              </w:rPr>
+              <w:t>2.</w:t>
+            </w:r>
+            <w:r>
+              <w:rPr>
+                <w:rFonts w:ascii="Times New Roman" w:hAnsi="Times New Roman"/>
+                <w:i w:val="0"/>
+                <w:color w:val="auto"/>
+                <w:sz w:val="26"/>
+                <w:szCs w:val="26"/>
+              </w:rPr>
+              <w:t>Hệ thống hiển thị thông báo lỗi: "Khoảng thời gian không hợp lệ! Ngày bắt đầu phải nhỏ hơn hoặc bằng ngày kết thúc."</w:t>
+            </w:r>
+          </w:p>
+          <w:p>
+            <w:pPr>
+              <w:pStyle w:val="InfoBlue"/>
+              <w:ind w:left="360"/>
+              <w:rPr>
+                <w:rFonts w:ascii="Times New Roman" w:hAnsi="Times New Roman"/>
+                <w:i w:val="0"/>
+                <w:color w:val="auto"/>
+                <w:sz w:val="26"/>
+                <w:szCs w:val="26"/>
+              </w:rPr>
+            </w:pPr>
+            <w:r>
+              <w:rPr>
+                <w:rFonts w:ascii="Times New Roman" w:hAnsi="Times New Roman"/>
+                <w:i w:val="0"/>
+                <w:color w:val="auto"/>
+                <w:sz w:val="26"/>
+                <w:szCs w:val="26"/>
+              </w:rPr>
+              <w:t>3.</w:t>
+            </w:r>
+            <w:r>
+              <w:rPr>
+                <w:rFonts w:ascii="Times New Roman" w:hAnsi="Times New Roman"/>
+                <w:i w:val="0"/>
+                <w:color w:val="auto"/>
+                <w:sz w:val="26"/>
+                <w:szCs w:val="26"/>
+              </w:rPr>
+              <w:t xml:space="preserve">Hệ thống giữ nguyên các tiêu chí lọc và quay lại bước 4 để người dùng chọn lại. </w:t>
+            </w:r>
+          </w:p>
+          <w:p>
+            <w:pPr>
+              <w:pStyle w:val="InfoBlue"/>
+              <w:rPr>
+                <w:rFonts w:ascii="Times New Roman" w:hAnsi="Times New Roman"/>
+                <w:b/>
+                <w:bCs/>
+                <w:i w:val="0"/>
+                <w:color w:val="auto"/>
+                <w:sz w:val="26"/>
+                <w:szCs w:val="26"/>
+              </w:rPr>
+            </w:pPr>
+            <w:r>
+              <w:rPr>
+                <w:rFonts w:ascii="Times New Roman" w:hAnsi="Times New Roman"/>
+                <w:b/>
+                <w:bCs/>
+                <w:i w:val="0"/>
+                <w:color w:val="auto"/>
+                <w:sz w:val="26"/>
+                <w:szCs w:val="26"/>
+              </w:rPr>
+              <w:t>A2: Không có dữ liệu báo cáo khớp với tiêu chí lọc</w:t>
+            </w:r>
+          </w:p>
+          <w:p>
+            <w:pPr>
+              <w:pStyle w:val="InfoBlue"/>
+              <w:rPr>
+                <w:rFonts w:ascii="Times New Roman" w:hAnsi="Times New Roman"/>
+                <w:i w:val="0"/>
+                <w:color w:val="auto"/>
+                <w:sz w:val="26"/>
+                <w:szCs w:val="26"/>
+              </w:rPr>
+            </w:pPr>
+            <w:r>
+              <w:rPr>
+                <w:rFonts w:ascii="Times New Roman" w:hAnsi="Times New Roman"/>
+                <w:i w:val="0"/>
+                <w:color w:val="auto"/>
+                <w:sz w:val="26"/>
+                <w:szCs w:val="26"/>
+              </w:rPr>
+              <w:t xml:space="preserve">Điều kiện phát sinh: Trong khoảng thời gian hoặc điều kiện bộ lọc được chọn không phát sinh bất kỳ hóa đơn hay giao dịch nào trong CSDL. </w:t>
+            </w:r>
+          </w:p>
+          <w:p>
+            <w:pPr>
+              <w:pStyle w:val="InfoBlue"/>
+              <w:rPr>
+                <w:rFonts w:ascii="Times New Roman" w:hAnsi="Times New Roman"/>
+                <w:i w:val="0"/>
+                <w:color w:val="auto"/>
+                <w:sz w:val="26"/>
+                <w:szCs w:val="26"/>
+              </w:rPr>
+            </w:pPr>
+            <w:r>
+              <w:rPr>
+                <w:rFonts w:ascii="Times New Roman" w:hAnsi="Times New Roman"/>
+                <w:i w:val="0"/>
+                <w:color w:val="auto"/>
+                <w:sz w:val="26"/>
+                <w:szCs w:val="26"/>
+              </w:rPr>
+              <w:t>Xử lý:</w:t>
+            </w:r>
+          </w:p>
+          <w:p>
+            <w:pPr>
+              <w:pStyle w:val="InfoBlue"/>
+              <w:ind w:left="360"/>
+              <w:rPr>
+                <w:rFonts w:ascii="Times New Roman" w:hAnsi="Times New Roman"/>
+                <w:i w:val="0"/>
+                <w:color w:val="auto"/>
+                <w:sz w:val="26"/>
+                <w:szCs w:val="26"/>
+              </w:rPr>
+            </w:pPr>
+            <w:r>
+              <w:rPr>
+                <w:rFonts w:ascii="Times New Roman" w:hAnsi="Times New Roman"/>
+                <w:i w:val="0"/>
+                <w:color w:val="auto"/>
+                <w:sz w:val="26"/>
+                <w:szCs w:val="26"/>
+              </w:rPr>
+              <w:t>1.</w:t>
+            </w:r>
+            <w:r>
+              <w:rPr>
+                <w:rFonts w:ascii="Times New Roman" w:hAnsi="Times New Roman"/>
+                <w:i w:val="0"/>
+                <w:color w:val="auto"/>
+                <w:sz w:val="26"/>
+                <w:szCs w:val="26"/>
+              </w:rPr>
+              <w:t>Tại bước 6, truy vấn CSDL trả về 0 kết quả.</w:t>
+            </w:r>
+          </w:p>
+          <w:p>
+            <w:pPr>
+              <w:pStyle w:val="InfoBlue"/>
+              <w:ind w:left="360"/>
+              <w:rPr>
+                <w:rFonts w:ascii="Times New Roman" w:hAnsi="Times New Roman"/>
+                <w:i w:val="0"/>
+                <w:color w:val="auto"/>
+                <w:sz w:val="26"/>
+                <w:szCs w:val="26"/>
+              </w:rPr>
+            </w:pPr>
+            <w:r>
+              <w:rPr>
+                <w:rFonts w:ascii="Times New Roman" w:hAnsi="Times New Roman"/>
+                <w:i w:val="0"/>
+                <w:color w:val="auto"/>
+                <w:sz w:val="26"/>
+                <w:szCs w:val="26"/>
+              </w:rPr>
+              <w:t>2.</w:t>
+            </w:r>
+            <w:r>
+              <w:rPr>
+                <w:rFonts w:ascii="Times New Roman" w:hAnsi="Times New Roman"/>
+                <w:i w:val="0"/>
+                <w:color w:val="auto"/>
+                <w:sz w:val="26"/>
+                <w:szCs w:val="26"/>
+              </w:rPr>
+              <w:t>Hệ thống hiển thị thông báo nhẹ: "Không tìm thấy dữ liệu báo cáo phù hợp với điều kiện lọc đã chọn."</w:t>
+            </w:r>
+          </w:p>
+          <w:p>
+            <w:pPr>
+              <w:pStyle w:val="InfoBlue"/>
+              <w:ind w:left="360"/>
+              <w:rPr>
+                <w:rFonts w:ascii="Times New Roman" w:hAnsi="Times New Roman"/>
+                <w:i w:val="0"/>
+                <w:color w:val="auto"/>
+                <w:sz w:val="26"/>
+                <w:szCs w:val="26"/>
+              </w:rPr>
+            </w:pPr>
+            <w:r>
+              <w:rPr>
+                <w:rFonts w:ascii="Times New Roman" w:hAnsi="Times New Roman"/>
+                <w:i w:val="0"/>
+                <w:color w:val="auto"/>
+                <w:sz w:val="26"/>
+                <w:szCs w:val="26"/>
+              </w:rPr>
+              <w:lastRenderedPageBreak/>
+              <w:t>3.</w:t>
+            </w:r>
+            <w:r>
+              <w:rPr>
+                <w:rFonts w:ascii="Times New Roman" w:hAnsi="Times New Roman"/>
+                <w:i w:val="0"/>
+                <w:color w:val="auto"/>
+                <w:sz w:val="26"/>
+                <w:szCs w:val="26"/>
+              </w:rPr>
+              <w:t xml:space="preserve">Bảng dữ liệu chi tiết hiển thị danh sách rỗng, các chỉ số tổng bằng 0 VNĐ, biểu đồ hiển thị trạng thái trống. </w:t>
+            </w:r>
+          </w:p>
+          <w:p>
+            <w:pPr>
+              <w:pStyle w:val="InfoBlue"/>
+              <w:ind w:left="360"/>
+              <w:rPr>
+                <w:rFonts w:ascii="Times New Roman" w:hAnsi="Times New Roman"/>
+                <w:i w:val="0"/>
+                <w:color w:val="auto"/>
+                <w:sz w:val="26"/>
+                <w:szCs w:val="26"/>
+              </w:rPr>
+            </w:pPr>
+            <w:r>
+              <w:rPr>
+                <w:rFonts w:ascii="Times New Roman" w:hAnsi="Times New Roman"/>
+                <w:i w:val="0"/>
+                <w:color w:val="auto"/>
+                <w:sz w:val="26"/>
+                <w:szCs w:val="26"/>
+              </w:rPr>
+              <w:t>4.</w:t>
+            </w:r>
+            <w:r>
+              <w:rPr>
+                <w:rFonts w:ascii="Times New Roman" w:hAnsi="Times New Roman"/>
+                <w:i w:val="0"/>
+                <w:color w:val="auto"/>
+                <w:sz w:val="26"/>
+                <w:szCs w:val="26"/>
+              </w:rPr>
+              <w:t xml:space="preserve">Người dùng có thể điều chỉnh lại bộ lọc và tiếp tục từ bước 4. </w:t>
+            </w:r>
+          </w:p>
+        </w:tc>
+      </w:tr>
+      <w:tr>
+        <w:trPr>
+          <w:jc w:val="center"/>
+        </w:trPr>
+        <w:tc>
+          <w:tcPr>
+            <w:tcW w:w="1265" w:type="pct"/>
+          </w:tcPr>
+          <w:p>
+            <w:pPr>
+              <w:pStyle w:val="TableHeader"/>
+              <w:spacing w:before="0"/>
+              <w:rPr>
+                <w:rFonts w:ascii="Times New Roman" w:hAnsi="Times New Roman" w:cs="Times New Roman"/>
+                <w:sz w:val="26"/>
+                <w:szCs w:val="26"/>
+              </w:rPr>
+            </w:pPr>
+          </w:p>
+        </w:tc>
+        <w:tc>
+          <w:tcPr>
+            <w:tcW w:w="3735" w:type="pct"/>
+            <w:gridSpan w:val="2"/>
+          </w:tcPr>
+          <w:p>
+            <w:pPr>
+              <w:pStyle w:val="InfoBlue"/>
+              <w:spacing w:before="0" w:line="240" w:lineRule="auto"/>
+              <w:rPr>
+                <w:rFonts w:ascii="Times New Roman" w:hAnsi="Times New Roman"/>
+                <w:sz w:val="26"/>
+                <w:szCs w:val="26"/>
+              </w:rPr>
+            </w:pPr>
+          </w:p>
+        </w:tc>
+      </w:tr>
+    </w:tbl>
     <w:p>
       <w:pPr>
-        <w:pStyle w:val="ListParagraph"/>
-        <w:numPr>
-          <w:ilvl w:val="0"/>
-          <w:numId w:val="19"/>
-        </w:numPr>
+        <w:spacing w:after="120" w:line="240" w:lineRule="auto"/>
+        <w:rPr>
+          <w:rFonts w:ascii="Times New Roman" w:hAnsi="Times New Roman" w:cs="Times New Roman"/>
+          <w:b/>
+          <w:sz w:val="26"/>
+          <w:szCs w:val="26"/>
+        </w:rPr>
+      </w:pPr>
+    </w:p>
+    <w:p>
+      <w:pPr>
+        <w:spacing w:after="120" w:line="240" w:lineRule="auto"/>
+        <w:rPr>
+          <w:rFonts w:ascii="Times New Roman" w:hAnsi="Times New Roman" w:cs="Times New Roman"/>
+          <w:b/>
+          <w:sz w:val="26"/>
+          <w:szCs w:val="26"/>
+        </w:rPr>
+      </w:pPr>
+      <w:r>
+        <w:rPr>
+          <w:rFonts w:ascii="Times New Roman" w:hAnsi="Times New Roman" w:cs="Times New Roman"/>
+          <w:b/>
+          <w:sz w:val="26"/>
+          <w:szCs w:val="26"/>
+        </w:rPr>
+        <w:t>Activity</w:t>
+      </w:r>
+    </w:p>
+    <w:p>
+      <w:pPr>
+        <w:spacing w:after="120" w:line="240" w:lineRule="auto"/>
+        <w:rPr>
+          <w:rFonts w:ascii="Times New Roman" w:hAnsi="Times New Roman" w:cs="Times New Roman"/>
+          <w:b/>
+          <w:sz w:val="26"/>
+          <w:szCs w:val="26"/>
+        </w:rPr>
+      </w:pPr>
+      <w:r>
+        <w:rPr>
+          <w:rFonts w:ascii="Times New Roman" w:hAnsi="Times New Roman" w:cs="Times New Roman"/>
+          <w:b/>
+          <w:sz w:val="26"/>
+          <w:szCs w:val="26"/>
+        </w:rPr>
+        <w:drawing>
+          <wp:inline distT="0" distB="0" distL="0" distR="0" wp14:anchorId="3BCFBCAF" wp14:editId="2B86681B">
+            <wp:extent cx="4401164" cy="7220958"/>
+            <wp:effectExtent l="0" t="0" r="0" b="0"/>
+            <wp:docPr id="1914011929" name="Hình ảnh 1"/>
+            <wp:cNvGraphicFramePr>
+              <a:graphicFrameLocks xmlns:a="http://schemas.openxmlformats.org/drawingml/2006/main" noChangeAspect="1"/>
+            </wp:cNvGraphicFramePr>
+            <a:graphic xmlns:a="http://schemas.openxmlformats.org/drawingml/2006/main">
+              <a:graphicData uri="http://schemas.openxmlformats.org/drawingml/2006/picture">
+                <pic:pic xmlns:pic="http://schemas.openxmlformats.org/drawingml/2006/picture">
+                  <pic:nvPicPr>
+                    <pic:cNvPr id="1914011929" name=""/>
+                    <pic:cNvPicPr/>
+                  </pic:nvPicPr>
+                  <pic:blipFill>
+                    <a:blip r:embed="rId11"/>
+                    <a:stretch>
+                      <a:fillRect/>
+                    </a:stretch>
+                  </pic:blipFill>
+                  <pic:spPr>
+                    <a:xfrm>
+                      <a:off x="0" y="0"/>
+                      <a:ext cx="4401164" cy="7220958"/>
+                    </a:xfrm>
+                    <a:prstGeom prst="rect">
+                      <a:avLst/>
+                    </a:prstGeom>
+                  </pic:spPr>
+                </pic:pic>
+              </a:graphicData>
+            </a:graphic>
+          </wp:inline>
+        </w:drawing>
+      </w:r>
+    </w:p>
+    <w:p>
+      <w:pPr>
         <w:spacing w:after="120" w:line="240" w:lineRule="auto"/>
         <w:rPr>
           <w:rFonts w:ascii="Times New Roman" w:eastAsia="Times New Roman" w:hAnsi="Times New Roman" w:cs="Times New Roman"/>
@@ -9214,7 +11036,68 @@
           <w:szCs w:val="26"/>
         </w:rPr>
       </w:pPr>
-      <w:bookmarkStart w:id="33" w:name="_Toc207611062"/>
+      <w:r>
+        <w:rPr>
+          <w:rFonts w:ascii="Times New Roman" w:hAnsi="Times New Roman" w:cs="Times New Roman"/>
+          <w:b/>
+          <w:sz w:val="26"/>
+          <w:szCs w:val="26"/>
+        </w:rPr>
+        <w:lastRenderedPageBreak/>
+        <w:t>Squence</w:t>
+      </w:r>
+      <w:r>
+        <w:rPr>
+          <w:rFonts w:ascii="Times New Roman" w:hAnsi="Times New Roman" w:cs="Times New Roman"/>
+          <w:b/>
+          <w:sz w:val="26"/>
+          <w:szCs w:val="26"/>
+        </w:rPr>
+        <w:br/>
+      </w:r>
+      <w:r>
+        <w:rPr>
+          <w:rFonts w:ascii="Times New Roman" w:hAnsi="Times New Roman" w:cs="Times New Roman"/>
+          <w:b/>
+          <w:sz w:val="26"/>
+          <w:szCs w:val="26"/>
+        </w:rPr>
+        <w:drawing>
+          <wp:inline distT="0" distB="0" distL="0" distR="0" wp14:anchorId="334D98E7" wp14:editId="547E78A5">
+            <wp:extent cx="6511925" cy="5123180"/>
+            <wp:effectExtent l="0" t="0" r="3175" b="1270"/>
+            <wp:docPr id="1415237614" name="Hình ảnh 1"/>
+            <wp:cNvGraphicFramePr>
+              <a:graphicFrameLocks xmlns:a="http://schemas.openxmlformats.org/drawingml/2006/main" noChangeAspect="1"/>
+            </wp:cNvGraphicFramePr>
+            <a:graphic xmlns:a="http://schemas.openxmlformats.org/drawingml/2006/main">
+              <a:graphicData uri="http://schemas.openxmlformats.org/drawingml/2006/picture">
+                <pic:pic xmlns:pic="http://schemas.openxmlformats.org/drawingml/2006/picture">
+                  <pic:nvPicPr>
+                    <pic:cNvPr id="1415237614" name=""/>
+                    <pic:cNvPicPr/>
+                  </pic:nvPicPr>
+                  <pic:blipFill>
+                    <a:blip r:embed="rId12"/>
+                    <a:stretch>
+                      <a:fillRect/>
+                    </a:stretch>
+                  </pic:blipFill>
+                  <pic:spPr>
+                    <a:xfrm>
+                      <a:off x="0" y="0"/>
+                      <a:ext cx="6511925" cy="5123180"/>
+                    </a:xfrm>
+                    <a:prstGeom prst="rect">
+                      <a:avLst/>
+                    </a:prstGeom>
+                  </pic:spPr>
+                </pic:pic>
+              </a:graphicData>
+            </a:graphic>
+          </wp:inline>
+        </w:drawing>
+      </w:r>
       <w:r>
         <w:rPr>
           <w:rFonts w:ascii="Times New Roman" w:hAnsi="Times New Roman" w:cs="Times New Roman"/>
@@ -9227,7 +11110,7 @@
     </w:p>
     <w:p>
       <w:pPr>
-        <w:pStyle w:val="Heading1"/>
+        <w:pStyle w:val="u1"/>
         <w:spacing w:before="0" w:line="240" w:lineRule="auto"/>
         <w:ind w:left="480" w:hanging="480"/>
         <w:rPr>
@@ -9262,7 +11145,7 @@
     </w:p>
     <w:p>
       <w:pPr>
-        <w:pStyle w:val="Heading2"/>
+        <w:pStyle w:val="u2"/>
         <w:rPr>
           <w:sz w:val="22"/>
           <w:szCs w:val="18"/>
@@ -9283,12 +11166,46 @@
         <w:ind w:left="720"/>
       </w:pPr>
       <w:r>
-        <w:t>Vẽ biểu đồ chỉ chứa các lớp thực thể</w:t>
+        <w:drawing>
+          <wp:inline distT="0" distB="0" distL="0" distR="0" wp14:anchorId="7CA6B66E" wp14:editId="29703344">
+            <wp:extent cx="6511925" cy="5031740"/>
+            <wp:effectExtent l="0" t="0" r="3175" b="0"/>
+            <wp:docPr id="2143511389" name="Hình ảnh 1"/>
+            <wp:cNvGraphicFramePr>
+              <a:graphicFrameLocks xmlns:a="http://schemas.openxmlformats.org/drawingml/2006/main" noChangeAspect="1"/>
+            </wp:cNvGraphicFramePr>
+            <a:graphic xmlns:a="http://schemas.openxmlformats.org/drawingml/2006/main">
+              <a:graphicData uri="http://schemas.openxmlformats.org/drawingml/2006/picture">
+                <pic:pic xmlns:pic="http://schemas.openxmlformats.org/drawingml/2006/picture">
+                  <pic:nvPicPr>
+                    <pic:cNvPr id="2143511389" name=""/>
+                    <pic:cNvPicPr/>
+                  </pic:nvPicPr>
+                  <pic:blipFill>
+                    <a:blip r:embed="rId13"/>
+                    <a:stretch>
+                      <a:fillRect/>
+                    </a:stretch>
+                  </pic:blipFill>
+                  <pic:spPr>
+                    <a:xfrm>
+                      <a:off x="0" y="0"/>
+                      <a:ext cx="6511925" cy="5031740"/>
+                    </a:xfrm>
+                    <a:prstGeom prst="rect">
+                      <a:avLst/>
+                    </a:prstGeom>
+                  </pic:spPr>
+                </pic:pic>
+              </a:graphicData>
+            </a:graphic>
+          </wp:inline>
+        </w:drawing>
       </w:r>
     </w:p>
     <w:p>
       <w:pPr>
-        <w:pStyle w:val="Heading2"/>
+        <w:pStyle w:val="u2"/>
         <w:rPr>
           <w:sz w:val="22"/>
           <w:szCs w:val="18"/>
@@ -9304,631 +11221,6 @@
       </w:r>
       <w:bookmarkEnd w:id="36"/>
     </w:p>
-    <w:p>
-      <w:r>
-        <w:t xml:space="preserve">Lớp Boundary (GUI) </w:t>
-      </w:r>
-      <w:r>
-        <w:sym w:font="Wingdings" w:char="F0E0"/>
-      </w:r>
-      <w:r>
-        <w:t xml:space="preserve"> Lớp Control </w:t>
-      </w:r>
-      <w:r>
-        <w:sym w:font="Wingdings" w:char="F0E0"/>
-      </w:r>
-      <w:r>
-        <w:t xml:space="preserve"> Lớp Entity</w:t>
-      </w:r>
-    </w:p>
-    <w:tbl>
-      <w:tblPr>
-        <w:tblStyle w:val="TableGrid"/>
-        <w:tblpPr w:leftFromText="180" w:rightFromText="180" w:vertAnchor="text" w:horzAnchor="page" w:tblpX="1956" w:tblpY="368"/>
-        <w:tblW w:w="0" w:type="auto"/>
-        <w:shd w:val="clear" w:color="auto" w:fill="FBE4D5" w:themeFill="accent2" w:themeFillTint="33"/>
-        <w:tblLook w:val="04A0" w:firstRow="1" w:lastRow="0" w:firstColumn="1" w:lastColumn="0" w:noHBand="0" w:noVBand="1"/>
-      </w:tblPr>
-      <w:tblGrid>
-        <w:gridCol w:w="1557"/>
-      </w:tblGrid>
-      <w:tr>
-        <w:tc>
-          <w:tcPr>
-            <w:tcW w:w="1557" w:type="dxa"/>
-            <w:shd w:val="clear" w:color="auto" w:fill="FBE4D5" w:themeFill="accent2" w:themeFillTint="33"/>
-          </w:tcPr>
-          <w:p>
-            <w:pPr>
-              <w:rPr>
-                <w:i/>
-                <w:iCs/>
-              </w:rPr>
-            </w:pPr>
-            <w:r>
-              <w:rPr>
-                <w:i/>
-                <w:iCs/>
-              </w:rPr>
-              <w:t>&lt;&lt;boundary&gt;&gt;</w:t>
-            </w:r>
-          </w:p>
-          <w:p>
-            <w:r>
-              <w:rPr>
-                <w:noProof/>
-              </w:rPr>
-              <mc:AlternateContent>
-                <mc:Choice Requires="wps">
-                  <w:drawing>
-                    <wp:anchor distT="0" distB="0" distL="114300" distR="114300" simplePos="0" relativeHeight="251662336" behindDoc="0" locked="0" layoutInCell="1" allowOverlap="1" wp14:anchorId="7DB77F3B" wp14:editId="46D9F348">
-                      <wp:simplePos x="0" y="0"/>
-                      <wp:positionH relativeFrom="column">
-                        <wp:posOffset>911405</wp:posOffset>
-                      </wp:positionH>
-                      <wp:positionV relativeFrom="paragraph">
-                        <wp:posOffset>132317</wp:posOffset>
-                      </wp:positionV>
-                      <wp:extent cx="757451" cy="348018"/>
-                      <wp:effectExtent l="0" t="0" r="17780" b="20320"/>
-                      <wp:wrapNone/>
-                      <wp:docPr id="2" name="Straight Connector 2"/>
-                      <wp:cNvGraphicFramePr/>
-                      <a:graphic xmlns:a="http://schemas.openxmlformats.org/drawingml/2006/main">
-                        <a:graphicData uri="http://schemas.microsoft.com/office/word/2010/wordprocessingShape">
-                          <wps:wsp>
-                            <wps:cNvCnPr/>
-                            <wps:spPr>
-                              <a:xfrm>
-                                <a:off x="0" y="0"/>
-                                <a:ext cx="757451" cy="348018"/>
-                              </a:xfrm>
-                              <a:prstGeom prst="line">
-                                <a:avLst/>
-                              </a:prstGeom>
-                            </wps:spPr>
-                            <wps:style>
-                              <a:lnRef idx="1">
-                                <a:schemeClr val="accent1"/>
-                              </a:lnRef>
-                              <a:fillRef idx="0">
-                                <a:schemeClr val="accent1"/>
-                              </a:fillRef>
-                              <a:effectRef idx="0">
-                                <a:schemeClr val="accent1"/>
-                              </a:effectRef>
-                              <a:fontRef idx="minor">
-                                <a:schemeClr val="tx1"/>
-                              </a:fontRef>
-                            </wps:style>
-                            <wps:bodyPr/>
-                          </wps:wsp>
-                        </a:graphicData>
-                      </a:graphic>
-                    </wp:anchor>
-                  </w:drawing>
-                </mc:Choice>
-                <mc:Fallback>
-                  <w:pict>
-                    <v:line w14:anchorId="20454FE2" id="Straight Connector 2" o:spid="_x0000_s1026" style="position:absolute;z-index:251662336;visibility:visible;mso-wrap-style:square;mso-wrap-distance-left:9pt;mso-wrap-distance-top:0;mso-wrap-distance-right:9pt;mso-wrap-distance-bottom:0;mso-position-horizontal:absolute;mso-position-horizontal-relative:text;mso-position-vertical:absolute;mso-position-vertical-relative:text" from="71.75pt,10.4pt" to="131.4pt,37.8pt" o:gfxdata="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" strokecolor="#5b9bd5 [3204]" strokeweight=".5pt">
-                      <v:stroke joinstyle="miter"/>
-                    </v:line>
-                  </w:pict>
-                </mc:Fallback>
-              </mc:AlternateContent>
-            </w:r>
-            <w:r>
-              <w:t>GUI_aaa</w:t>
-            </w:r>
-          </w:p>
-        </w:tc>
-      </w:tr>
-      <w:tr>
-        <w:tc>
-          <w:tcPr>
-            <w:tcW w:w="1557" w:type="dxa"/>
-            <w:shd w:val="clear" w:color="auto" w:fill="FBE4D5" w:themeFill="accent2" w:themeFillTint="33"/>
-          </w:tcPr>
-          <w:p/>
-        </w:tc>
-      </w:tr>
-      <w:tr>
-        <w:tc>
-          <w:tcPr>
-            <w:tcW w:w="1557" w:type="dxa"/>
-            <w:shd w:val="clear" w:color="auto" w:fill="FBE4D5" w:themeFill="accent2" w:themeFillTint="33"/>
-          </w:tcPr>
-          <w:p>
-            <w:r>
-              <w:t xml:space="preserve">  </w:t>
-            </w:r>
-          </w:p>
-        </w:tc>
-      </w:tr>
-    </w:tbl>
-    <w:p/>
-    <w:tbl>
-      <w:tblPr>
-        <w:tblStyle w:val="TableGrid"/>
-        <w:tblpPr w:leftFromText="180" w:rightFromText="180" w:vertAnchor="text" w:horzAnchor="page" w:tblpX="8394" w:tblpY="360"/>
-        <w:tblW w:w="0" w:type="auto"/>
-        <w:shd w:val="clear" w:color="auto" w:fill="D9E2F3" w:themeFill="accent5" w:themeFillTint="33"/>
-        <w:tblLook w:val="04A0" w:firstRow="1" w:lastRow="0" w:firstColumn="1" w:lastColumn="0" w:noHBand="0" w:noVBand="1"/>
-      </w:tblPr>
-      <w:tblGrid>
-        <w:gridCol w:w="1696"/>
-      </w:tblGrid>
-      <w:tr>
-        <w:tc>
-          <w:tcPr>
-            <w:tcW w:w="1696" w:type="dxa"/>
-            <w:shd w:val="clear" w:color="auto" w:fill="D9E2F3" w:themeFill="accent5" w:themeFillTint="33"/>
-          </w:tcPr>
-          <w:p>
-            <w:pPr>
-              <w:rPr>
-                <w:i/>
-                <w:iCs/>
-              </w:rPr>
-            </w:pPr>
-            <w:r>
-              <w:rPr>
-                <w:i/>
-                <w:iCs/>
-              </w:rPr>
-              <w:t>&lt;&lt;Entity&gt;&gt;</w:t>
-            </w:r>
-          </w:p>
-          <w:p>
-            <w:r>
-              <w:t xml:space="preserve">       AA</w:t>
-            </w:r>
-          </w:p>
-        </w:tc>
-      </w:tr>
-      <w:tr>
-        <w:tc>
-          <w:tcPr>
-            <w:tcW w:w="1696" w:type="dxa"/>
-            <w:shd w:val="clear" w:color="auto" w:fill="D9E2F3" w:themeFill="accent5" w:themeFillTint="33"/>
-          </w:tcPr>
-          <w:p>
-            <w:pPr>
-              <w:pStyle w:val="ListParagraph"/>
-              <w:numPr>
-                <w:ilvl w:val="0"/>
-                <w:numId w:val="21"/>
-              </w:numPr>
-            </w:pPr>
-            <w:r>
-              <w:t>a1</w:t>
-            </w:r>
-          </w:p>
-          <w:p>
-            <w:pPr>
-              <w:pStyle w:val="ListParagraph"/>
-              <w:numPr>
-                <w:ilvl w:val="0"/>
-                <w:numId w:val="21"/>
-              </w:numPr>
-            </w:pPr>
-            <w:r>
-              <w:t>a2</w:t>
-            </w:r>
-          </w:p>
-        </w:tc>
-      </w:tr>
-      <w:tr>
-        <w:tc>
-          <w:tcPr>
-            <w:tcW w:w="1696" w:type="dxa"/>
-            <w:shd w:val="clear" w:color="auto" w:fill="D9E2F3" w:themeFill="accent5" w:themeFillTint="33"/>
-          </w:tcPr>
-          <w:p>
-            <w:r>
-              <w:rPr>
-                <w:sz w:val="20"/>
-                <w:szCs w:val="20"/>
-              </w:rPr>
-              <w:t>+toString(): String</w:t>
-            </w:r>
-          </w:p>
-        </w:tc>
-      </w:tr>
-    </w:tbl>
-    <w:p/>
-    <w:tbl>
-      <w:tblPr>
-        <w:tblStyle w:val="TableGrid"/>
-        <w:tblpPr w:leftFromText="180" w:rightFromText="180" w:vertAnchor="text" w:horzAnchor="page" w:tblpX="4687" w:tblpY="18"/>
-        <w:tblW w:w="0" w:type="auto"/>
-        <w:shd w:val="clear" w:color="auto" w:fill="FFF2CC" w:themeFill="accent4" w:themeFillTint="33"/>
-        <w:tblLook w:val="04A0" w:firstRow="1" w:lastRow="0" w:firstColumn="1" w:lastColumn="0" w:noHBand="0" w:noVBand="1"/>
-      </w:tblPr>
-      <w:tblGrid>
-        <w:gridCol w:w="1557"/>
-      </w:tblGrid>
-      <w:tr>
-        <w:tc>
-          <w:tcPr>
-            <w:tcW w:w="1557" w:type="dxa"/>
-            <w:shd w:val="clear" w:color="auto" w:fill="FFF2CC" w:themeFill="accent4" w:themeFillTint="33"/>
-          </w:tcPr>
-          <w:p>
-            <w:pPr>
-              <w:rPr>
-                <w:i/>
-                <w:iCs/>
-              </w:rPr>
-            </w:pPr>
-            <w:r>
-              <w:rPr>
-                <w:i/>
-                <w:iCs/>
-              </w:rPr>
-              <w:t>&lt;&lt;Control&gt;&gt;</w:t>
-            </w:r>
-          </w:p>
-          <w:p>
-            <w:r>
-              <w:rPr>
-                <w:noProof/>
-              </w:rPr>
-              <mc:AlternateContent>
-                <mc:Choice Requires="wps">
-                  <w:drawing>
-                    <wp:anchor distT="0" distB="0" distL="114300" distR="114300" simplePos="0" relativeHeight="251664384" behindDoc="0" locked="0" layoutInCell="1" allowOverlap="1" wp14:anchorId="4978D279" wp14:editId="3558C748">
-                      <wp:simplePos x="0" y="0"/>
-                      <wp:positionH relativeFrom="column">
-                        <wp:posOffset>917310</wp:posOffset>
-                      </wp:positionH>
-                      <wp:positionV relativeFrom="paragraph">
-                        <wp:posOffset>63481</wp:posOffset>
-                      </wp:positionV>
-                      <wp:extent cx="1351128" cy="0"/>
-                      <wp:effectExtent l="0" t="0" r="8255" b="12700"/>
-                      <wp:wrapNone/>
-                      <wp:docPr id="4" name="Straight Connector 4"/>
-                      <wp:cNvGraphicFramePr/>
-                      <a:graphic xmlns:a="http://schemas.openxmlformats.org/drawingml/2006/main">
-                        <a:graphicData uri="http://schemas.microsoft.com/office/word/2010/wordprocessingShape">
-                          <wps:wsp>
-                            <wps:cNvCnPr/>
-                            <wps:spPr>
-                              <a:xfrm>
-                                <a:off x="0" y="0"/>
-                                <a:ext cx="1351128" cy="0"/>
-                              </a:xfrm>
-                              <a:prstGeom prst="line">
-                                <a:avLst/>
-                              </a:prstGeom>
-                            </wps:spPr>
-                            <wps:style>
-                              <a:lnRef idx="1">
-                                <a:schemeClr val="accent1"/>
-                              </a:lnRef>
-                              <a:fillRef idx="0">
-                                <a:schemeClr val="accent1"/>
-                              </a:fillRef>
-                              <a:effectRef idx="0">
-                                <a:schemeClr val="accent1"/>
-                              </a:effectRef>
-                              <a:fontRef idx="minor">
-                                <a:schemeClr val="tx1"/>
-                              </a:fontRef>
-                            </wps:style>
-                            <wps:bodyPr/>
-                          </wps:wsp>
-                        </a:graphicData>
-                      </a:graphic>
-                    </wp:anchor>
-                  </w:drawing>
-                </mc:Choice>
-                <mc:Fallback>
-                  <w:pict>
-                    <v:line w14:anchorId="675AE3B0" id="Straight Connector 4" o:spid="_x0000_s1026" style="position:absolute;z-index:251664384;visibility:visible;mso-wrap-style:square;mso-wrap-distance-left:9pt;mso-wrap-distance-top:0;mso-wrap-distance-right:9pt;mso-wrap-distance-bottom:0;mso-position-horizontal:absolute;mso-position-horizontal-relative:text;mso-position-vertical:absolute;mso-position-vertical-relative:text" from="72.25pt,5pt" to="178.65pt,5pt" o:gfxdata="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" strokecolor="#5b9bd5 [3204]" strokeweight=".5pt">
-                      <v:stroke joinstyle="miter"/>
-                    </v:line>
-                  </w:pict>
-                </mc:Fallback>
-              </mc:AlternateContent>
-            </w:r>
-            <w:r>
-              <w:t xml:space="preserve">     aaaaaa</w:t>
-            </w:r>
-          </w:p>
-        </w:tc>
-      </w:tr>
-      <w:tr>
-        <w:tc>
-          <w:tcPr>
-            <w:tcW w:w="1557" w:type="dxa"/>
-            <w:shd w:val="clear" w:color="auto" w:fill="FFF2CC" w:themeFill="accent4" w:themeFillTint="33"/>
-          </w:tcPr>
-          <w:p/>
-        </w:tc>
-      </w:tr>
-      <w:tr>
-        <w:tc>
-          <w:tcPr>
-            <w:tcW w:w="1557" w:type="dxa"/>
-            <w:shd w:val="clear" w:color="auto" w:fill="FFF2CC" w:themeFill="accent4" w:themeFillTint="33"/>
-          </w:tcPr>
-          <w:p/>
-        </w:tc>
-      </w:tr>
-    </w:tbl>
-    <w:p/>
-    <w:p/>
-    <w:p>
-      <w:r>
-        <w:rPr>
-          <w:noProof/>
-        </w:rPr>
-        <mc:AlternateContent>
-          <mc:Choice Requires="wps">
-            <w:drawing>
-              <wp:anchor distT="0" distB="0" distL="114300" distR="114300" simplePos="0" relativeHeight="251665408" behindDoc="0" locked="0" layoutInCell="1" allowOverlap="1" wp14:anchorId="5FADFF87" wp14:editId="334D132B">
-                <wp:simplePos x="0" y="0"/>
-                <wp:positionH relativeFrom="column">
-                  <wp:posOffset>5121152</wp:posOffset>
-                </wp:positionH>
-                <wp:positionV relativeFrom="paragraph">
-                  <wp:posOffset>253782</wp:posOffset>
-                </wp:positionV>
-                <wp:extent cx="0" cy="443552"/>
-                <wp:effectExtent l="0" t="0" r="12700" b="13970"/>
-                <wp:wrapNone/>
-                <wp:docPr id="5" name="Straight Connector 5"/>
-                <wp:cNvGraphicFramePr/>
-                <a:graphic xmlns:a="http://schemas.openxmlformats.org/drawingml/2006/main">
-                  <a:graphicData uri="http://schemas.microsoft.com/office/word/2010/wordprocessingShape">
-                    <wps:wsp>
-                      <wps:cNvCnPr/>
-                      <wps:spPr>
-                        <a:xfrm>
-                          <a:off x="0" y="0"/>
-                          <a:ext cx="0" cy="443552"/>
-                        </a:xfrm>
-                        <a:prstGeom prst="line">
-                          <a:avLst/>
-                        </a:prstGeom>
-                      </wps:spPr>
-                      <wps:style>
-                        <a:lnRef idx="1">
-                          <a:schemeClr val="accent1"/>
-                        </a:lnRef>
-                        <a:fillRef idx="0">
-                          <a:schemeClr val="accent1"/>
-                        </a:fillRef>
-                        <a:effectRef idx="0">
-                          <a:schemeClr val="accent1"/>
-                        </a:effectRef>
-                        <a:fontRef idx="minor">
-                          <a:schemeClr val="tx1"/>
-                        </a:fontRef>
-                      </wps:style>
-                      <wps:bodyPr/>
-                    </wps:wsp>
-                  </a:graphicData>
-                </a:graphic>
-              </wp:anchor>
-            </w:drawing>
-          </mc:Choice>
-          <mc:Fallback>
-            <w:pict>
-              <v:line w14:anchorId="1ADCF60B" id="Straight Connector 5" o:spid="_x0000_s1026" style="position:absolute;z-index:251665408;visibility:visible;mso-wrap-style:square;mso-wrap-distance-left:9pt;mso-wrap-distance-top:0;mso-wrap-distance-right:9pt;mso-wrap-distance-bottom:0;mso-position-horizontal:absolute;mso-position-horizontal-relative:text;mso-position-vertical:absolute;mso-position-vertical-relative:text" from="403.25pt,20pt" to="403.25pt,54.95pt" o:gfxdata="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" strokecolor="#5b9bd5 [3204]" strokeweight=".5pt">
-                <v:stroke joinstyle="miter"/>
-              </v:line>
-            </w:pict>
-          </mc:Fallback>
-        </mc:AlternateContent>
-      </w:r>
-      <w:r>
-        <w:rPr>
-          <w:noProof/>
-        </w:rPr>
-        <mc:AlternateContent>
-          <mc:Choice Requires="wps">
-            <w:drawing>
-              <wp:anchor distT="0" distB="0" distL="114300" distR="114300" simplePos="0" relativeHeight="251663360" behindDoc="0" locked="0" layoutInCell="1" allowOverlap="1" wp14:anchorId="2C92C43D" wp14:editId="78206007">
-                <wp:simplePos x="0" y="0"/>
-                <wp:positionH relativeFrom="column">
-                  <wp:posOffset>2739617</wp:posOffset>
-                </wp:positionH>
-                <wp:positionV relativeFrom="paragraph">
-                  <wp:posOffset>158248</wp:posOffset>
-                </wp:positionV>
-                <wp:extent cx="0" cy="457200"/>
-                <wp:effectExtent l="0" t="0" r="12700" b="12700"/>
-                <wp:wrapNone/>
-                <wp:docPr id="3" name="Straight Connector 3"/>
-                <wp:cNvGraphicFramePr/>
-                <a:graphic xmlns:a="http://schemas.openxmlformats.org/drawingml/2006/main">
-                  <a:graphicData uri="http://schemas.microsoft.com/office/word/2010/wordprocessingShape">
-                    <wps:wsp>
-                      <wps:cNvCnPr/>
-                      <wps:spPr>
-                        <a:xfrm>
-                          <a:off x="0" y="0"/>
-                          <a:ext cx="0" cy="457200"/>
-                        </a:xfrm>
-                        <a:prstGeom prst="line">
-                          <a:avLst/>
-                        </a:prstGeom>
-                      </wps:spPr>
-                      <wps:style>
-                        <a:lnRef idx="1">
-                          <a:schemeClr val="accent1"/>
-                        </a:lnRef>
-                        <a:fillRef idx="0">
-                          <a:schemeClr val="accent1"/>
-                        </a:fillRef>
-                        <a:effectRef idx="0">
-                          <a:schemeClr val="accent1"/>
-                        </a:effectRef>
-                        <a:fontRef idx="minor">
-                          <a:schemeClr val="tx1"/>
-                        </a:fontRef>
-                      </wps:style>
-                      <wps:bodyPr/>
-                    </wps:wsp>
-                  </a:graphicData>
-                </a:graphic>
-              </wp:anchor>
-            </w:drawing>
-          </mc:Choice>
-          <mc:Fallback>
-            <w:pict>
-              <v:line w14:anchorId="606A5493" id="Straight Connector 3" o:spid="_x0000_s1026" style="position:absolute;z-index:251663360;visibility:visible;mso-wrap-style:square;mso-wrap-distance-left:9pt;mso-wrap-distance-top:0;mso-wrap-distance-right:9pt;mso-wrap-distance-bottom:0;mso-position-horizontal:absolute;mso-position-horizontal-relative:text;mso-position-vertical:absolute;mso-position-vertical-relative:text" from="215.7pt,12.45pt" to="215.7pt,48.45pt" o:gfxdata="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" strokecolor="#5b9bd5 [3204]" strokeweight=".5pt">
-                <v:stroke joinstyle="miter"/>
-              </v:line>
-            </w:pict>
-          </mc:Fallback>
-        </mc:AlternateContent>
-      </w:r>
-    </w:p>
-    <w:p/>
-    <w:tbl>
-      <w:tblPr>
-        <w:tblStyle w:val="TableGrid"/>
-        <w:tblpPr w:leftFromText="180" w:rightFromText="180" w:vertAnchor="text" w:horzAnchor="page" w:tblpX="8436" w:tblpY="184"/>
-        <w:tblW w:w="0" w:type="auto"/>
-        <w:shd w:val="clear" w:color="auto" w:fill="D9E2F3" w:themeFill="accent5" w:themeFillTint="33"/>
-        <w:tblLook w:val="04A0" w:firstRow="1" w:lastRow="0" w:firstColumn="1" w:lastColumn="0" w:noHBand="0" w:noVBand="1"/>
-      </w:tblPr>
-      <w:tblGrid>
-        <w:gridCol w:w="1696"/>
-      </w:tblGrid>
-      <w:tr>
-        <w:tc>
-          <w:tcPr>
-            <w:tcW w:w="1696" w:type="dxa"/>
-            <w:shd w:val="clear" w:color="auto" w:fill="D9E2F3" w:themeFill="accent5" w:themeFillTint="33"/>
-          </w:tcPr>
-          <w:p>
-            <w:pPr>
-              <w:rPr>
-                <w:i/>
-                <w:iCs/>
-              </w:rPr>
-            </w:pPr>
-            <w:r>
-              <w:rPr>
-                <w:i/>
-                <w:iCs/>
-              </w:rPr>
-              <w:t>&lt;&lt;Entity&gt;&gt;</w:t>
-            </w:r>
-          </w:p>
-          <w:p>
-            <w:r>
-              <w:t xml:space="preserve">     BBBB</w:t>
-            </w:r>
-          </w:p>
-        </w:tc>
-      </w:tr>
-      <w:tr>
-        <w:tc>
-          <w:tcPr>
-            <w:tcW w:w="1696" w:type="dxa"/>
-            <w:shd w:val="clear" w:color="auto" w:fill="D9E2F3" w:themeFill="accent5" w:themeFillTint="33"/>
-          </w:tcPr>
-          <w:p>
-            <w:pPr>
-              <w:pStyle w:val="ListParagraph"/>
-              <w:numPr>
-                <w:ilvl w:val="0"/>
-                <w:numId w:val="21"/>
-              </w:numPr>
-            </w:pPr>
-            <w:r>
-              <w:t xml:space="preserve">bb </w:t>
-            </w:r>
-          </w:p>
-        </w:tc>
-      </w:tr>
-      <w:tr>
-        <w:tc>
-          <w:tcPr>
-            <w:tcW w:w="1696" w:type="dxa"/>
-            <w:shd w:val="clear" w:color="auto" w:fill="D9E2F3" w:themeFill="accent5" w:themeFillTint="33"/>
-          </w:tcPr>
-          <w:p>
-            <w:r>
-              <w:rPr>
-                <w:sz w:val="20"/>
-                <w:szCs w:val="20"/>
-              </w:rPr>
-              <w:t>+toString(): String</w:t>
-            </w:r>
-          </w:p>
-        </w:tc>
-      </w:tr>
-    </w:tbl>
-    <w:tbl>
-      <w:tblPr>
-        <w:tblStyle w:val="TableGrid"/>
-        <w:tblpPr w:leftFromText="180" w:rightFromText="180" w:vertAnchor="text" w:horzAnchor="page" w:tblpX="4687" w:tblpY="18"/>
-        <w:tblW w:w="0" w:type="auto"/>
-        <w:tblLook w:val="04A0" w:firstRow="1" w:lastRow="0" w:firstColumn="1" w:lastColumn="0" w:noHBand="0" w:noVBand="1"/>
-      </w:tblPr>
-      <w:tblGrid>
-        <w:gridCol w:w="1557"/>
-      </w:tblGrid>
-      <w:tr>
-        <w:tc>
-          <w:tcPr>
-            <w:tcW w:w="1557" w:type="dxa"/>
-            <w:shd w:val="clear" w:color="auto" w:fill="FFF2CC" w:themeFill="accent4" w:themeFillTint="33"/>
-          </w:tcPr>
-          <w:p>
-            <w:pPr>
-              <w:rPr>
-                <w:i/>
-                <w:iCs/>
-              </w:rPr>
-            </w:pPr>
-            <w:r>
-              <w:rPr>
-                <w:i/>
-                <w:iCs/>
-              </w:rPr>
-              <w:t>&lt;&lt;Control&gt;&gt;</w:t>
-            </w:r>
-          </w:p>
-          <w:p>
-            <w:r>
-              <w:t xml:space="preserve">     cccccc</w:t>
-            </w:r>
-          </w:p>
-        </w:tc>
-      </w:tr>
-      <w:tr>
-        <w:tc>
-          <w:tcPr>
-            <w:tcW w:w="1557" w:type="dxa"/>
-            <w:shd w:val="clear" w:color="auto" w:fill="FFF2CC" w:themeFill="accent4" w:themeFillTint="33"/>
-          </w:tcPr>
-          <w:p/>
-        </w:tc>
-      </w:tr>
-      <w:tr>
-        <w:tc>
-          <w:tcPr>
-            <w:tcW w:w="1557" w:type="dxa"/>
-            <w:shd w:val="clear" w:color="auto" w:fill="FFF2CC" w:themeFill="accent4" w:themeFillTint="33"/>
-          </w:tcPr>
-          <w:p/>
-        </w:tc>
-      </w:tr>
-    </w:tbl>
-    <w:p/>
-    <w:p/>
-    <w:p/>
-    <w:p/>
-    <w:p/>
-    <w:p/>
     <w:p/>
     <w:p>
       <w:pPr>
@@ -9944,44 +11236,67 @@
       <w:r>
         <w:br w:type="page"/>
       </w:r>
-    </w:p>
-    <w:p>
-      <w:pPr>
-        <w:pStyle w:val="ListParagraph"/>
-        <w:spacing w:after="120" w:line="240" w:lineRule="auto"/>
-        <w:ind w:left="284"/>
-        <w:jc w:val="both"/>
-        <w:rPr>
-          <w:rFonts w:ascii="Times New Roman" w:hAnsi="Times New Roman" w:cs="Times New Roman"/>
-          <w:b/>
-          <w:i/>
-          <w:iCs/>
-          <w:color w:val="FF0000"/>
-          <w:sz w:val="26"/>
-          <w:szCs w:val="26"/>
-        </w:rPr>
-      </w:pPr>
       <w:r>
         <w:rPr>
-          <w:rFonts w:ascii="Times New Roman" w:hAnsi="Times New Roman" w:cs="Times New Roman"/>
-          <w:b/>
-          <w:i/>
-          <w:iCs/>
-          <w:color w:val="FF0000"/>
-          <w:sz w:val="26"/>
-          <w:szCs w:val="26"/>
+          <w:noProof/>
         </w:rPr>
         <w:lastRenderedPageBreak/>
-        <w:t>Link nhật ký</w:t>
+        <w:drawing>
+          <wp:inline distT="0" distB="0" distL="0" distR="0" wp14:anchorId="7ADAA530" wp14:editId="2ED4AF8F">
+            <wp:extent cx="6511925" cy="3917950"/>
+            <wp:effectExtent l="0" t="0" r="3175" b="6350"/>
+            <wp:docPr id="1889076160" name="Hình ảnh 1"/>
+            <wp:cNvGraphicFramePr>
+              <a:graphicFrameLocks xmlns:a="http://schemas.openxmlformats.org/drawingml/2006/main" noChangeAspect="1"/>
+            </wp:cNvGraphicFramePr>
+            <a:graphic xmlns:a="http://schemas.openxmlformats.org/drawingml/2006/main">
+              <a:graphicData uri="http://schemas.openxmlformats.org/drawingml/2006/picture">
+                <pic:pic xmlns:pic="http://schemas.openxmlformats.org/drawingml/2006/picture">
+                  <pic:nvPicPr>
+                    <pic:cNvPr id="1889076160" name=""/>
+                    <pic:cNvPicPr/>
+                  </pic:nvPicPr>
+                  <pic:blipFill>
+                    <a:blip r:embed="rId14"/>
+                    <a:stretch>
+                      <a:fillRect/>
+                    </a:stretch>
+                  </pic:blipFill>
+                  <pic:spPr>
+                    <a:xfrm>
+                      <a:off x="0" y="0"/>
+                      <a:ext cx="6511925" cy="3917950"/>
+                    </a:xfrm>
+                    <a:prstGeom prst="rect">
+                      <a:avLst/>
+                    </a:prstGeom>
+                  </pic:spPr>
+                </pic:pic>
+              </a:graphicData>
+            </a:graphic>
+          </wp:inline>
+        </w:drawing>
       </w:r>
     </w:p>
     <w:p>
       <w:pPr>
         <w:spacing w:after="120" w:line="240" w:lineRule="auto"/>
       </w:pPr>
+      <w:r>
+        <w:rPr>
+          <w:rFonts w:ascii="Times New Roman" w:hAnsi="Times New Roman" w:cs="Times New Roman"/>
+          <w:b/>
+          <w:i/>
+          <w:iCs/>
+          <w:color w:val="FF0000"/>
+          <w:sz w:val="26"/>
+          <w:szCs w:val="26"/>
+        </w:rPr>
+        <w:t>https://github.com/phatnguyen2702/QuanLiCuaHangThuCung</w:t>
+      </w:r>
     </w:p>
     <w:sectPr>
-      <w:footerReference w:type="default" r:id="rId11"/>
+      <w:footerReference w:type="default" r:id="rId15"/>
       <w:pgSz w:w="12240" w:h="15840" w:code="1"/>
       <w:pgMar w:top="851" w:right="851" w:bottom="851" w:left="1134" w:header="567" w:footer="567" w:gutter="0"/>
       <w:pgNumType w:start="0"/>
@@ -10042,7 +11357,7 @@
     <w:sdtContent>
       <w:p>
         <w:pPr>
-          <w:pStyle w:val="Footer"/>
+          <w:pStyle w:val="Chntrang"/>
           <w:tabs>
             <w:tab w:val="clear" w:pos="4680"/>
             <w:tab w:val="clear" w:pos="9360"/>
@@ -10205,7 +11520,7 @@
   </w:sdt>
   <w:p>
     <w:pPr>
-      <w:pStyle w:val="Footer"/>
+      <w:pStyle w:val="Chntrang"/>
     </w:pPr>
   </w:p>
 </w:ftr>
@@ -10245,7 +11560,7 @@
     <w:lvl w:ilvl="0">
       <w:start w:val="1"/>
       <w:numFmt w:val="decimal"/>
-      <w:pStyle w:val="Heading1"/>
+      <w:pStyle w:val="u1"/>
       <w:lvlText w:val="%1."/>
       <w:legacy w:legacy="1" w:legacySpace="144" w:legacyIndent="0"/>
       <w:lvlJc w:val="left"/>
@@ -10253,7 +11568,7 @@
     <w:lvl w:ilvl="1">
       <w:start w:val="1"/>
       <w:numFmt w:val="decimal"/>
-      <w:pStyle w:val="Heading2"/>
+      <w:pStyle w:val="u2"/>
       <w:lvlText w:val="%1.%2"/>
       <w:legacy w:legacy="1" w:legacySpace="144" w:legacyIndent="0"/>
       <w:lvlJc w:val="left"/>
@@ -10261,7 +11576,7 @@
     <w:lvl w:ilvl="2">
       <w:start w:val="1"/>
       <w:numFmt w:val="decimal"/>
-      <w:pStyle w:val="Heading3"/>
+      <w:pStyle w:val="u3"/>
       <w:lvlText w:val="%1.%2.%3"/>
       <w:legacy w:legacy="1" w:legacySpace="144" w:legacyIndent="0"/>
       <w:lvlJc w:val="left"/>
@@ -10269,7 +11584,7 @@
     <w:lvl w:ilvl="3">
       <w:start w:val="1"/>
       <w:numFmt w:val="decimal"/>
-      <w:pStyle w:val="Heading4"/>
+      <w:pStyle w:val="u4"/>
       <w:lvlText w:val="%1.%2.%3.%4"/>
       <w:legacy w:legacy="1" w:legacySpace="144" w:legacyIndent="0"/>
       <w:lvlJc w:val="left"/>
@@ -10277,7 +11592,7 @@
     <w:lvl w:ilvl="4">
       <w:start w:val="1"/>
       <w:numFmt w:val="decimal"/>
-      <w:pStyle w:val="Heading5"/>
+      <w:pStyle w:val="u5"/>
       <w:lvlText w:val="%1.%2.%3.%4.%5"/>
       <w:legacy w:legacy="1" w:legacySpace="144" w:legacyIndent="0"/>
       <w:lvlJc w:val="left"/>
@@ -10285,7 +11600,7 @@
     <w:lvl w:ilvl="5">
       <w:start w:val="1"/>
       <w:numFmt w:val="decimal"/>
-      <w:pStyle w:val="Heading6"/>
+      <w:pStyle w:val="u6"/>
       <w:lvlText w:val="%1.%2.%3.%4.%5.%6"/>
       <w:legacy w:legacy="1" w:legacySpace="144" w:legacyIndent="0"/>
       <w:lvlJc w:val="left"/>
@@ -10293,7 +11608,7 @@
     <w:lvl w:ilvl="6">
       <w:start w:val="1"/>
       <w:numFmt w:val="decimal"/>
-      <w:pStyle w:val="Heading7"/>
+      <w:pStyle w:val="u7"/>
       <w:lvlText w:val="%1.%2.%3.%4.%5.%6.%7"/>
       <w:legacy w:legacy="1" w:legacySpace="144" w:legacyIndent="0"/>
       <w:lvlJc w:val="left"/>
@@ -10301,7 +11616,7 @@
     <w:lvl w:ilvl="7">
       <w:start w:val="1"/>
       <w:numFmt w:val="decimal"/>
-      <w:pStyle w:val="Heading8"/>
+      <w:pStyle w:val="u8"/>
       <w:lvlText w:val="%1.%2.%3.%4.%5.%6.%7.%8"/>
       <w:legacy w:legacy="1" w:legacySpace="144" w:legacyIndent="0"/>
       <w:lvlJc w:val="left"/>
@@ -10309,7 +11624,7 @@
     <w:lvl w:ilvl="8">
       <w:start w:val="1"/>
       <w:numFmt w:val="decimal"/>
-      <w:pStyle w:val="Heading9"/>
+      <w:pStyle w:val="u9"/>
       <w:lvlText w:val="%1.%2.%3.%4.%5.%6.%7.%8.%9"/>
       <w:legacy w:legacy="1" w:legacySpace="144" w:legacyIndent="0"/>
       <w:lvlJc w:val="left"/>
@@ -10429,6 +11744,296 @@
     </w:lvl>
   </w:abstractNum>
   <w:abstractNum w:abstractNumId="2" w15:restartNumberingAfterBreak="0">
+    <w:nsid w:val="0FED18B0"/>
+    <w:multiLevelType w:val="multilevel"/>
+    <w:tmpl w:val="BC60399A"/>
+    <w:lvl w:ilvl="0">
+      <w:start w:val="1"/>
+      <w:numFmt w:val="bullet"/>
+      <w:lvlText w:val=""/>
+      <w:lvlJc w:val="left"/>
+      <w:pPr>
+        <w:tabs>
+          <w:tab w:val="num" w:pos="720"/>
+        </w:tabs>
+        <w:ind w:left="720" w:hanging="360"/>
+      </w:pPr>
+      <w:rPr>
+        <w:rFonts w:ascii="Symbol" w:hAnsi="Symbol" w:hint="default"/>
+        <w:sz w:val="20"/>
+      </w:rPr>
+    </w:lvl>
+    <w:lvl w:ilvl="1">
+      <w:start w:val="1"/>
+      <w:numFmt w:val="decimal"/>
+      <w:lvlText w:val="%2."/>
+      <w:lvlJc w:val="left"/>
+      <w:pPr>
+        <w:tabs>
+          <w:tab w:val="num" w:pos="1440"/>
+        </w:tabs>
+        <w:ind w:left="1440" w:hanging="360"/>
+      </w:pPr>
+    </w:lvl>
+    <w:lvl w:ilvl="2" w:tentative="1">
+      <w:start w:val="1"/>
+      <w:numFmt w:val="bullet"/>
+      <w:lvlText w:val=""/>
+      <w:lvlJc w:val="left"/>
+      <w:pPr>
+        <w:tabs>
+          <w:tab w:val="num" w:pos="2160"/>
+        </w:tabs>
+        <w:ind w:left="2160" w:hanging="360"/>
+      </w:pPr>
+      <w:rPr>
+        <w:rFonts w:ascii="Wingdings" w:hAnsi="Wingdings" w:hint="default"/>
+        <w:sz w:val="20"/>
+      </w:rPr>
+    </w:lvl>
+    <w:lvl w:ilvl="3" w:tentative="1">
+      <w:start w:val="1"/>
+      <w:numFmt w:val="bullet"/>
+      <w:lvlText w:val=""/>
+      <w:lvlJc w:val="left"/>
+      <w:pPr>
+        <w:tabs>
+          <w:tab w:val="num" w:pos="2880"/>
+        </w:tabs>
+        <w:ind w:left="2880" w:hanging="360"/>
+      </w:pPr>
+      <w:rPr>
+        <w:rFonts w:ascii="Wingdings" w:hAnsi="Wingdings" w:hint="default"/>
+        <w:sz w:val="20"/>
+      </w:rPr>
+    </w:lvl>
+    <w:lvl w:ilvl="4" w:tentative="1">
+      <w:start w:val="1"/>
+      <w:numFmt w:val="bullet"/>
+      <w:lvlText w:val=""/>
+      <w:lvlJc w:val="left"/>
+      <w:pPr>
+        <w:tabs>
+          <w:tab w:val="num" w:pos="3600"/>
+        </w:tabs>
+        <w:ind w:left="3600" w:hanging="360"/>
+      </w:pPr>
+      <w:rPr>
+        <w:rFonts w:ascii="Wingdings" w:hAnsi="Wingdings" w:hint="default"/>
+        <w:sz w:val="20"/>
+      </w:rPr>
+    </w:lvl>
+    <w:lvl w:ilvl="5" w:tentative="1">
+      <w:start w:val="1"/>
+      <w:numFmt w:val="bullet"/>
+      <w:lvlText w:val=""/>
+      <w:lvlJc w:val="left"/>
+      <w:pPr>
+        <w:tabs>
+          <w:tab w:val="num" w:pos="4320"/>
+        </w:tabs>
+        <w:ind w:left="4320" w:hanging="360"/>
+      </w:pPr>
+      <w:rPr>
+        <w:rFonts w:ascii="Wingdings" w:hAnsi="Wingdings" w:hint="default"/>
+        <w:sz w:val="20"/>
+      </w:rPr>
+    </w:lvl>
+    <w:lvl w:ilvl="6" w:tentative="1">
+      <w:start w:val="1"/>
+      <w:numFmt w:val="bullet"/>
+      <w:lvlText w:val=""/>
+      <w:lvlJc w:val="left"/>
+      <w:pPr>
+        <w:tabs>
+          <w:tab w:val="num" w:pos="5040"/>
+        </w:tabs>
+        <w:ind w:left="5040" w:hanging="360"/>
+      </w:pPr>
+      <w:rPr>
+        <w:rFonts w:ascii="Wingdings" w:hAnsi="Wingdings" w:hint="default"/>
+        <w:sz w:val="20"/>
+      </w:rPr>
+    </w:lvl>
+    <w:lvl w:ilvl="7" w:tentative="1">
+      <w:start w:val="1"/>
+      <w:numFmt w:val="bullet"/>
+      <w:lvlText w:val=""/>
+      <w:lvlJc w:val="left"/>
+      <w:pPr>
+        <w:tabs>
+          <w:tab w:val="num" w:pos="5760"/>
+        </w:tabs>
+        <w:ind w:left="5760" w:hanging="360"/>
+      </w:pPr>
+      <w:rPr>
+        <w:rFonts w:ascii="Wingdings" w:hAnsi="Wingdings" w:hint="default"/>
+        <w:sz w:val="20"/>
+      </w:rPr>
+    </w:lvl>
+    <w:lvl w:ilvl="8" w:tentative="1">
+      <w:start w:val="1"/>
+      <w:numFmt w:val="bullet"/>
+      <w:lvlText w:val=""/>
+      <w:lvlJc w:val="left"/>
+      <w:pPr>
+        <w:tabs>
+          <w:tab w:val="num" w:pos="6480"/>
+        </w:tabs>
+        <w:ind w:left="6480" w:hanging="360"/>
+      </w:pPr>
+      <w:rPr>
+        <w:rFonts w:ascii="Wingdings" w:hAnsi="Wingdings" w:hint="default"/>
+        <w:sz w:val="20"/>
+      </w:rPr>
+    </w:lvl>
+  </w:abstractNum>
+  <w:abstractNum w:abstractNumId="3" w15:restartNumberingAfterBreak="0">
+    <w:nsid w:val="14FB0C80"/>
+    <w:multiLevelType w:val="multilevel"/>
+    <w:tmpl w:val="7646E5B2"/>
+    <w:lvl w:ilvl="0">
+      <w:start w:val="1"/>
+      <w:numFmt w:val="bullet"/>
+      <w:lvlText w:val=""/>
+      <w:lvlJc w:val="left"/>
+      <w:pPr>
+        <w:tabs>
+          <w:tab w:val="num" w:pos="720"/>
+        </w:tabs>
+        <w:ind w:left="720" w:hanging="360"/>
+      </w:pPr>
+      <w:rPr>
+        <w:rFonts w:ascii="Symbol" w:hAnsi="Symbol" w:hint="default"/>
+        <w:sz w:val="20"/>
+      </w:rPr>
+    </w:lvl>
+    <w:lvl w:ilvl="1">
+      <w:start w:val="1"/>
+      <w:numFmt w:val="decimal"/>
+      <w:lvlText w:val="%2."/>
+      <w:lvlJc w:val="left"/>
+      <w:pPr>
+        <w:tabs>
+          <w:tab w:val="num" w:pos="1440"/>
+        </w:tabs>
+        <w:ind w:left="1440" w:hanging="360"/>
+      </w:pPr>
+    </w:lvl>
+    <w:lvl w:ilvl="2" w:tentative="1">
+      <w:start w:val="1"/>
+      <w:numFmt w:val="bullet"/>
+      <w:lvlText w:val=""/>
+      <w:lvlJc w:val="left"/>
+      <w:pPr>
+        <w:tabs>
+          <w:tab w:val="num" w:pos="2160"/>
+        </w:tabs>
+        <w:ind w:left="2160" w:hanging="360"/>
+      </w:pPr>
+      <w:rPr>
+        <w:rFonts w:ascii="Wingdings" w:hAnsi="Wingdings" w:hint="default"/>
+        <w:sz w:val="20"/>
+      </w:rPr>
+    </w:lvl>
+    <w:lvl w:ilvl="3" w:tentative="1">
+      <w:start w:val="1"/>
+      <w:numFmt w:val="bullet"/>
+      <w:lvlText w:val=""/>
+      <w:lvlJc w:val="left"/>
+      <w:pPr>
+        <w:tabs>
+          <w:tab w:val="num" w:pos="2880"/>
+        </w:tabs>
+        <w:ind w:left="2880" w:hanging="360"/>
+      </w:pPr>
+      <w:rPr>
+        <w:rFonts w:ascii="Wingdings" w:hAnsi="Wingdings" w:hint="default"/>
+        <w:sz w:val="20"/>
+      </w:rPr>
+    </w:lvl>
+    <w:lvl w:ilvl="4" w:tentative="1">
+      <w:start w:val="1"/>
+      <w:numFmt w:val="bullet"/>
+      <w:lvlText w:val=""/>
+      <w:lvlJc w:val="left"/>
+      <w:pPr>
+        <w:tabs>
+          <w:tab w:val="num" w:pos="3600"/>
+        </w:tabs>
+        <w:ind w:left="3600" w:hanging="360"/>
+      </w:pPr>
+      <w:rPr>
+        <w:rFonts w:ascii="Wingdings" w:hAnsi="Wingdings" w:hint="default"/>
+        <w:sz w:val="20"/>
+      </w:rPr>
+    </w:lvl>
+    <w:lvl w:ilvl="5" w:tentative="1">
+      <w:start w:val="1"/>
+      <w:numFmt w:val="bullet"/>
+      <w:lvlText w:val=""/>
+      <w:lvlJc w:val="left"/>
+      <w:pPr>
+        <w:tabs>
+          <w:tab w:val="num" w:pos="4320"/>
+        </w:tabs>
+        <w:ind w:left="4320" w:hanging="360"/>
+      </w:pPr>
+      <w:rPr>
+        <w:rFonts w:ascii="Wingdings" w:hAnsi="Wingdings" w:hint="default"/>
+        <w:sz w:val="20"/>
+      </w:rPr>
+    </w:lvl>
+    <w:lvl w:ilvl="6" w:tentative="1">
+      <w:start w:val="1"/>
+      <w:numFmt w:val="bullet"/>
+      <w:lvlText w:val=""/>
+      <w:lvlJc w:val="left"/>
+      <w:pPr>
+        <w:tabs>
+          <w:tab w:val="num" w:pos="5040"/>
+        </w:tabs>
+        <w:ind w:left="5040" w:hanging="360"/>
+      </w:pPr>
+      <w:rPr>
+        <w:rFonts w:ascii="Wingdings" w:hAnsi="Wingdings" w:hint="default"/>
+        <w:sz w:val="20"/>
+      </w:rPr>
+    </w:lvl>
+    <w:lvl w:ilvl="7" w:tentative="1">
+      <w:start w:val="1"/>
+      <w:numFmt w:val="bullet"/>
+      <w:lvlText w:val=""/>
+      <w:lvlJc w:val="left"/>
+      <w:pPr>
+        <w:tabs>
+          <w:tab w:val="num" w:pos="5760"/>
+        </w:tabs>
+        <w:ind w:left="5760" w:hanging="360"/>
+      </w:pPr>
+      <w:rPr>
+        <w:rFonts w:ascii="Wingdings" w:hAnsi="Wingdings" w:hint="default"/>
+        <w:sz w:val="20"/>
+      </w:rPr>
+    </w:lvl>
+    <w:lvl w:ilvl="8" w:tentative="1">
+      <w:start w:val="1"/>
+      <w:numFmt w:val="bullet"/>
+      <w:lvlText w:val=""/>
+      <w:lvlJc w:val="left"/>
+      <w:pPr>
+        <w:tabs>
+          <w:tab w:val="num" w:pos="6480"/>
+        </w:tabs>
+        <w:ind w:left="6480" w:hanging="360"/>
+      </w:pPr>
+      <w:rPr>
+        <w:rFonts w:ascii="Wingdings" w:hAnsi="Wingdings" w:hint="default"/>
+        <w:sz w:val="20"/>
+      </w:rPr>
+    </w:lvl>
+  </w:abstractNum>
+  <w:abstractNum w:abstractNumId="4" w15:restartNumberingAfterBreak="0">
     <w:nsid w:val="58E76261"/>
     <w:multiLevelType w:val="hybridMultilevel"/>
     <w:tmpl w:val="1A5C9ED0"/>
@@ -10520,7 +12125,152 @@
       </w:pPr>
     </w:lvl>
   </w:abstractNum>
-  <w:abstractNum w:abstractNumId="3" w15:restartNumberingAfterBreak="0">
+  <w:abstractNum w:abstractNumId="5" w15:restartNumberingAfterBreak="0">
+    <w:nsid w:val="6BFD1725"/>
+    <w:multiLevelType w:val="multilevel"/>
+    <w:tmpl w:val="48565B26"/>
+    <w:lvl w:ilvl="0">
+      <w:start w:val="1"/>
+      <w:numFmt w:val="bullet"/>
+      <w:lvlText w:val=""/>
+      <w:lvlJc w:val="left"/>
+      <w:pPr>
+        <w:tabs>
+          <w:tab w:val="num" w:pos="720"/>
+        </w:tabs>
+        <w:ind w:left="720" w:hanging="360"/>
+      </w:pPr>
+      <w:rPr>
+        <w:rFonts w:ascii="Symbol" w:hAnsi="Symbol" w:hint="default"/>
+        <w:sz w:val="20"/>
+      </w:rPr>
+    </w:lvl>
+    <w:lvl w:ilvl="1">
+      <w:start w:val="1"/>
+      <w:numFmt w:val="decimal"/>
+      <w:lvlText w:val="%2."/>
+      <w:lvlJc w:val="left"/>
+      <w:pPr>
+        <w:tabs>
+          <w:tab w:val="num" w:pos="1440"/>
+        </w:tabs>
+        <w:ind w:left="1440" w:hanging="360"/>
+      </w:pPr>
+    </w:lvl>
+    <w:lvl w:ilvl="2" w:tentative="1">
+      <w:start w:val="1"/>
+      <w:numFmt w:val="bullet"/>
+      <w:lvlText w:val=""/>
+      <w:lvlJc w:val="left"/>
+      <w:pPr>
+        <w:tabs>
+          <w:tab w:val="num" w:pos="2160"/>
+        </w:tabs>
+        <w:ind w:left="2160" w:hanging="360"/>
+      </w:pPr>
+      <w:rPr>
+        <w:rFonts w:ascii="Wingdings" w:hAnsi="Wingdings" w:hint="default"/>
+        <w:sz w:val="20"/>
+      </w:rPr>
+    </w:lvl>
+    <w:lvl w:ilvl="3" w:tentative="1">
+      <w:start w:val="1"/>
+      <w:numFmt w:val="bullet"/>
+      <w:lvlText w:val=""/>
+      <w:lvlJc w:val="left"/>
+      <w:pPr>
+        <w:tabs>
+          <w:tab w:val="num" w:pos="2880"/>
+        </w:tabs>
+        <w:ind w:left="2880" w:hanging="360"/>
+      </w:pPr>
+      <w:rPr>
+        <w:rFonts w:ascii="Wingdings" w:hAnsi="Wingdings" w:hint="default"/>
+        <w:sz w:val="20"/>
+      </w:rPr>
+    </w:lvl>
+    <w:lvl w:ilvl="4" w:tentative="1">
+      <w:start w:val="1"/>
+      <w:numFmt w:val="bullet"/>
+      <w:lvlText w:val=""/>
+      <w:lvlJc w:val="left"/>
+      <w:pPr>
+        <w:tabs>
+          <w:tab w:val="num" w:pos="3600"/>
+        </w:tabs>
+        <w:ind w:left="3600" w:hanging="360"/>
+      </w:pPr>
+      <w:rPr>
+        <w:rFonts w:ascii="Wingdings" w:hAnsi="Wingdings" w:hint="default"/>
+        <w:sz w:val="20"/>
+      </w:rPr>
+    </w:lvl>
+    <w:lvl w:ilvl="5" w:tentative="1">
+      <w:start w:val="1"/>
+      <w:numFmt w:val="bullet"/>
+      <w:lvlText w:val=""/>
+      <w:lvlJc w:val="left"/>
+      <w:pPr>
+        <w:tabs>
+          <w:tab w:val="num" w:pos="4320"/>
+        </w:tabs>
+        <w:ind w:left="4320" w:hanging="360"/>
+      </w:pPr>
+      <w:rPr>
+        <w:rFonts w:ascii="Wingdings" w:hAnsi="Wingdings" w:hint="default"/>
+        <w:sz w:val="20"/>
+      </w:rPr>
+    </w:lvl>
+    <w:lvl w:ilvl="6" w:tentative="1">
+      <w:start w:val="1"/>
+      <w:numFmt w:val="bullet"/>
+      <w:lvlText w:val=""/>
+      <w:lvlJc w:val="left"/>
+      <w:pPr>
+        <w:tabs>
+          <w:tab w:val="num" w:pos="5040"/>
+        </w:tabs>
+        <w:ind w:left="5040" w:hanging="360"/>
+      </w:pPr>
+      <w:rPr>
+        <w:rFonts w:ascii="Wingdings" w:hAnsi="Wingdings" w:hint="default"/>
+        <w:sz w:val="20"/>
+      </w:rPr>
+    </w:lvl>
+    <w:lvl w:ilvl="7" w:tentative="1">
+      <w:start w:val="1"/>
+      <w:numFmt w:val="bullet"/>
+      <w:lvlText w:val=""/>
+      <w:lvlJc w:val="left"/>
+      <w:pPr>
+        <w:tabs>
+          <w:tab w:val="num" w:pos="5760"/>
+        </w:tabs>
+        <w:ind w:left="5760" w:hanging="360"/>
+      </w:pPr>
+      <w:rPr>
+        <w:rFonts w:ascii="Wingdings" w:hAnsi="Wingdings" w:hint="default"/>
+        <w:sz w:val="20"/>
+      </w:rPr>
+    </w:lvl>
+    <w:lvl w:ilvl="8" w:tentative="1">
+      <w:start w:val="1"/>
+      <w:numFmt w:val="bullet"/>
+      <w:lvlText w:val=""/>
+      <w:lvlJc w:val="left"/>
+      <w:pPr>
+        <w:tabs>
+          <w:tab w:val="num" w:pos="6480"/>
+        </w:tabs>
+        <w:ind w:left="6480" w:hanging="360"/>
+      </w:pPr>
+      <w:rPr>
+        <w:rFonts w:ascii="Wingdings" w:hAnsi="Wingdings" w:hint="default"/>
+        <w:sz w:val="20"/>
+      </w:rPr>
+    </w:lvl>
+  </w:abstractNum>
+  <w:abstractNum w:abstractNumId="6" w15:restartNumberingAfterBreak="0">
     <w:nsid w:val="757C5D96"/>
     <w:multiLevelType w:val="multilevel"/>
     <w:tmpl w:val="3DF8B776"/>
@@ -10669,7 +12419,7 @@
       </w:rPr>
     </w:lvl>
   </w:abstractNum>
-  <w:abstractNum w:abstractNumId="4" w15:restartNumberingAfterBreak="0">
+  <w:abstractNum w:abstractNumId="7" w15:restartNumberingAfterBreak="0">
     <w:nsid w:val="7E415C1C"/>
     <w:multiLevelType w:val="hybridMultilevel"/>
     <w:tmpl w:val="B2EA5180"/>
@@ -10834,10 +12584,10 @@
     <w:abstractNumId w:val="0"/>
   </w:num>
   <w:num w:numId="18" w16cid:durableId="868446669">
-    <w:abstractNumId w:val="4"/>
+    <w:abstractNumId w:val="7"/>
   </w:num>
   <w:num w:numId="19" w16cid:durableId="858466581">
-    <w:abstractNumId w:val="2"/>
+    <w:abstractNumId w:val="4"/>
   </w:num>
   <w:num w:numId="20" w16cid:durableId="1405563687">
     <w:abstractNumId w:val="0"/>
@@ -10846,7 +12596,16 @@
     <w:abstractNumId w:val="1"/>
   </w:num>
   <w:num w:numId="22" w16cid:durableId="1820069747">
+    <w:abstractNumId w:val="6"/>
+  </w:num>
+  <w:num w:numId="23" w16cid:durableId="805705615">
     <w:abstractNumId w:val="3"/>
+  </w:num>
+  <w:num w:numId="24" w16cid:durableId="186334534">
+    <w:abstractNumId w:val="2"/>
+  </w:num>
+  <w:num w:numId="25" w16cid:durableId="484854011">
+    <w:abstractNumId w:val="5"/>
   </w:num>
 </w:numbering>
 </file>
@@ -11246,15 +13005,15 @@
     <w:lsdException w:name="Unresolved Mention" w:semiHidden="1" w:unhideWhenUsed="1"/>
     <w:lsdException w:name="Smart Link" w:semiHidden="1" w:unhideWhenUsed="1"/>
   </w:latentStyles>
-  <w:style w:type="paragraph" w:default="1" w:styleId="Normal">
+  <w:style w:type="paragraph" w:default="1" w:styleId="Binhthng">
     <w:name w:val="Normal"/>
     <w:qFormat/>
   </w:style>
-  <w:style w:type="paragraph" w:styleId="Heading1">
+  <w:style w:type="paragraph" w:styleId="u1">
     <w:name w:val="heading 1"/>
-    <w:basedOn w:val="Normal"/>
-    <w:next w:val="Normal"/>
-    <w:link w:val="Heading1Char"/>
+    <w:basedOn w:val="Binhthng"/>
+    <w:next w:val="Binhthng"/>
+    <w:link w:val="u1Char"/>
     <w:qFormat/>
     <w:rsid w:val="00162092"/>
     <w:pPr>
@@ -11273,11 +13032,11 @@
       <w:szCs w:val="20"/>
     </w:rPr>
   </w:style>
-  <w:style w:type="paragraph" w:styleId="Heading2">
+  <w:style w:type="paragraph" w:styleId="u2">
     <w:name w:val="heading 2"/>
-    <w:basedOn w:val="Heading1"/>
-    <w:next w:val="Normal"/>
-    <w:link w:val="Heading2Char"/>
+    <w:basedOn w:val="u1"/>
+    <w:next w:val="Binhthng"/>
+    <w:link w:val="u2Char"/>
     <w:qFormat/>
     <w:rsid w:val="00162092"/>
     <w:pPr>
@@ -11291,11 +13050,11 @@
       <w:sz w:val="24"/>
     </w:rPr>
   </w:style>
-  <w:style w:type="paragraph" w:styleId="Heading3">
+  <w:style w:type="paragraph" w:styleId="u3">
     <w:name w:val="heading 3"/>
-    <w:basedOn w:val="Heading1"/>
-    <w:next w:val="Normal"/>
-    <w:link w:val="Heading3Char"/>
+    <w:basedOn w:val="u1"/>
+    <w:next w:val="Binhthng"/>
+    <w:link w:val="u3Char"/>
     <w:qFormat/>
     <w:rsid w:val="00162092"/>
     <w:pPr>
@@ -11309,11 +13068,11 @@
       <w:sz w:val="22"/>
     </w:rPr>
   </w:style>
-  <w:style w:type="paragraph" w:styleId="Heading4">
+  <w:style w:type="paragraph" w:styleId="u4">
     <w:name w:val="heading 4"/>
-    <w:basedOn w:val="Heading1"/>
-    <w:next w:val="Normal"/>
-    <w:link w:val="Heading4Char"/>
+    <w:basedOn w:val="u1"/>
+    <w:next w:val="Binhthng"/>
+    <w:link w:val="u4Char"/>
     <w:qFormat/>
     <w:rsid w:val="00162092"/>
     <w:pPr>
@@ -11328,11 +13087,11 @@
       <w:sz w:val="20"/>
     </w:rPr>
   </w:style>
-  <w:style w:type="paragraph" w:styleId="Heading5">
+  <w:style w:type="paragraph" w:styleId="u5">
     <w:name w:val="heading 5"/>
-    <w:basedOn w:val="Normal"/>
-    <w:next w:val="Normal"/>
-    <w:link w:val="Heading5Char"/>
+    <w:basedOn w:val="Binhthng"/>
+    <w:next w:val="Binhthng"/>
+    <w:link w:val="u5Char"/>
     <w:qFormat/>
     <w:rsid w:val="00162092"/>
     <w:pPr>
@@ -11351,11 +13110,11 @@
       <w:szCs w:val="20"/>
     </w:rPr>
   </w:style>
-  <w:style w:type="paragraph" w:styleId="Heading6">
+  <w:style w:type="paragraph" w:styleId="u6">
     <w:name w:val="heading 6"/>
-    <w:basedOn w:val="Normal"/>
-    <w:next w:val="Normal"/>
-    <w:link w:val="Heading6Char"/>
+    <w:basedOn w:val="Binhthng"/>
+    <w:next w:val="Binhthng"/>
+    <w:link w:val="u6Char"/>
     <w:qFormat/>
     <w:rsid w:val="00162092"/>
     <w:pPr>
@@ -11375,11 +13134,11 @@
       <w:szCs w:val="20"/>
     </w:rPr>
   </w:style>
-  <w:style w:type="paragraph" w:styleId="Heading7">
+  <w:style w:type="paragraph" w:styleId="u7">
     <w:name w:val="heading 7"/>
-    <w:basedOn w:val="Normal"/>
-    <w:next w:val="Normal"/>
-    <w:link w:val="Heading7Char"/>
+    <w:basedOn w:val="Binhthng"/>
+    <w:next w:val="Binhthng"/>
+    <w:link w:val="u7Char"/>
     <w:qFormat/>
     <w:rsid w:val="00162092"/>
     <w:pPr>
@@ -11399,11 +13158,11 @@
       <w:szCs w:val="20"/>
     </w:rPr>
   </w:style>
-  <w:style w:type="paragraph" w:styleId="Heading8">
+  <w:style w:type="paragraph" w:styleId="u8">
     <w:name w:val="heading 8"/>
-    <w:basedOn w:val="Normal"/>
-    <w:next w:val="Normal"/>
-    <w:link w:val="Heading8Char"/>
+    <w:basedOn w:val="Binhthng"/>
+    <w:next w:val="Binhthng"/>
+    <w:link w:val="u8Char"/>
     <w:qFormat/>
     <w:rsid w:val="00162092"/>
     <w:pPr>
@@ -11424,11 +13183,11 @@
       <w:szCs w:val="20"/>
     </w:rPr>
   </w:style>
-  <w:style w:type="paragraph" w:styleId="Heading9">
+  <w:style w:type="paragraph" w:styleId="u9">
     <w:name w:val="heading 9"/>
-    <w:basedOn w:val="Normal"/>
-    <w:next w:val="Normal"/>
-    <w:link w:val="Heading9Char"/>
+    <w:basedOn w:val="Binhthng"/>
+    <w:next w:val="Binhthng"/>
+    <w:link w:val="u9Char"/>
     <w:qFormat/>
     <w:rsid w:val="00162092"/>
     <w:pPr>
@@ -11450,13 +13209,13 @@
       <w:szCs w:val="20"/>
     </w:rPr>
   </w:style>
-  <w:style w:type="character" w:default="1" w:styleId="DefaultParagraphFont">
+  <w:style w:type="character" w:default="1" w:styleId="Phngmcinhcuaoanvn">
     <w:name w:val="Default Paragraph Font"/>
     <w:uiPriority w:val="1"/>
     <w:semiHidden/>
     <w:unhideWhenUsed/>
   </w:style>
-  <w:style w:type="table" w:default="1" w:styleId="TableNormal">
+  <w:style w:type="table" w:default="1" w:styleId="BangThngthng">
     <w:name w:val="Normal Table"/>
     <w:uiPriority w:val="99"/>
     <w:semiHidden/>
@@ -11471,15 +13230,15 @@
       </w:tblCellMar>
     </w:tblPr>
   </w:style>
-  <w:style w:type="numbering" w:default="1" w:styleId="NoList">
+  <w:style w:type="numbering" w:default="1" w:styleId="Khngco">
     <w:name w:val="No List"/>
     <w:uiPriority w:val="99"/>
     <w:semiHidden/>
     <w:unhideWhenUsed/>
   </w:style>
-  <w:style w:type="paragraph" w:styleId="NoSpacing">
+  <w:style w:type="paragraph" w:styleId="KhngDncch">
     <w:name w:val="No Spacing"/>
-    <w:link w:val="NoSpacingChar"/>
+    <w:link w:val="KhngDncchChar"/>
     <w:uiPriority w:val="1"/>
     <w:qFormat/>
     <w:rsid w:val="00A925CA"/>
@@ -11490,20 +13249,20 @@
       <w:rFonts w:eastAsiaTheme="minorEastAsia"/>
     </w:rPr>
   </w:style>
-  <w:style w:type="character" w:customStyle="1" w:styleId="NoSpacingChar">
-    <w:name w:val="No Spacing Char"/>
-    <w:basedOn w:val="DefaultParagraphFont"/>
-    <w:link w:val="NoSpacing"/>
+  <w:style w:type="character" w:customStyle="1" w:styleId="KhngDncchChar">
+    <w:name w:val="Không Dãn cách Char"/>
+    <w:basedOn w:val="Phngmcinhcuaoanvn"/>
+    <w:link w:val="KhngDncch"/>
     <w:uiPriority w:val="1"/>
     <w:rsid w:val="00A925CA"/>
     <w:rPr>
       <w:rFonts w:eastAsiaTheme="minorEastAsia"/>
     </w:rPr>
   </w:style>
-  <w:style w:type="paragraph" w:styleId="Header">
+  <w:style w:type="paragraph" w:styleId="utrang">
     <w:name w:val="header"/>
-    <w:basedOn w:val="Normal"/>
-    <w:link w:val="HeaderChar"/>
+    <w:basedOn w:val="Binhthng"/>
+    <w:link w:val="utrangChar"/>
     <w:uiPriority w:val="99"/>
     <w:unhideWhenUsed/>
     <w:rsid w:val="00094677"/>
@@ -11515,17 +13274,17 @@
       <w:spacing w:after="0" w:line="240" w:lineRule="auto"/>
     </w:pPr>
   </w:style>
-  <w:style w:type="character" w:customStyle="1" w:styleId="HeaderChar">
-    <w:name w:val="Header Char"/>
-    <w:basedOn w:val="DefaultParagraphFont"/>
-    <w:link w:val="Header"/>
+  <w:style w:type="character" w:customStyle="1" w:styleId="utrangChar">
+    <w:name w:val="Đầu trang Char"/>
+    <w:basedOn w:val="Phngmcinhcuaoanvn"/>
+    <w:link w:val="utrang"/>
     <w:uiPriority w:val="99"/>
     <w:rsid w:val="00094677"/>
   </w:style>
-  <w:style w:type="paragraph" w:styleId="Footer">
+  <w:style w:type="paragraph" w:styleId="Chntrang">
     <w:name w:val="footer"/>
-    <w:basedOn w:val="Normal"/>
-    <w:link w:val="FooterChar"/>
+    <w:basedOn w:val="Binhthng"/>
+    <w:link w:val="ChntrangChar"/>
     <w:uiPriority w:val="99"/>
     <w:unhideWhenUsed/>
     <w:rsid w:val="00094677"/>
@@ -11537,17 +13296,17 @@
       <w:spacing w:after="0" w:line="240" w:lineRule="auto"/>
     </w:pPr>
   </w:style>
-  <w:style w:type="character" w:customStyle="1" w:styleId="FooterChar">
-    <w:name w:val="Footer Char"/>
-    <w:basedOn w:val="DefaultParagraphFont"/>
-    <w:link w:val="Footer"/>
+  <w:style w:type="character" w:customStyle="1" w:styleId="ChntrangChar">
+    <w:name w:val="Chân trang Char"/>
+    <w:basedOn w:val="Phngmcinhcuaoanvn"/>
+    <w:link w:val="Chntrang"/>
     <w:uiPriority w:val="99"/>
     <w:rsid w:val="00094677"/>
   </w:style>
-  <w:style w:type="character" w:customStyle="1" w:styleId="Heading1Char">
-    <w:name w:val="Heading 1 Char"/>
-    <w:basedOn w:val="DefaultParagraphFont"/>
-    <w:link w:val="Heading1"/>
+  <w:style w:type="character" w:customStyle="1" w:styleId="u1Char">
+    <w:name w:val="Đầu đề 1 Char"/>
+    <w:basedOn w:val="Phngmcinhcuaoanvn"/>
+    <w:link w:val="u1"/>
     <w:rsid w:val="00162092"/>
     <w:rPr>
       <w:rFonts w:ascii="Arial" w:eastAsia="Times New Roman" w:hAnsi="Arial" w:cs="Times New Roman"/>
@@ -11555,10 +13314,10 @@
       <w:szCs w:val="20"/>
     </w:rPr>
   </w:style>
-  <w:style w:type="character" w:customStyle="1" w:styleId="Heading2Char">
-    <w:name w:val="Heading 2 Char"/>
-    <w:basedOn w:val="DefaultParagraphFont"/>
-    <w:link w:val="Heading2"/>
+  <w:style w:type="character" w:customStyle="1" w:styleId="u2Char">
+    <w:name w:val="Đầu đề 2 Char"/>
+    <w:basedOn w:val="Phngmcinhcuaoanvn"/>
+    <w:link w:val="u2"/>
     <w:rsid w:val="00162092"/>
     <w:rPr>
       <w:rFonts w:ascii="Arial" w:eastAsia="Times New Roman" w:hAnsi="Arial" w:cs="Times New Roman"/>
@@ -11567,10 +13326,10 @@
       <w:szCs w:val="20"/>
     </w:rPr>
   </w:style>
-  <w:style w:type="character" w:customStyle="1" w:styleId="Heading3Char">
-    <w:name w:val="Heading 3 Char"/>
-    <w:basedOn w:val="DefaultParagraphFont"/>
-    <w:link w:val="Heading3"/>
+  <w:style w:type="character" w:customStyle="1" w:styleId="u3Char">
+    <w:name w:val="Đầu đề 3 Char"/>
+    <w:basedOn w:val="Phngmcinhcuaoanvn"/>
+    <w:link w:val="u3"/>
     <w:rsid w:val="00162092"/>
     <w:rPr>
       <w:rFonts w:ascii="Arial" w:eastAsia="Times New Roman" w:hAnsi="Arial" w:cs="Times New Roman"/>
@@ -11578,10 +13337,10 @@
       <w:szCs w:val="20"/>
     </w:rPr>
   </w:style>
-  <w:style w:type="character" w:customStyle="1" w:styleId="Heading4Char">
-    <w:name w:val="Heading 4 Char"/>
-    <w:basedOn w:val="DefaultParagraphFont"/>
-    <w:link w:val="Heading4"/>
+  <w:style w:type="character" w:customStyle="1" w:styleId="u4Char">
+    <w:name w:val="Đầu đề 4 Char"/>
+    <w:basedOn w:val="Phngmcinhcuaoanvn"/>
+    <w:link w:val="u4"/>
     <w:rsid w:val="00162092"/>
     <w:rPr>
       <w:rFonts w:ascii="Arial" w:eastAsia="Times New Roman" w:hAnsi="Arial" w:cs="Times New Roman"/>
@@ -11591,20 +13350,20 @@
       <w:szCs w:val="20"/>
     </w:rPr>
   </w:style>
-  <w:style w:type="character" w:customStyle="1" w:styleId="Heading5Char">
-    <w:name w:val="Heading 5 Char"/>
-    <w:basedOn w:val="DefaultParagraphFont"/>
-    <w:link w:val="Heading5"/>
+  <w:style w:type="character" w:customStyle="1" w:styleId="u5Char">
+    <w:name w:val="Đầu đề 5 Char"/>
+    <w:basedOn w:val="Phngmcinhcuaoanvn"/>
+    <w:link w:val="u5"/>
     <w:rsid w:val="00162092"/>
     <w:rPr>
       <w:rFonts w:ascii="Arial" w:eastAsia="Times New Roman" w:hAnsi="Arial" w:cs="Times New Roman"/>
       <w:szCs w:val="20"/>
     </w:rPr>
   </w:style>
-  <w:style w:type="character" w:customStyle="1" w:styleId="Heading6Char">
-    <w:name w:val="Heading 6 Char"/>
-    <w:basedOn w:val="DefaultParagraphFont"/>
-    <w:link w:val="Heading6"/>
+  <w:style w:type="character" w:customStyle="1" w:styleId="u6Char">
+    <w:name w:val="Đầu đề 6 Char"/>
+    <w:basedOn w:val="Phngmcinhcuaoanvn"/>
+    <w:link w:val="u6"/>
     <w:rsid w:val="00162092"/>
     <w:rPr>
       <w:rFonts w:ascii="Arial" w:eastAsia="Times New Roman" w:hAnsi="Arial" w:cs="Times New Roman"/>
@@ -11612,10 +13371,10 @@
       <w:szCs w:val="20"/>
     </w:rPr>
   </w:style>
-  <w:style w:type="character" w:customStyle="1" w:styleId="Heading7Char">
-    <w:name w:val="Heading 7 Char"/>
-    <w:basedOn w:val="DefaultParagraphFont"/>
-    <w:link w:val="Heading7"/>
+  <w:style w:type="character" w:customStyle="1" w:styleId="u7Char">
+    <w:name w:val="Đầu đề 7 Char"/>
+    <w:basedOn w:val="Phngmcinhcuaoanvn"/>
+    <w:link w:val="u7"/>
     <w:rsid w:val="00162092"/>
     <w:rPr>
       <w:rFonts w:ascii="Arial" w:eastAsia="Times New Roman" w:hAnsi="Arial" w:cs="Times New Roman"/>
@@ -11623,10 +13382,10 @@
       <w:szCs w:val="20"/>
     </w:rPr>
   </w:style>
-  <w:style w:type="character" w:customStyle="1" w:styleId="Heading8Char">
-    <w:name w:val="Heading 8 Char"/>
-    <w:basedOn w:val="DefaultParagraphFont"/>
-    <w:link w:val="Heading8"/>
+  <w:style w:type="character" w:customStyle="1" w:styleId="u8Char">
+    <w:name w:val="Đầu đề 8 Char"/>
+    <w:basedOn w:val="Phngmcinhcuaoanvn"/>
+    <w:link w:val="u8"/>
     <w:rsid w:val="00162092"/>
     <w:rPr>
       <w:rFonts w:ascii="Arial" w:eastAsia="Times New Roman" w:hAnsi="Arial" w:cs="Times New Roman"/>
@@ -11635,10 +13394,10 @@
       <w:szCs w:val="20"/>
     </w:rPr>
   </w:style>
-  <w:style w:type="character" w:customStyle="1" w:styleId="Heading9Char">
-    <w:name w:val="Heading 9 Char"/>
-    <w:basedOn w:val="DefaultParagraphFont"/>
-    <w:link w:val="Heading9"/>
+  <w:style w:type="character" w:customStyle="1" w:styleId="u9Char">
+    <w:name w:val="Đầu đề 9 Char"/>
+    <w:basedOn w:val="Phngmcinhcuaoanvn"/>
+    <w:link w:val="u9"/>
     <w:rsid w:val="00162092"/>
     <w:rPr>
       <w:rFonts w:ascii="Arial" w:eastAsia="Times New Roman" w:hAnsi="Arial" w:cs="Times New Roman"/>
@@ -11650,8 +13409,8 @@
   </w:style>
   <w:style w:type="paragraph" w:customStyle="1" w:styleId="notes">
     <w:name w:val="notes"/>
-    <w:basedOn w:val="Normal"/>
-    <w:next w:val="Normal"/>
+    <w:basedOn w:val="Binhthng"/>
+    <w:next w:val="Binhthng"/>
     <w:autoRedefine/>
     <w:rsid w:val="009A4427"/>
     <w:pPr>
@@ -11673,7 +13432,7 @@
   </w:style>
   <w:style w:type="paragraph" w:customStyle="1" w:styleId="StyleTabletextBoldCentered">
     <w:name w:val="Style Tabletext + Bold Centered"/>
-    <w:basedOn w:val="Normal"/>
+    <w:basedOn w:val="Binhthng"/>
     <w:rsid w:val="00162092"/>
     <w:pPr>
       <w:keepLines/>
@@ -11691,7 +13450,7 @@
   </w:style>
   <w:style w:type="paragraph" w:customStyle="1" w:styleId="TableHeader">
     <w:name w:val="Table Header"/>
-    <w:basedOn w:val="Normal"/>
+    <w:basedOn w:val="Binhthng"/>
     <w:rsid w:val="00674208"/>
     <w:pPr>
       <w:widowControl w:val="0"/>
@@ -11709,7 +13468,7 @@
   </w:style>
   <w:style w:type="paragraph" w:customStyle="1" w:styleId="InfoBlue">
     <w:name w:val="InfoBlue"/>
-    <w:basedOn w:val="Normal"/>
+    <w:basedOn w:val="Binhthng"/>
     <w:link w:val="InfoBlueCharChar"/>
     <w:rsid w:val="00674208"/>
     <w:pPr>
@@ -11725,7 +13484,7 @@
   </w:style>
   <w:style w:type="character" w:customStyle="1" w:styleId="InfoBlueCharChar">
     <w:name w:val="InfoBlue Char Char"/>
-    <w:basedOn w:val="DefaultParagraphFont"/>
+    <w:basedOn w:val="Phngmcinhcuaoanvn"/>
     <w:link w:val="InfoBlue"/>
     <w:rsid w:val="00674208"/>
     <w:rPr>
@@ -11736,9 +13495,9 @@
       <w:szCs w:val="24"/>
     </w:rPr>
   </w:style>
-  <w:style w:type="table" w:styleId="TableGrid">
+  <w:style w:type="table" w:styleId="LiBang">
     <w:name w:val="Table Grid"/>
-    <w:basedOn w:val="TableNormal"/>
+    <w:basedOn w:val="BangThngthng"/>
     <w:uiPriority w:val="39"/>
     <w:rsid w:val="00674208"/>
     <w:pPr>
@@ -11755,10 +13514,10 @@
       </w:tblBorders>
     </w:tblPr>
   </w:style>
-  <w:style w:type="paragraph" w:styleId="TOCHeading">
+  <w:style w:type="paragraph" w:styleId="uMucluc">
     <w:name w:val="TOC Heading"/>
-    <w:basedOn w:val="Heading1"/>
-    <w:next w:val="Normal"/>
+    <w:basedOn w:val="u1"/>
+    <w:next w:val="Binhthng"/>
     <w:uiPriority w:val="39"/>
     <w:unhideWhenUsed/>
     <w:qFormat/>
@@ -11780,10 +13539,10 @@
       <w:szCs w:val="32"/>
     </w:rPr>
   </w:style>
-  <w:style w:type="paragraph" w:styleId="TOC1">
+  <w:style w:type="paragraph" w:styleId="Mucluc1">
     <w:name w:val="toc 1"/>
-    <w:basedOn w:val="Normal"/>
-    <w:next w:val="Normal"/>
+    <w:basedOn w:val="Binhthng"/>
+    <w:next w:val="Binhthng"/>
     <w:autoRedefine/>
     <w:uiPriority w:val="39"/>
     <w:unhideWhenUsed/>
@@ -11792,10 +13551,10 @@
       <w:spacing w:after="100"/>
     </w:pPr>
   </w:style>
-  <w:style w:type="paragraph" w:styleId="TOC2">
+  <w:style w:type="paragraph" w:styleId="Mucluc2">
     <w:name w:val="toc 2"/>
-    <w:basedOn w:val="Normal"/>
-    <w:next w:val="Normal"/>
+    <w:basedOn w:val="Binhthng"/>
+    <w:next w:val="Binhthng"/>
     <w:autoRedefine/>
     <w:uiPriority w:val="39"/>
     <w:unhideWhenUsed/>
@@ -11805,10 +13564,10 @@
       <w:ind w:left="220"/>
     </w:pPr>
   </w:style>
-  <w:style w:type="paragraph" w:styleId="TOC3">
+  <w:style w:type="paragraph" w:styleId="Mucluc3">
     <w:name w:val="toc 3"/>
-    <w:basedOn w:val="Normal"/>
-    <w:next w:val="Normal"/>
+    <w:basedOn w:val="Binhthng"/>
+    <w:next w:val="Binhthng"/>
     <w:autoRedefine/>
     <w:uiPriority w:val="39"/>
     <w:unhideWhenUsed/>
@@ -11818,9 +13577,9 @@
       <w:ind w:left="440"/>
     </w:pPr>
   </w:style>
-  <w:style w:type="character" w:styleId="Hyperlink">
+  <w:style w:type="character" w:styleId="Siuktni">
     <w:name w:val="Hyperlink"/>
-    <w:basedOn w:val="DefaultParagraphFont"/>
+    <w:basedOn w:val="Phngmcinhcuaoanvn"/>
     <w:uiPriority w:val="99"/>
     <w:unhideWhenUsed/>
     <w:rsid w:val="00EA666F"/>
@@ -11829,9 +13588,9 @@
       <w:u w:val="single"/>
     </w:rPr>
   </w:style>
-  <w:style w:type="paragraph" w:styleId="ListParagraph">
+  <w:style w:type="paragraph" w:styleId="oancuaDanhsach">
     <w:name w:val="List Paragraph"/>
-    <w:basedOn w:val="Normal"/>
+    <w:basedOn w:val="Binhthng"/>
     <w:uiPriority w:val="34"/>
     <w:qFormat/>
     <w:rsid w:val="00F9669E"/>
@@ -11839,6 +13598,31 @@
       <w:ind w:left="720"/>
       <w:contextualSpacing/>
     </w:pPr>
+  </w:style>
+  <w:style w:type="paragraph" w:styleId="ThngthngWeb">
+    <w:name w:val="Normal (Web)"/>
+    <w:basedOn w:val="Binhthng"/>
+    <w:uiPriority w:val="99"/>
+    <w:semiHidden/>
+    <w:unhideWhenUsed/>
+    <w:rsid w:val="006D0B24"/>
+    <w:rPr>
+      <w:rFonts w:ascii="Times New Roman" w:hAnsi="Times New Roman" w:cs="Times New Roman"/>
+      <w:sz w:val="24"/>
+      <w:szCs w:val="24"/>
+    </w:rPr>
+  </w:style>
+  <w:style w:type="character" w:styleId="cpChagiiquyt">
+    <w:name w:val="Unresolved Mention"/>
+    <w:basedOn w:val="Phngmcinhcuaoanvn"/>
+    <w:uiPriority w:val="99"/>
+    <w:semiHidden/>
+    <w:unhideWhenUsed/>
+    <w:rsid w:val="006502D4"/>
+    <w:rPr>
+      <w:color w:val="605E5C"/>
+      <w:shd w:val="clear" w:color="auto" w:fill="E1DFDD"/>
+    </w:rPr>
   </w:style>
 </w:styles>
 </file>
@@ -11870,7 +13654,7 @@
             <w:rPr>
               <w:rFonts w:asciiTheme="majorHAnsi" w:eastAsiaTheme="majorEastAsia" w:hAnsiTheme="majorHAnsi" w:cstheme="majorBidi"/>
               <w:caps/>
-              <w:color w:val="156082" w:themeColor="accent1"/>
+              <w:color w:val="4472C4" w:themeColor="accent1"/>
               <w:sz w:val="80"/>
               <w:szCs w:val="80"/>
             </w:rPr>
@@ -11901,7 +13685,7 @@
           </w:pPr>
           <w:r>
             <w:rPr>
-              <w:color w:val="156082" w:themeColor="accent1"/>
+              <w:color w:val="4472C4" w:themeColor="accent1"/>
               <w:sz w:val="28"/>
               <w:szCs w:val="28"/>
             </w:rPr>
@@ -11965,18 +13749,6 @@
     <w:pitch w:val="variable"/>
     <w:sig w:usb0="E4002EFF" w:usb1="C200247B" w:usb2="00000009" w:usb3="00000000" w:csb0="000001FF" w:csb1="00000000"/>
   </w:font>
-  <w:font w:name="Aptos">
-    <w:charset w:val="00"/>
-    <w:family w:val="swiss"/>
-    <w:pitch w:val="variable"/>
-    <w:sig w:usb0="20000287" w:usb1="00000003" w:usb2="00000000" w:usb3="00000000" w:csb0="0000019F" w:csb1="00000000"/>
-  </w:font>
-  <w:font w:name="Aptos Display">
-    <w:charset w:val="00"/>
-    <w:family w:val="swiss"/>
-    <w:pitch w:val="variable"/>
-    <w:sig w:usb0="20000287" w:usb1="00000003" w:usb2="00000000" w:usb3="00000000" w:csb0="0000019F" w:csb1="00000000"/>
-  </w:font>
 </w:fonts>
 </file>
 
@@ -11997,16 +13769,22 @@
   </w:compat>
   <w:rsids>
     <w:rsidRoot w:val="00F152FF"/>
+    <w:rsid w:val="000F39DA"/>
     <w:rsid w:val="00187EB6"/>
+    <w:rsid w:val="001E2D3D"/>
     <w:rsid w:val="00220CD5"/>
     <w:rsid w:val="002551A2"/>
+    <w:rsid w:val="00297877"/>
     <w:rsid w:val="002A48CE"/>
     <w:rsid w:val="00314A2A"/>
+    <w:rsid w:val="003B3C8F"/>
     <w:rsid w:val="00416DE4"/>
     <w:rsid w:val="00513297"/>
     <w:rsid w:val="005F04E9"/>
+    <w:rsid w:val="00777EA3"/>
     <w:rsid w:val="007D4F22"/>
     <w:rsid w:val="008179DC"/>
+    <w:rsid w:val="0099002F"/>
     <w:rsid w:val="00994E73"/>
     <w:rsid w:val="009F6473"/>
     <w:rsid w:val="00AD256A"/>
@@ -12014,6 +13792,8 @@
     <w:rsid w:val="00B73467"/>
     <w:rsid w:val="00BE4664"/>
     <w:rsid w:val="00DD5612"/>
+    <w:rsid w:val="00E1349B"/>
+    <w:rsid w:val="00E65813"/>
     <w:rsid w:val="00EA5BB7"/>
     <w:rsid w:val="00F06863"/>
     <w:rsid w:val="00F152FF"/>
@@ -12435,17 +14215,17 @@
     <w:lsdException w:name="Unresolved Mention" w:semiHidden="1" w:unhideWhenUsed="1"/>
     <w:lsdException w:name="Smart Link" w:semiHidden="1" w:unhideWhenUsed="1"/>
   </w:latentStyles>
-  <w:style w:type="paragraph" w:default="1" w:styleId="Normal">
+  <w:style w:type="paragraph" w:default="1" w:styleId="Binhthng">
     <w:name w:val="Normal"/>
     <w:qFormat/>
   </w:style>
-  <w:style w:type="character" w:default="1" w:styleId="DefaultParagraphFont">
+  <w:style w:type="character" w:default="1" w:styleId="Phngmcinhcuaoanvn">
     <w:name w:val="Default Paragraph Font"/>
     <w:uiPriority w:val="1"/>
     <w:semiHidden/>
     <w:unhideWhenUsed/>
   </w:style>
-  <w:style w:type="table" w:default="1" w:styleId="TableNormal">
+  <w:style w:type="table" w:default="1" w:styleId="BangThngthng">
     <w:name w:val="Normal Table"/>
     <w:uiPriority w:val="99"/>
     <w:semiHidden/>
@@ -12460,7 +14240,7 @@
       </w:tblCellMar>
     </w:tblPr>
   </w:style>
-  <w:style w:type="numbering" w:default="1" w:styleId="NoList">
+  <w:style w:type="numbering" w:default="1" w:styleId="Khngco">
     <w:name w:val="No List"/>
     <w:uiPriority w:val="99"/>
     <w:semiHidden/>

</xml_diff>